<commit_message>
docs: expand company workstation workflow and add mobile screenshots
</commit_message>
<xml_diff>
--- a/docs/diplom/Yolchiyev_Rustam_Diplom_Loyihasi.docx
+++ b/docs/diplom/Yolchiyev_Rustam_Diplom_Loyihasi.docx
@@ -2382,7 +2382,7 @@
           <w:b w:val="0"/>
           <w:sz w:val="28"/>
         </w:rPr>
-        <w:t>Ushbu diplom loyihasida operatsion tizimlardan foydalanishni nazoratlash hamda ko‘p faktorli autentifikatsiya usullari tahlil qilinadi. Django asosidagi server, React asosidagi boshqaruv interfeysi va Windows agentidan tashkil topgan tizimning arxitekturasi hamda ishlash jarayonlari yoritiladi. Yuzni tekshirish, telefon orqali WebAuthn asosida tasdiqlash, qurilmalarni ro‘yxatdan o‘tkazish, foydalanish huquqlarini boshqarish va hodisalarni qayd etish mexanizmlari ko‘rib chiqiladi. Shuningdek, dasturiy sinovlar natijalari, tizimning amaldagi cheklovlari va undan foydalanish yo‘riqnomasi keltiriladi.</w:t>
+        <w:t>Ushbu diplom loyihasida kompaniyalarning turli bo‘lim va tarmoqlaridagi ishchi kompyuterlardan foydalanishni markazlashgan tarzda nazoratlash hamda ko‘p faktorli autentifikatsiya usullari tahlil qilinadi. Django serveri, React boshqaruv interfeysi va Windows agentidan tashkil topgan tizim arxitekturasi yoritiladi. PC’ni dastlabki ro‘yxatdan o‘tkazish, administrator tasdig‘i, kriptografik aktivatsiya, yuzni tekshirish, telefon orqali WebAuthn asosida tasdiqlash hamda hodisalarni kuzatish jarayonlari ko‘rib chiqiladi. Dasturiy sinovlar natijalari va kompaniyada foydalanish yo‘riqnomasi keltiriladi.</w:t>
       </w:r>
     </w:p>
     <w:p>
@@ -2411,7 +2411,7 @@
           <w:b w:val="0"/>
           <w:sz w:val="28"/>
         </w:rPr>
-        <w:t>В данном дипломном проекте рассматриваются методы контроля доступа к операционным системам и многофакторной аутентификации. Описываются архитектура и процессы работы системы, состоящей из сервера на Django, интерфейса управления на React и агента для Windows. Рассматриваются механизмы проверки лица, подтверждения через телефон с использованием WebAuthn, регистрации устройств, управления правами доступа и журналирования событий. Также приводятся результаты программных испытаний, ограничения текущей реализации и инструкция по использованию системы.</w:t>
+        <w:t>В данном дипломном проекте рассматриваются централизованный контроль доступа к рабочим компьютерам компании в разных подразделениях и сетях, а также методы многофакторной аутентификации. Описывается архитектура системы, включающей сервер Django, интерфейс управления React и агент Windows. Рассматриваются регистрация компьютера, подтверждение администратором, криптографическая активация, проверка лица, подтверждение через телефон с использованием WebAuthn и мониторинг событий. Приводятся результаты программных испытаний и инструкция по использованию системы в компании.</w:t>
       </w:r>
     </w:p>
     <w:p>
@@ -2440,7 +2440,7 @@
           <w:b w:val="0"/>
           <w:sz w:val="28"/>
         </w:rPr>
-        <w:t>This graduation project examines operating system access control and multi-factor authentication methods. It describes the architecture and workflows of a system comprising a Django backend, a React management interface, and a Windows agent. The project covers face verification, phone-based approval using WebAuthn, device registration, access rights management, and event logging. It also presents software test results, the limitations of the current implementation, and instructions for using the system.</w:t>
+        <w:t>This graduation project examines centralized access control for company workstations across departments and networks, together with multi-factor authentication methods. It describes a system comprising a Django server, a React management interface, and a Windows agent. The project covers workstation registration, administrator approval, cryptographic activation, face verification, phone-based approval using WebAuthn, and event monitoring. It presents software test results and instructions for company use.</w:t>
       </w:r>
     </w:p>
     <w:p>
@@ -2999,7 +2999,7 @@
                 <w:b w:val="0"/>
                 <w:sz w:val="24"/>
               </w:rPr>
-              <w:t>33</w:t>
+              <w:t>46</w:t>
             </w:r>
           </w:p>
         </w:tc>
@@ -3047,7 +3047,7 @@
                 <w:b w:val="0"/>
                 <w:sz w:val="24"/>
               </w:rPr>
-              <w:t>33</w:t>
+              <w:t>46</w:t>
             </w:r>
           </w:p>
         </w:tc>
@@ -3095,7 +3095,7 @@
                 <w:b w:val="0"/>
                 <w:sz w:val="24"/>
               </w:rPr>
-              <w:t>35</w:t>
+              <w:t>48</w:t>
             </w:r>
           </w:p>
         </w:tc>
@@ -3143,7 +3143,7 @@
                 <w:b w:val="0"/>
                 <w:sz w:val="24"/>
               </w:rPr>
-              <w:t>37</w:t>
+              <w:t>50</w:t>
             </w:r>
           </w:p>
         </w:tc>
@@ -3191,7 +3191,7 @@
                 <w:b w:val="0"/>
                 <w:sz w:val="24"/>
               </w:rPr>
-              <w:t>39</w:t>
+              <w:t>52</w:t>
             </w:r>
           </w:p>
         </w:tc>
@@ -3239,7 +3239,7 @@
                 <w:b w:val="0"/>
                 <w:sz w:val="24"/>
               </w:rPr>
-              <w:t>40</w:t>
+              <w:t>53</w:t>
             </w:r>
           </w:p>
         </w:tc>
@@ -3287,7 +3287,7 @@
                 <w:b w:val="0"/>
                 <w:sz w:val="24"/>
               </w:rPr>
-              <w:t>40</w:t>
+              <w:t>53</w:t>
             </w:r>
           </w:p>
         </w:tc>
@@ -3335,7 +3335,7 @@
                 <w:b w:val="0"/>
                 <w:sz w:val="24"/>
               </w:rPr>
-              <w:t>40</w:t>
+              <w:t>53</w:t>
             </w:r>
           </w:p>
         </w:tc>
@@ -3383,7 +3383,7 @@
                 <w:b w:val="0"/>
                 <w:sz w:val="24"/>
               </w:rPr>
-              <w:t>40</w:t>
+              <w:t>53</w:t>
             </w:r>
           </w:p>
         </w:tc>
@@ -3431,7 +3431,7 @@
                 <w:b w:val="0"/>
                 <w:sz w:val="24"/>
               </w:rPr>
-              <w:t>41</w:t>
+              <w:t>54</w:t>
             </w:r>
           </w:p>
         </w:tc>
@@ -3548,6 +3548,21 @@
           <w:sz w:val="28"/>
         </w:rPr>
         <w:t>Mazkur diplom loyihasida ushbu masalalar markaziy boshqaruv serveri va ishchi kompyuterda ishlaydigan agentdan tashkil topgan dasturiy tizim doirasida ko‘rib chiqiladi. Server foydalanuvchilar, tashkilotlar, rollar va qurilmalar haqidagi ma’lumotlarni boshqaradi, autentifikatsiya sessiyalari bilan ishlaydi hamda hodisalarni qayd etadi. Boshqaruv veb-interfeysi administratorga tizim obyektlari va foydalanish holatlarini kuzatish imkonini beradi. Windows agenti esa ishchi kompyuterdagi tekshiruv jarayonini foydalanuvchiga taqdim etib, server bilan ma’lumot almashadi.</w:t>
+      </w:r>
+    </w:p>
+    <w:p>
+      <w:pPr>
+        <w:spacing w:line="360" w:lineRule="auto" w:after="0" w:before="0"/>
+        <w:ind w:firstLine="709" w:right="0" w:left="0"/>
+        <w:jc w:val="both"/>
+      </w:pPr>
+      <w:r>
+        <w:rPr>
+          <w:rFonts w:ascii="Times New Roman" w:hAnsi="Times New Roman" w:eastAsia="Times New Roman"/>
+          <w:b w:val="0"/>
+          <w:sz w:val="28"/>
+        </w:rPr>
+        <w:t>Ishning asosiy amaliy ssenariysi kompaniyaga tegishli ko‘plab PC’larni boshqarishdir. Har bir kompyuter o‘z ro‘yxat sessiyasi va kriptografik identifikatsiyasiga ega bo‘ladi; administrator esa tashkilot chegarasida tasdiqlash, holatni kuzatish va qurilmani bekor qilish amallarini bajaradi. Shaxsiy hisob imkoniyati qo‘shimcha oqim sifatida qaraladi. Turli lokal tarmoqlardagi ishlash uchun serverga yetib borish yo‘li korporativ infratuzilma tomonidan ta’minlanishi lozim.</w:t>
       </w:r>
     </w:p>
     <w:p>
@@ -3585,7 +3600,7 @@
           <w:b w:val="0"/>
           <w:sz w:val="28"/>
         </w:rPr>
-        <w:t xml:space="preserve"> — operatsion tizimlardan foydalanishni markazlashgan tarzda nazorat qilish uchun foydalanuvchi va qurilma autentifikatsiyasini birlashtiruvchi, biometrik tekshiruv hamda telefon orqali tasdiqlash imkoniyatlariga ega dasturiy tizimni ishlab chiqish va uning ishlashini dasturiy sinovlar asosida baholash.</w:t>
+        <w:t xml:space="preserve"> — kompaniyalarning turli bo‘lim va tarmoqlaridagi ishchi kompyuterlardan foydalanishni yagona markazdan nazoratlash uchun foydalanuvchi hamda qurilma autentifikatsiyasini, biometrik tekshiruv va telefon orqali tasdiqlashni birlashtiruvchi dasturiy tizimni ishlab chiqish va uning jarayonlarini dasturiy sinovlar asosida baholash.</w:t>
       </w:r>
     </w:p>
     <w:p>
@@ -3735,7 +3750,7 @@
           <w:b w:val="0"/>
           <w:sz w:val="28"/>
         </w:rPr>
-        <w:t xml:space="preserve"> — tashkilotdagi ishchi kompyuterlarda foydalanuvchini autentifikatsiyalash va operatsion tizimdan foydalanishni nazoratlash jarayonlari.</w:t>
+        <w:t xml:space="preserve"> — kompaniyaning turli bo‘lim va tarmoqlaridagi ishchi kompyuterlarni ro‘yxatdan o‘tkazish, foydalanuvchini autentifikatsiyalash va operatsion tizimdan foydalanishni markazlashgan tarzda nazoratlash jarayonlari.</w:t>
       </w:r>
     </w:p>
     <w:p>
@@ -5449,7 +5464,7 @@
           <w:b w:val="0"/>
           <w:sz w:val="28"/>
         </w:rPr>
-        <w:t>Taklif qilinayotgan tizimning vazifasi tayyor operatsion tizim himoyasini mutlaq almashtirish emas, balki mazkur diplom doirasida markazlashgan boshqaruv va agent–server autentifikatsiya jarayonini ishlab chiqishdir. Loyihada tashkilotlarni ajratish, qurilmalarni dastlabki hisobga olish, kriptografik aktivatsiya, yuzni tekshirish, telefon orqali tasdiqlash va audit bir tizimda bog‘lanadi. Ushbu bog‘lanish har bir qatlamning vakolatini aniq belgilashni talab qiladi.</w:t>
+        <w:t>Taklif qilinayotgan tizim kompaniyaning turli bo‘limlari va tarmoqlaridagi PC’larni yagona boshqaruv muhitiga birlashtirishga qaratilgan. Bu vazifa markaziy tashkilot, xodim, rol va qurilma hisobini, shuningdek agent–server autentifikatsiya jarayonini ishlab chiqishni talab qiladi. Loyihada tashkilotlarni ajratish, qurilmalarni dastlabki hisobga olish, kriptografik aktivatsiya, yuzni tekshirish, telefon orqali tasdiqlash va audit bir tizimda bog‘lanadi. Ushbu bog‘lanish har bir qatlamning vakolatini aniq belgilashni talab qiladi.</w:t>
       </w:r>
     </w:p>
     <w:p>
@@ -6074,7 +6089,7 @@
           <w:b w:val="0"/>
           <w:sz w:val="28"/>
         </w:rPr>
-        <w:t>Ishlab chiqilgan tizim mijoz–server arxitekturasi asosida tashkil etilgan. auth repozitoriysi markaziy server, boshqaruv veb-interfeysi va ro‘yxatdan o‘tkazish yordamchisini saqlaydi. agent repozitoriysida esa ishchi kompyuter dasturi, umumiy autentifikatsiya modullari va operatsion tizim adapterlari joylashgan. Komponentlarning bunday ajratilishi server va ishchi kompyuterga xos kodni alohida rivojlantirishga imkon beradi. Biroq tarmoq protokoli o‘zgarganda ikki tomonning mosligi birgalikda tekshirilishi kerak [12, 13].</w:t>
+        <w:t>Ishlab chiqilgan tizimning asosiy vazifasi kompaniyaga tegishli ko‘plab ishchi kompyuterlarni markazlashgan tarzda boshqarishdir. Arxitektura mijoz–server modeliga asoslangan; har bir PC alohida agent va qurilma identifikatsiyasi bilan markaziy serverga ulanadi. auth repozitoriysi markaziy server, boshqaruv veb-interfeysi va ro‘yxatdan o‘tkazish yordamchisini saqlaydi. agent repozitoriysida esa ishchi kompyuter dasturi, umumiy autentifikatsiya modullari va operatsion tizim adapterlari joylashgan. Komponentlarning bunday ajratilishi server va ishchi kompyuterga xos kodni alohida rivojlantirishga imkon beradi. Biroq tarmoq protokoli o‘zgarganda ikki tomonning mosligi birgalikda tekshirilishi kerak [12, 13].</w:t>
       </w:r>
     </w:p>
     <w:p>
@@ -10131,6 +10146,960 @@
     </w:p>
     <w:p>
       <w:pPr>
+        <w:pStyle w:val="Heading3"/>
+        <w:ind w:right="0" w:left="0"/>
+        <w:jc w:val="both"/>
+      </w:pPr>
+      <w:r>
+        <w:rPr>
+          <w:rFonts w:ascii="Times New Roman" w:hAnsi="Times New Roman" w:eastAsia="Times New Roman"/>
+          <w:b/>
+          <w:sz w:val="28"/>
+        </w:rPr>
+        <w:t>Kompaniyaning ko‘p kompyuterli muhitida ishlash modeli</w:t>
+      </w:r>
+    </w:p>
+    <w:p>
+      <w:pPr>
+        <w:spacing w:line="360" w:lineRule="auto" w:after="0" w:before="0"/>
+        <w:ind w:firstLine="709" w:right="0" w:left="0"/>
+        <w:jc w:val="both"/>
+      </w:pPr>
+      <w:r>
+        <w:rPr>
+          <w:rFonts w:ascii="Times New Roman" w:hAnsi="Times New Roman" w:eastAsia="Times New Roman"/>
+          <w:b w:val="0"/>
+          <w:sz w:val="28"/>
+        </w:rPr>
+        <w:t>Tizimning asosiy qo‘llanish sohasi bir kompaniyaga tegishli ko‘plab ishchi kompyuterlarni yagona markazdan hisobga olish va ulardagi autentifikatsiya jarayonlarini boshqarishdir. Bitta PC uchun dastur o‘rnatish bu vazifaning faqat boshlang‘ich qismidir. Kompaniya miqyosida qaysi qurilma qaysi tashkilotga tegishli ekani, uni kim ro‘yxatga olgani, qaysi foydalanuvchi sessiyasi tekshirilgani va oxirgi aloqa qachon bo‘lgani aniqlanishi kerak. Shaxsiy hisob oqimi mavjud bo‘lsa-da, mazkur ishning asosiy amaliy ssenariysi kompaniya kompyuterlari parkidir.</w:t>
+      </w:r>
+    </w:p>
+    <w:p>
+      <w:pPr>
+        <w:spacing w:line="360" w:lineRule="auto" w:after="0" w:before="0"/>
+        <w:ind w:firstLine="709" w:right="0" w:left="0"/>
+        <w:jc w:val="both"/>
+      </w:pPr>
+      <w:r>
+        <w:rPr>
+          <w:rFonts w:ascii="Times New Roman" w:hAnsi="Times New Roman" w:eastAsia="Times New Roman"/>
+          <w:b w:val="0"/>
+          <w:sz w:val="28"/>
+        </w:rPr>
+        <w:t>Kompaniyaning ishchi kompyuterlari turli bo‘lim, filial yoki lokal tarmoqlarda joylashishi mumkin. Bunda agent va markaziy server o‘rtasidagi aloqa uchun kompyuterlarning bitta lokal broadcast domenida bo‘lishi shart emas. Har bir agent sozlangan server manziliga murojaat qiladi. Lekin bu imkoniyat serverga yo‘l mavjudligini avtomatik ta’minlamaydi: DNS, HTTPS chiqish ruxsati, reverse proxy, sertifikat zanjiri va vaqt sinxronligi korporativ infratuzilmada alohida tayyorlanadi. Quyidagi sxema loyihaviy joylashuvni ko‘rsatadi; bir nechta haqiqiy filial tarmog‘idagi yuklama tajribasi bajarilgan deb talqin qilinmaydi.</w:t>
+      </w:r>
+    </w:p>
+    <w:p>
+      <w:pPr>
+        <w:keepNext/>
+        <w:ind w:firstLine="0" w:right="0" w:left="0"/>
+        <w:jc w:val="center"/>
+      </w:pPr>
+      <w:r>
+        <w:drawing>
+          <wp:inline xmlns:a="http://schemas.openxmlformats.org/drawingml/2006/main" xmlns:pic="http://schemas.openxmlformats.org/drawingml/2006/picture">
+            <wp:extent cx="5400000" cy="2469561"/>
+            <wp:docPr id="7" name="Picture 7"/>
+            <wp:cNvGraphicFramePr>
+              <a:graphicFrameLocks noChangeAspect="1"/>
+            </wp:cNvGraphicFramePr>
+            <a:graphic>
+              <a:graphicData uri="http://schemas.openxmlformats.org/drawingml/2006/picture">
+                <pic:pic>
+                  <pic:nvPicPr>
+                    <pic:cNvPr id="0" name="company_network.png"/>
+                    <pic:cNvPicPr/>
+                  </pic:nvPicPr>
+                  <pic:blipFill>
+                    <a:blip r:embed="rId16"/>
+                    <a:stretch>
+                      <a:fillRect/>
+                    </a:stretch>
+                  </pic:blipFill>
+                  <pic:spPr>
+                    <a:xfrm>
+                      <a:off x="0" y="0"/>
+                      <a:ext cx="5400000" cy="2469561"/>
+                    </a:xfrm>
+                    <a:prstGeom prst="rect"/>
+                  </pic:spPr>
+                </pic:pic>
+              </a:graphicData>
+            </a:graphic>
+          </wp:inline>
+        </w:drawing>
+      </w:r>
+    </w:p>
+    <w:p>
+      <w:pPr>
+        <w:spacing w:line="252" w:lineRule="auto" w:after="200" w:before="0"/>
+        <w:ind w:firstLine="0" w:right="0" w:left="0"/>
+        <w:jc w:val="center"/>
+      </w:pPr>
+      <w:r>
+        <w:rPr>
+          <w:rFonts w:ascii="Times New Roman" w:hAnsi="Times New Roman" w:eastAsia="Times New Roman"/>
+          <w:b w:val="0"/>
+          <w:sz w:val="24"/>
+        </w:rPr>
+        <w:t>2.7-rasm. Turli tarmoqlardagi kompaniya PC’larining markaziy serverga ulanish modeli</w:t>
+      </w:r>
+    </w:p>
+    <w:p>
+      <w:pPr>
+        <w:spacing w:line="360" w:lineRule="auto" w:after="0" w:before="0"/>
+        <w:ind w:firstLine="709" w:right="0" w:left="0"/>
+        <w:jc w:val="both"/>
+      </w:pPr>
+      <w:r>
+        <w:rPr>
+          <w:rFonts w:ascii="Times New Roman" w:hAnsi="Times New Roman" w:eastAsia="Times New Roman"/>
+          <w:b w:val="0"/>
+          <w:sz w:val="28"/>
+        </w:rPr>
+        <w:t>Serverning tashkilot bo‘yicha ajratishi tarmoqni VLAN yoki firewall bilan segmentlashning o‘rnini bosmaydi. Bir tarmoqdagi begona qurilma boshqa tashkilot nomidan autentifikatsiyalana olmasligi uchun har bir server so‘rovida tashkilot va qurilma holati tekshiriladi. Aksincha, bir kompaniyaning boshqa filialidagi vakolatli agent faqat uning IP-manzili boshqacha bo‘lgani uchun yangi shaxs deb olinmaydi: identifikatsiyada ro‘yxatdagi kriptografik kalit va server yozuvi ustuvor bo‘ladi. IP-manzil audit konteksti bo‘lib xizmat qiladi.</w:t>
+      </w:r>
+    </w:p>
+    <w:p>
+      <w:pPr>
+        <w:spacing w:line="360" w:lineRule="auto" w:after="0" w:before="0"/>
+        <w:ind w:firstLine="709" w:right="0" w:left="0"/>
+        <w:jc w:val="both"/>
+      </w:pPr>
+      <w:r>
+        <w:rPr>
+          <w:rFonts w:ascii="Times New Roman" w:hAnsi="Times New Roman" w:eastAsia="Times New Roman"/>
+          <w:b w:val="0"/>
+          <w:sz w:val="28"/>
+        </w:rPr>
+        <w:t>Joriy modelda alohida Filial yoki TarmoqSegmenti obyekti mavjud emas. Qurilma joylashuvi Device.location maydoni orqali tavsiflanadi. Shuning uchun hujjatda to‘liq filiallar iyerarxiyasi yoki avtomatik tarmoq topologiyasi boshqaruvi amalga oshirilgan deb ko‘rsatilmaydi. Bunday imkoniyat kerak bo‘lsa, filial modeli, unga tayinlangan administratorlar va obyektlararo ruxsatlar alohida ishlab chiqiladi. Hozirgi versiyada tashkilot chegarasi va qurilma joylashuvi asosiy hisobga olish vositalaridir.</w:t>
+      </w:r>
+    </w:p>
+    <w:p>
+      <w:pPr>
+        <w:spacing w:line="360" w:lineRule="auto" w:after="0" w:before="0"/>
+        <w:ind w:firstLine="709" w:right="0" w:left="0"/>
+        <w:jc w:val="both"/>
+      </w:pPr>
+      <w:r>
+        <w:rPr>
+          <w:rFonts w:ascii="Times New Roman" w:hAnsi="Times New Roman" w:eastAsia="Times New Roman"/>
+          <w:b w:val="0"/>
+          <w:sz w:val="28"/>
+        </w:rPr>
+        <w:t>Xodim va PC o‘rtasidagi bog‘lanish ham aniq talqin qilinadi. Users tashkilotga hamda rolga, Device esa tashkilotga bog‘langan; AgentSession esa muayyan tekshiruvda foydalanuvchi va qurilmani birlashtiradi. Device modelida har bir PC uchun doimiy yagona xodim egasi maydoni yo‘q. Shu sababli tizim bir xodim bir PC bilan abadiy bog‘langan degan taxminga tayangan holda tavsiflanmaydi. Umumiy foydalaniladigan kompyuterlarda aynan joriy sessiyadagi foydalanuvchi muhimdir.</w:t>
+      </w:r>
+    </w:p>
+    <w:p>
+      <w:pPr>
+        <w:pStyle w:val="Heading3"/>
+        <w:ind w:right="0" w:left="0"/>
+        <w:jc w:val="both"/>
+      </w:pPr>
+      <w:r>
+        <w:rPr>
+          <w:rFonts w:ascii="Times New Roman" w:hAnsi="Times New Roman" w:eastAsia="Times New Roman"/>
+          <w:b/>
+          <w:sz w:val="28"/>
+        </w:rPr>
+        <w:t>Kompaniya PC’sini dastlabki ro‘yxatdan o‘tkazish</w:t>
+      </w:r>
+    </w:p>
+    <w:p>
+      <w:pPr>
+        <w:spacing w:line="360" w:lineRule="auto" w:after="0" w:before="0"/>
+        <w:ind w:firstLine="709" w:right="0" w:left="0"/>
+        <w:jc w:val="both"/>
+      </w:pPr>
+      <w:r>
+        <w:rPr>
+          <w:rFonts w:ascii="Times New Roman" w:hAnsi="Times New Roman" w:eastAsia="Times New Roman"/>
+          <w:b w:val="0"/>
+          <w:sz w:val="28"/>
+        </w:rPr>
+        <w:t>Quyidagi ekranlar ishlayotgan mahalliy serverdan olingan. Ko‘rsatish uchun vaqtinchalik Namuna kompaniya (diplom), NAMUNA-OFFICE-PC01 va DEMO-PC-001 yozuvlari ishlatilgan. Apparat identifikatorlari namuna sifatida kiritilgan; ushbu suratlar Go yordamchisi haqiqiy Windows qurilmasida ishga tushirilganining dalili emas. Administrator tasdig‘i esa haqiqiy server endpointlari orqali bajarilgan. Tasvirga olish tugagach, namunaviy yozuvlar va sessiyalar o‘chirilib, rasmdagi QR hamda tasdiqlash kodi amaldan chiqarilgan.</w:t>
+      </w:r>
+    </w:p>
+    <w:p>
+      <w:pPr>
+        <w:spacing w:line="360" w:lineRule="auto" w:after="0" w:before="0"/>
+        <w:ind w:firstLine="709" w:right="0" w:left="0"/>
+        <w:jc w:val="both"/>
+      </w:pPr>
+      <w:r>
+        <w:rPr>
+          <w:rFonts w:ascii="Times New Roman" w:hAnsi="Times New Roman" w:eastAsia="Times New Roman"/>
+          <w:b w:val="0"/>
+          <w:sz w:val="28"/>
+        </w:rPr>
+        <w:t>Birinchi bosqichda xodim ulanadigan PC brauzerida /device/scan sahifasini ochadi. Sahifa bu amal qaysi kompyuterda bajarilishi kerakligini tushuntiradi. Yangi ulanishni boshlash tugmasi serverda qisqa muddatli sessiya yaratadi. Kompaniyada bir nechta PC bir vaqtning o‘zida tayyorlanayotgan bo‘lsa, har bir kompyuter o‘z sessiyasini boshlaydi; bir PC uchun yaratilgan paket yoki havola boshqasiga ko‘chirib ishlatilmaydi.</w:t>
+      </w:r>
+    </w:p>
+    <w:p>
+      <w:pPr>
+        <w:keepNext/>
+        <w:ind w:firstLine="0" w:right="0" w:left="0"/>
+        <w:jc w:val="center"/>
+      </w:pPr>
+      <w:r>
+        <w:drawing>
+          <wp:inline xmlns:a="http://schemas.openxmlformats.org/drawingml/2006/main" xmlns:pic="http://schemas.openxmlformats.org/drawingml/2006/picture">
+            <wp:extent cx="5400000" cy="2824615"/>
+            <wp:docPr id="8" name="Picture 8"/>
+            <wp:cNvGraphicFramePr>
+              <a:graphicFrameLocks noChangeAspect="1"/>
+            </wp:cNvGraphicFramePr>
+            <a:graphic>
+              <a:graphicData uri="http://schemas.openxmlformats.org/drawingml/2006/picture">
+                <pic:pic>
+                  <pic:nvPicPr>
+                    <pic:cNvPr id="0" name="company_pc_start.png"/>
+                    <pic:cNvPicPr/>
+                  </pic:nvPicPr>
+                  <pic:blipFill>
+                    <a:blip r:embed="rId17"/>
+                    <a:stretch>
+                      <a:fillRect/>
+                    </a:stretch>
+                  </pic:blipFill>
+                  <pic:spPr>
+                    <a:xfrm>
+                      <a:off x="0" y="0"/>
+                      <a:ext cx="5400000" cy="2824615"/>
+                    </a:xfrm>
+                    <a:prstGeom prst="rect"/>
+                  </pic:spPr>
+                </pic:pic>
+              </a:graphicData>
+            </a:graphic>
+          </wp:inline>
+        </w:drawing>
+      </w:r>
+    </w:p>
+    <w:p>
+      <w:pPr>
+        <w:spacing w:line="252" w:lineRule="auto" w:after="200" w:before="0"/>
+        <w:ind w:firstLine="0" w:right="0" w:left="0"/>
+        <w:jc w:val="center"/>
+      </w:pPr>
+      <w:r>
+        <w:rPr>
+          <w:rFonts w:ascii="Times New Roman" w:hAnsi="Times New Roman" w:eastAsia="Times New Roman"/>
+          <w:b w:val="0"/>
+          <w:sz w:val="24"/>
+        </w:rPr>
+        <w:t>2.8-rasm. Kompaniya PC’sida yangi ulanishni boshlash sahifasi</w:t>
+      </w:r>
+    </w:p>
+    <w:p>
+      <w:pPr>
+        <w:spacing w:line="360" w:lineRule="auto" w:after="0" w:before="0"/>
+        <w:ind w:firstLine="709" w:right="0" w:left="0"/>
+        <w:jc w:val="both"/>
+      </w:pPr>
+      <w:r>
+        <w:rPr>
+          <w:rFonts w:ascii="Times New Roman" w:hAnsi="Times New Roman" w:eastAsia="Times New Roman"/>
+          <w:b w:val="0"/>
+          <w:sz w:val="28"/>
+        </w:rPr>
+        <w:t>Ikkinchi bosqichda operatsion tizim va arxitektura tanlanadi. Masalan, Windows hamda Intel / AMD (x64) tanlovlari shu platforma uchun yordamchi paketni olishga xizmat qiladi. Ushbu paket asosiy agent o‘rnatuvchisi emas. Yordamchining vazifasi joriy PC identifikatorlarini ro‘yxat sessiyasiga yuborishdir. Asosiy agent esa keyinchalik kalit va sertifikat bilan doimiy ishlaydigan komponent sifatida alohida o‘rnatiladi.</w:t>
+      </w:r>
+    </w:p>
+    <w:p>
+      <w:pPr>
+        <w:keepNext/>
+        <w:ind w:firstLine="0" w:right="0" w:left="0"/>
+        <w:jc w:val="center"/>
+      </w:pPr>
+      <w:r>
+        <w:drawing>
+          <wp:inline xmlns:a="http://schemas.openxmlformats.org/drawingml/2006/main" xmlns:pic="http://schemas.openxmlformats.org/drawingml/2006/picture">
+            <wp:extent cx="5400000" cy="4037538"/>
+            <wp:docPr id="9" name="Picture 9"/>
+            <wp:cNvGraphicFramePr>
+              <a:graphicFrameLocks noChangeAspect="1"/>
+            </wp:cNvGraphicFramePr>
+            <a:graphic>
+              <a:graphicData uri="http://schemas.openxmlformats.org/drawingml/2006/picture">
+                <pic:pic>
+                  <pic:nvPicPr>
+                    <pic:cNvPr id="0" name="company_pc_helper.png"/>
+                    <pic:cNvPicPr/>
+                  </pic:nvPicPr>
+                  <pic:blipFill>
+                    <a:blip r:embed="rId18"/>
+                    <a:stretch>
+                      <a:fillRect/>
+                    </a:stretch>
+                  </pic:blipFill>
+                  <pic:spPr>
+                    <a:xfrm>
+                      <a:off x="0" y="0"/>
+                      <a:ext cx="5400000" cy="4037538"/>
+                    </a:xfrm>
+                    <a:prstGeom prst="rect"/>
+                  </pic:spPr>
+                </pic:pic>
+              </a:graphicData>
+            </a:graphic>
+          </wp:inline>
+        </w:drawing>
+      </w:r>
+    </w:p>
+    <w:p>
+      <w:pPr>
+        <w:spacing w:line="252" w:lineRule="auto" w:after="200" w:before="0"/>
+        <w:ind w:firstLine="0" w:right="0" w:left="0"/>
+        <w:jc w:val="center"/>
+      </w:pPr>
+      <w:r>
+        <w:rPr>
+          <w:rFonts w:ascii="Times New Roman" w:hAnsi="Times New Roman" w:eastAsia="Times New Roman"/>
+          <w:b w:val="0"/>
+          <w:sz w:val="24"/>
+        </w:rPr>
+        <w:t>2.9-rasm. PC uchun platforma va yordamchi paketni tanlash</w:t>
+      </w:r>
+    </w:p>
+    <w:p>
+      <w:pPr>
+        <w:spacing w:line="360" w:lineRule="auto" w:after="0" w:before="0"/>
+        <w:ind w:firstLine="709" w:right="0" w:left="0"/>
+        <w:jc w:val="both"/>
+      </w:pPr>
+      <w:r>
+        <w:rPr>
+          <w:rFonts w:ascii="Times New Roman" w:hAnsi="Times New Roman" w:eastAsia="Times New Roman"/>
+          <w:b w:val="0"/>
+          <w:sz w:val="28"/>
+        </w:rPr>
+        <w:t>Uchinchi bosqichda yordamchi yuborgan identifikatorlar sessiyaga bir martalik scan token orqali qabul qilinadi. Server asosiy identifikator va device_id qiymatining mosligini tekshiradi. Shundan keyin PC ekranida QR-kod hamda solishtirish kodi ko‘rinadi. Qurilma hali faol agent sifatida ishlamaydi. Bu holat faqat administrator tekshirishi uchun ma’lumotlar tayyor bo‘lganini anglatadi.</w:t>
+      </w:r>
+    </w:p>
+    <w:p>
+      <w:pPr>
+        <w:keepNext/>
+        <w:ind w:firstLine="0" w:right="0" w:left="0"/>
+        <w:jc w:val="center"/>
+      </w:pPr>
+      <w:r>
+        <w:drawing>
+          <wp:inline xmlns:a="http://schemas.openxmlformats.org/drawingml/2006/main" xmlns:pic="http://schemas.openxmlformats.org/drawingml/2006/picture">
+            <wp:extent cx="3460750" cy="4679999"/>
+            <wp:docPr id="10" name="Picture 10"/>
+            <wp:cNvGraphicFramePr>
+              <a:graphicFrameLocks noChangeAspect="1"/>
+            </wp:cNvGraphicFramePr>
+            <a:graphic>
+              <a:graphicData uri="http://schemas.openxmlformats.org/drawingml/2006/picture">
+                <pic:pic>
+                  <pic:nvPicPr>
+                    <pic:cNvPr id="0" name="company_pc_qr.png"/>
+                    <pic:cNvPicPr/>
+                  </pic:nvPicPr>
+                  <pic:blipFill>
+                    <a:blip r:embed="rId19"/>
+                    <a:stretch>
+                      <a:fillRect/>
+                    </a:stretch>
+                  </pic:blipFill>
+                  <pic:spPr>
+                    <a:xfrm>
+                      <a:off x="0" y="0"/>
+                      <a:ext cx="3460750" cy="4679999"/>
+                    </a:xfrm>
+                    <a:prstGeom prst="rect"/>
+                  </pic:spPr>
+                </pic:pic>
+              </a:graphicData>
+            </a:graphic>
+          </wp:inline>
+        </w:drawing>
+      </w:r>
+    </w:p>
+    <w:p>
+      <w:pPr>
+        <w:spacing w:line="252" w:lineRule="auto" w:after="200" w:before="0"/>
+        <w:ind w:firstLine="0" w:right="0" w:left="0"/>
+        <w:jc w:val="center"/>
+      </w:pPr>
+      <w:r>
+        <w:rPr>
+          <w:rFonts w:ascii="Times New Roman" w:hAnsi="Times New Roman" w:eastAsia="Times New Roman"/>
+          <w:b w:val="0"/>
+          <w:sz w:val="24"/>
+        </w:rPr>
+        <w:t>2.10-rasm. PC ma’lumotlari qabul qilingandan keyingi QR va solishtirish kodi</w:t>
+      </w:r>
+    </w:p>
+    <w:p>
+      <w:pPr>
+        <w:spacing w:line="360" w:lineRule="auto" w:after="0" w:before="0"/>
+        <w:ind w:firstLine="709" w:right="0" w:left="0"/>
+        <w:jc w:val="both"/>
+      </w:pPr>
+      <w:r>
+        <w:rPr>
+          <w:rFonts w:ascii="Times New Roman" w:hAnsi="Times New Roman" w:eastAsia="Times New Roman"/>
+          <w:b w:val="0"/>
+          <w:sz w:val="28"/>
+        </w:rPr>
+        <w:t>To‘rtinchi bosqichda tegishli kompaniya administratori o‘z boshqaruv sessiyasi bilan QR havolani ochadi. Tasdiqlash sahifasida tashkilot nomi, hostname, platforma, identifikatorlar va solishtirish kodi ko‘rsatiladi. Administrator PC ekranidagi kod bilan o‘z ekranidagi kod bir xil ekanini tekshiradi. Tashkilot noto‘g‘ri tanlangan bo‘lsa, kompyuterni tasdiqlash davom ettirilmaydi. Bir nechta tarmoq yoki xonadagi o‘xshash nomli PC’lar bilan ishlaganda aynan shu solishtirish noto‘g‘ri qurilmani biriktirish xavfini kamaytiradi.</w:t>
+      </w:r>
+    </w:p>
+    <w:p>
+      <w:pPr>
+        <w:keepNext/>
+        <w:ind w:firstLine="0" w:right="0" w:left="0"/>
+        <w:jc w:val="center"/>
+      </w:pPr>
+      <w:r>
+        <w:drawing>
+          <wp:inline xmlns:a="http://schemas.openxmlformats.org/drawingml/2006/main" xmlns:pic="http://schemas.openxmlformats.org/drawingml/2006/picture">
+            <wp:extent cx="2827962" cy="6120000"/>
+            <wp:docPr id="11" name="Picture 11"/>
+            <wp:cNvGraphicFramePr>
+              <a:graphicFrameLocks noChangeAspect="1"/>
+            </wp:cNvGraphicFramePr>
+            <a:graphic>
+              <a:graphicData uri="http://schemas.openxmlformats.org/drawingml/2006/picture">
+                <pic:pic>
+                  <pic:nvPicPr>
+                    <pic:cNvPr id="0" name="company_mobile_approval.png"/>
+                    <pic:cNvPicPr/>
+                  </pic:nvPicPr>
+                  <pic:blipFill>
+                    <a:blip r:embed="rId20"/>
+                    <a:stretch>
+                      <a:fillRect/>
+                    </a:stretch>
+                  </pic:blipFill>
+                  <pic:spPr>
+                    <a:xfrm>
+                      <a:off x="0" y="0"/>
+                      <a:ext cx="2827962" cy="6120000"/>
+                    </a:xfrm>
+                    <a:prstGeom prst="rect"/>
+                  </pic:spPr>
+                </pic:pic>
+              </a:graphicData>
+            </a:graphic>
+          </wp:inline>
+        </w:drawing>
+      </w:r>
+    </w:p>
+    <w:p>
+      <w:pPr>
+        <w:spacing w:line="252" w:lineRule="auto" w:after="200" w:before="0"/>
+        <w:ind w:firstLine="0" w:right="0" w:left="0"/>
+        <w:jc w:val="center"/>
+      </w:pPr>
+      <w:r>
+        <w:rPr>
+          <w:rFonts w:ascii="Times New Roman" w:hAnsi="Times New Roman" w:eastAsia="Times New Roman"/>
+          <w:b w:val="0"/>
+          <w:sz w:val="24"/>
+        </w:rPr>
+        <w:t>2.11-rasm. Mobil ekran o‘lchamida kompaniya administratorining PC’ni tasdiqlashi</w:t>
+      </w:r>
+    </w:p>
+    <w:p>
+      <w:pPr>
+        <w:spacing w:line="360" w:lineRule="auto" w:after="0" w:before="0"/>
+        <w:ind w:firstLine="709" w:right="0" w:left="0"/>
+        <w:jc w:val="both"/>
+      </w:pPr>
+      <w:r>
+        <w:rPr>
+          <w:rFonts w:ascii="Times New Roman" w:hAnsi="Times New Roman" w:eastAsia="Times New Roman"/>
+          <w:b w:val="0"/>
+          <w:sz w:val="28"/>
+        </w:rPr>
+        <w:t>Beshinchi bosqichda administrator joylashuvni kiritadi va tasdiqlaydi yoki rad etadi. Namuna ssenariyda Namuna kompaniya, 1-filial tavsifi kiritilgan. Joylashuv amaldagi bazada tavsif maydoni hisoblanadi; u o‘z-o‘zicha alohida filial vakolatini yaratmaydi. Server vakolatli tasdiqdan so‘ng qurilmani shu tashkilotga biriktiradi. Bir xil sessiyani yana tasdiqlash yoki boshqa tashkilotdan qayta egallash ruxsat etilmaydi.</w:t>
+      </w:r>
+    </w:p>
+    <w:p>
+      <w:pPr>
+        <w:keepNext/>
+        <w:ind w:firstLine="0" w:right="0" w:left="0"/>
+        <w:jc w:val="center"/>
+      </w:pPr>
+      <w:r>
+        <w:drawing>
+          <wp:inline xmlns:a="http://schemas.openxmlformats.org/drawingml/2006/main" xmlns:pic="http://schemas.openxmlformats.org/drawingml/2006/picture">
+            <wp:extent cx="2827962" cy="6120000"/>
+            <wp:docPr id="12" name="Picture 12"/>
+            <wp:cNvGraphicFramePr>
+              <a:graphicFrameLocks noChangeAspect="1"/>
+            </wp:cNvGraphicFramePr>
+            <a:graphic>
+              <a:graphicData uri="http://schemas.openxmlformats.org/drawingml/2006/picture">
+                <pic:pic>
+                  <pic:nvPicPr>
+                    <pic:cNvPr id="0" name="company_mobile_approved.png"/>
+                    <pic:cNvPicPr/>
+                  </pic:nvPicPr>
+                  <pic:blipFill>
+                    <a:blip r:embed="rId21"/>
+                    <a:stretch>
+                      <a:fillRect/>
+                    </a:stretch>
+                  </pic:blipFill>
+                  <pic:spPr>
+                    <a:xfrm>
+                      <a:off x="0" y="0"/>
+                      <a:ext cx="2827962" cy="6120000"/>
+                    </a:xfrm>
+                    <a:prstGeom prst="rect"/>
+                  </pic:spPr>
+                </pic:pic>
+              </a:graphicData>
+            </a:graphic>
+          </wp:inline>
+        </w:drawing>
+      </w:r>
+    </w:p>
+    <w:p>
+      <w:pPr>
+        <w:spacing w:line="252" w:lineRule="auto" w:after="200" w:before="0"/>
+        <w:ind w:firstLine="0" w:right="0" w:left="0"/>
+        <w:jc w:val="center"/>
+      </w:pPr>
+      <w:r>
+        <w:rPr>
+          <w:rFonts w:ascii="Times New Roman" w:hAnsi="Times New Roman" w:eastAsia="Times New Roman"/>
+          <w:b w:val="0"/>
+          <w:sz w:val="24"/>
+        </w:rPr>
+        <w:t>2.12-rasm. Administrator tasdig‘idan keyin agent ulanishi kutilayotgan holat</w:t>
+      </w:r>
+    </w:p>
+    <w:p>
+      <w:pPr>
+        <w:spacing w:line="360" w:lineRule="auto" w:after="0" w:before="0"/>
+        <w:ind w:firstLine="709" w:right="0" w:left="0"/>
+        <w:jc w:val="both"/>
+      </w:pPr>
+      <w:r>
+        <w:rPr>
+          <w:rFonts w:ascii="Times New Roman" w:hAnsi="Times New Roman" w:eastAsia="Times New Roman"/>
+          <w:b w:val="0"/>
+          <w:sz w:val="28"/>
+        </w:rPr>
+        <w:t>Oltinchi bosqichda PC brauzerida ham tasdiq natijasi ko‘rinadi. Qurilma browser_approved bo‘lsa-da, ro‘yxatdagi kriptografik kalit bilan aktivatsiya yakunlanmaguncha faol agentga tenglashtirilmaydi. Bu ajratish kompaniyada yangi kompyuterni inventar sifatida qabul qilish va undan server nomidan so‘rov yuborishga ruxsat berish orasidagi chegarani saqlaydi. Tasdiqlangan kompyuterning o‘zi boshqa PC uchun berilgan tokenni ishlatmasligi kerak.</w:t>
+      </w:r>
+    </w:p>
+    <w:p>
+      <w:pPr>
+        <w:keepNext/>
+        <w:ind w:firstLine="0" w:right="0" w:left="0"/>
+        <w:jc w:val="center"/>
+      </w:pPr>
+      <w:r>
+        <w:drawing>
+          <wp:inline xmlns:a="http://schemas.openxmlformats.org/drawingml/2006/main" xmlns:pic="http://schemas.openxmlformats.org/drawingml/2006/picture">
+            <wp:extent cx="5400000" cy="2824615"/>
+            <wp:docPr id="13" name="Picture 13"/>
+            <wp:cNvGraphicFramePr>
+              <a:graphicFrameLocks noChangeAspect="1"/>
+            </wp:cNvGraphicFramePr>
+            <a:graphic>
+              <a:graphicData uri="http://schemas.openxmlformats.org/drawingml/2006/picture">
+                <pic:pic>
+                  <pic:nvPicPr>
+                    <pic:cNvPr id="0" name="company_pc_approved.png"/>
+                    <pic:cNvPicPr/>
+                  </pic:nvPicPr>
+                  <pic:blipFill>
+                    <a:blip r:embed="rId22"/>
+                    <a:stretch>
+                      <a:fillRect/>
+                    </a:stretch>
+                  </pic:blipFill>
+                  <pic:spPr>
+                    <a:xfrm>
+                      <a:off x="0" y="0"/>
+                      <a:ext cx="5400000" cy="2824615"/>
+                    </a:xfrm>
+                    <a:prstGeom prst="rect"/>
+                  </pic:spPr>
+                </pic:pic>
+              </a:graphicData>
+            </a:graphic>
+          </wp:inline>
+        </w:drawing>
+      </w:r>
+    </w:p>
+    <w:p>
+      <w:pPr>
+        <w:spacing w:line="252" w:lineRule="auto" w:after="200" w:before="0"/>
+        <w:ind w:firstLine="0" w:right="0" w:left="0"/>
+        <w:jc w:val="center"/>
+      </w:pPr>
+      <w:r>
+        <w:rPr>
+          <w:rFonts w:ascii="Times New Roman" w:hAnsi="Times New Roman" w:eastAsia="Times New Roman"/>
+          <w:b w:val="0"/>
+          <w:sz w:val="24"/>
+        </w:rPr>
+        <w:t>2.13-rasm. PC tomonida administrator tasdig‘i va agent ulanishini davom ettirish xabari</w:t>
+      </w:r>
+    </w:p>
+    <w:p>
+      <w:pPr>
+        <w:pStyle w:val="Heading3"/>
+        <w:ind w:right="0" w:left="0"/>
+        <w:jc w:val="both"/>
+      </w:pPr>
+      <w:r>
+        <w:rPr>
+          <w:rFonts w:ascii="Times New Roman" w:hAnsi="Times New Roman" w:eastAsia="Times New Roman"/>
+          <w:b/>
+          <w:sz w:val="28"/>
+        </w:rPr>
+        <w:t>Windows agentini kompaniya PC’siga o‘rnatish</w:t>
+      </w:r>
+    </w:p>
+    <w:p>
+      <w:pPr>
+        <w:spacing w:line="360" w:lineRule="auto" w:after="0" w:before="0"/>
+        <w:ind w:firstLine="709" w:right="0" w:left="0"/>
+        <w:jc w:val="both"/>
+      </w:pPr>
+      <w:r>
+        <w:rPr>
+          <w:rFonts w:ascii="Times New Roman" w:hAnsi="Times New Roman" w:eastAsia="Times New Roman"/>
+          <w:b w:val="0"/>
+          <w:sz w:val="28"/>
+        </w:rPr>
+        <w:t>Ro‘yxatdan o‘tkazishdan keyin administrator yoki vakolatli texnik xodim mos Windows paketini oladi. Kompaniya siyosati yuklangan o‘rnatuvchining manbasi va yaxlitligini tekshirishni nazarda tutishi kerak. Tizim katalogi paketning haqiqiy mavjudligini va SHA-256 qiymatini ko‘rsatadi. Faqat fayl nomining to‘g‘ri ko‘rinishi uning joriy koddan yig‘ilganini isbotlamaydi; paket versiyasi hamda manba kodining holati solishtiriladi.</w:t>
+      </w:r>
+    </w:p>
+    <w:p>
+      <w:pPr>
+        <w:spacing w:line="360" w:lineRule="auto" w:after="0" w:before="0"/>
+        <w:ind w:firstLine="709" w:right="0" w:left="0"/>
+        <w:jc w:val="both"/>
+      </w:pPr>
+      <w:r>
+        <w:rPr>
+          <w:rFonts w:ascii="Times New Roman" w:hAnsi="Times New Roman" w:eastAsia="Times New Roman"/>
+          <w:b w:val="0"/>
+          <w:sz w:val="28"/>
+        </w:rPr>
+        <w:t>Joriy installer kodida aktivatsiya ma’lumotlari agent fayllarini nusxalashdan oldin olinadi. Xodim tashkilot tokenini belgilangan oynaga kiritadi va server tekshiruvini kutadi. Server tashkilot, qurilma va yangi kalitning mosligini tekshiradi. Xato bo‘lsa qayta urinish va bekor qilish imkoniyati saqlanadi. Ko‘plab PC’larni tayyorlashda umumiy bir martalik tokenni cheklanmagan sonli qurilmaga tarqatish nazarda tutilmaydi: tokenning sarflanishi va har bir qurilma uchun alohida aktivatsiya nazorat qilinadi.</w:t>
+      </w:r>
+    </w:p>
+    <w:p>
+      <w:pPr>
+        <w:spacing w:line="360" w:lineRule="auto" w:after="0" w:before="0"/>
+        <w:ind w:firstLine="709" w:right="0" w:left="0"/>
+        <w:jc w:val="both"/>
+      </w:pPr>
+      <w:r>
+        <w:rPr>
+          <w:rFonts w:ascii="Times New Roman" w:hAnsi="Times New Roman" w:eastAsia="Times New Roman"/>
+          <w:b w:val="0"/>
+          <w:sz w:val="28"/>
+        </w:rPr>
+        <w:t>Windows tizim fayllarini o‘rnatish uchun administrator huquqi talab qilinishi mumkin. Biroq foydalanuvchiga bog‘liq kalit va sertifikatni boshqa administrator profiliga yozib yuborish noto‘g‘ri natija beradi. Shu sababli aktivatsiya konteksti, o‘rnatish konteksti va agent ishlaydigan asl foydalanuvchi ajratiladi. O‘rnatish tugagach, agentning shu foydalanuvchi sessiyasida ishga tushishi, serverga imzolangan murojaati va boshqaruv panelida ko‘rinishi tekshiriladi [13].</w:t>
+      </w:r>
+    </w:p>
+    <w:p>
+      <w:pPr>
+        <w:spacing w:line="360" w:lineRule="auto" w:after="0" w:before="0"/>
+        <w:ind w:firstLine="709" w:right="0" w:left="0"/>
+        <w:jc w:val="both"/>
+      </w:pPr>
+      <w:r>
+        <w:rPr>
+          <w:rFonts w:ascii="Times New Roman" w:hAnsi="Times New Roman" w:eastAsia="Times New Roman"/>
+          <w:b w:val="0"/>
+          <w:sz w:val="28"/>
+        </w:rPr>
+        <w:t>Korporativ tarqatish ssenariysida sozlamalar izchilligi muhim. Barcha PC’lar mo‘ljallangan server manziliga murojaat qilishi, TLS tekshiruvini saqlashi va vaqtni to‘g‘ri yuritishi kerak. Tizimning hozirgi interaktiv token oynasi mavjudligi avtomatik ommaviy deploy, Active Directory yoki Group Policy orqali boshqariladigan o‘rnatish amalga oshirilganini anglatmaydi. Bunday tarqatish yo‘li alohida ishlab chiqish va kompaniya infratuzilmasida tekshirishni talab qiladi.</w:t>
+      </w:r>
+    </w:p>
+    <w:p>
+      <w:pPr>
+        <w:pStyle w:val="Heading3"/>
+        <w:ind w:right="0" w:left="0"/>
+        <w:jc w:val="both"/>
+      </w:pPr>
+      <w:r>
+        <w:rPr>
+          <w:rFonts w:ascii="Times New Roman" w:hAnsi="Times New Roman" w:eastAsia="Times New Roman"/>
+          <w:b/>
+          <w:sz w:val="28"/>
+        </w:rPr>
+        <w:t>Telefon interfeysi va foydalanuvchini biometrik ro‘yxatga olish</w:t>
+      </w:r>
+    </w:p>
+    <w:p>
+      <w:pPr>
+        <w:spacing w:line="360" w:lineRule="auto" w:after="0" w:before="0"/>
+        <w:ind w:firstLine="709" w:right="0" w:left="0"/>
+        <w:jc w:val="both"/>
+      </w:pPr>
+      <w:r>
+        <w:rPr>
+          <w:rFonts w:ascii="Times New Roman" w:hAnsi="Times New Roman" w:eastAsia="Times New Roman"/>
+          <w:b w:val="0"/>
+          <w:sz w:val="28"/>
+        </w:rPr>
+        <w:t>Kompaniya administratori qurilmani tasdiqlash uchun telefondan foydalanishi bilan xodimning shaxsini biometrik tekshirish ikki xil jarayondir. Birinchisida administrator PC’ni kompaniya tarkibiga qabul qiladi. Ikkinchisida esa foydalanuvchiga tegishli yuz namunasi yoki WebAuthn autentifikatori bilan ishlanadi. Foydalanuvchi interfeysida ikkala jarayon ham telefon orqali ochilishi mumkin, ammo sessiyalar va ularning ruxsatlari aralashtirilmaydi.</w:t>
+      </w:r>
+    </w:p>
+    <w:p>
+      <w:pPr>
+        <w:spacing w:line="360" w:lineRule="auto" w:after="0" w:before="0"/>
+        <w:ind w:firstLine="709" w:right="0" w:left="0"/>
+        <w:jc w:val="both"/>
+      </w:pPr>
+      <w:r>
+        <w:rPr>
+          <w:rFonts w:ascii="Times New Roman" w:hAnsi="Times New Roman" w:eastAsia="Times New Roman"/>
+          <w:b w:val="0"/>
+          <w:sz w:val="28"/>
+        </w:rPr>
+        <w:t>Mobil biometrik ro‘yxatga olish sahifasi tekshiruvni ikki bosqichda ko‘rsatadi: avval yuz tekshiriladi, keyin autentifikator bilan tasdiqlash bajariladi. Quyidagi tasvir 390 piksel kenglikdagi mobil brauzer ko‘rinishida haqiqiy server bergan vaqtinchalik sessiya orqali olingan. U boshlang‘ich interfeysni tasvirlaydi; kamera yoki barmoq izi sensori yordamida yakuniy muvaffaqiyatli tekshiruv bajarilganini ko‘rsatmaydi. WebAuthn autentifikatoridagi mahalliy tekshiruv aynan barmoq izi bilan bajarilishi majburiy emas.</w:t>
+      </w:r>
+    </w:p>
+    <w:p>
+      <w:pPr>
+        <w:keepNext/>
+        <w:ind w:firstLine="0" w:right="0" w:left="0"/>
+        <w:jc w:val="center"/>
+      </w:pPr>
+      <w:r>
+        <w:drawing>
+          <wp:inline xmlns:a="http://schemas.openxmlformats.org/drawingml/2006/main" xmlns:pic="http://schemas.openxmlformats.org/drawingml/2006/picture">
+            <wp:extent cx="2827962" cy="6120000"/>
+            <wp:docPr id="14" name="Picture 14"/>
+            <wp:cNvGraphicFramePr>
+              <a:graphicFrameLocks noChangeAspect="1"/>
+            </wp:cNvGraphicFramePr>
+            <a:graphic>
+              <a:graphicData uri="http://schemas.openxmlformats.org/drawingml/2006/picture">
+                <pic:pic>
+                  <pic:nvPicPr>
+                    <pic:cNvPr id="0" name="mobile_biometric_ready.png"/>
+                    <pic:cNvPicPr/>
+                  </pic:nvPicPr>
+                  <pic:blipFill>
+                    <a:blip r:embed="rId23"/>
+                    <a:stretch>
+                      <a:fillRect/>
+                    </a:stretch>
+                  </pic:blipFill>
+                  <pic:spPr>
+                    <a:xfrm>
+                      <a:off x="0" y="0"/>
+                      <a:ext cx="2827962" cy="6120000"/>
+                    </a:xfrm>
+                    <a:prstGeom prst="rect"/>
+                  </pic:spPr>
+                </pic:pic>
+              </a:graphicData>
+            </a:graphic>
+          </wp:inline>
+        </w:drawing>
+      </w:r>
+    </w:p>
+    <w:p>
+      <w:pPr>
+        <w:spacing w:line="252" w:lineRule="auto" w:after="200" w:before="0"/>
+        <w:ind w:firstLine="0" w:right="0" w:left="0"/>
+        <w:jc w:val="center"/>
+      </w:pPr>
+      <w:r>
+        <w:rPr>
+          <w:rFonts w:ascii="Times New Roman" w:hAnsi="Times New Roman" w:eastAsia="Times New Roman"/>
+          <w:b w:val="0"/>
+          <w:sz w:val="24"/>
+        </w:rPr>
+        <w:t>2.14-rasm. Mobil o‘lchamdagi biometrik ro‘yxatga olishning boshlang‘ich oynasi</w:t>
+      </w:r>
+    </w:p>
+    <w:p>
+      <w:pPr>
+        <w:spacing w:line="360" w:lineRule="auto" w:after="0" w:before="0"/>
+        <w:ind w:firstLine="709" w:right="0" w:left="0"/>
+        <w:jc w:val="both"/>
+      </w:pPr>
+      <w:r>
+        <w:rPr>
+          <w:rFonts w:ascii="Times New Roman" w:hAnsi="Times New Roman" w:eastAsia="Times New Roman"/>
+          <w:b w:val="0"/>
+          <w:sz w:val="28"/>
+        </w:rPr>
+        <w:t>Agent sessiyasiga tegishli /agent/mobile/face/ yo‘li boshqa mobil sahifani ochadi. Ushbu sahifa kameradan tasvir olishga ruxsat so‘raydi va joriy sessiya vaqtini ko‘rsatadi. Kamera mavjud bo‘lmagan yoki ruxsat berilmagan holatda tasdiqlashni davom ettirish mumkin emasligi aniq ko‘rinishi kerak. Bunday xato holatini foydalanuvchini tekshirish muvaffaqiyatiga aylantirish noto‘g‘ri bo‘ladi. Telefon brauzeri, kamera ruxsati va server origin mosligi amaliy joriy etishda alohida tekshiriladi.</w:t>
+      </w:r>
+    </w:p>
+    <w:p>
+      <w:pPr>
+        <w:keepNext/>
+        <w:ind w:firstLine="0" w:right="0" w:left="0"/>
+        <w:jc w:val="center"/>
+      </w:pPr>
+      <w:r>
+        <w:drawing>
+          <wp:inline xmlns:a="http://schemas.openxmlformats.org/drawingml/2006/main" xmlns:pic="http://schemas.openxmlformats.org/drawingml/2006/picture">
+            <wp:extent cx="2255954" cy="6119998"/>
+            <wp:docPr id="15" name="Picture 15"/>
+            <wp:cNvGraphicFramePr>
+              <a:graphicFrameLocks noChangeAspect="1"/>
+            </wp:cNvGraphicFramePr>
+            <a:graphic>
+              <a:graphicData uri="http://schemas.openxmlformats.org/drawingml/2006/picture">
+                <pic:pic>
+                  <pic:nvPicPr>
+                    <pic:cNvPr id="0" name="mobile_agent_face.png"/>
+                    <pic:cNvPicPr/>
+                  </pic:nvPicPr>
+                  <pic:blipFill>
+                    <a:blip r:embed="rId24"/>
+                    <a:stretch>
+                      <a:fillRect/>
+                    </a:stretch>
+                  </pic:blipFill>
+                  <pic:spPr>
+                    <a:xfrm>
+                      <a:off x="0" y="0"/>
+                      <a:ext cx="2255954" cy="6119998"/>
+                    </a:xfrm>
+                    <a:prstGeom prst="rect"/>
+                  </pic:spPr>
+                </pic:pic>
+              </a:graphicData>
+            </a:graphic>
+          </wp:inline>
+        </w:drawing>
+      </w:r>
+    </w:p>
+    <w:p>
+      <w:pPr>
+        <w:spacing w:line="252" w:lineRule="auto" w:after="200" w:before="0"/>
+        <w:ind w:firstLine="0" w:right="0" w:left="0"/>
+        <w:jc w:val="center"/>
+      </w:pPr>
+      <w:r>
+        <w:rPr>
+          <w:rFonts w:ascii="Times New Roman" w:hAnsi="Times New Roman" w:eastAsia="Times New Roman"/>
+          <w:b w:val="0"/>
+          <w:sz w:val="24"/>
+        </w:rPr>
+        <w:t>2.15-rasm. Agentning mobil yuz tekshiruvi sahifasida kamera ruxsati berilmagan holat</w:t>
+      </w:r>
+    </w:p>
+    <w:p>
+      <w:pPr>
+        <w:pStyle w:val="Heading3"/>
+        <w:ind w:right="0" w:left="0"/>
+        <w:jc w:val="both"/>
+      </w:pPr>
+      <w:r>
+        <w:rPr>
+          <w:rFonts w:ascii="Times New Roman" w:hAnsi="Times New Roman" w:eastAsia="Times New Roman"/>
+          <w:b/>
+          <w:sz w:val="28"/>
+        </w:rPr>
+        <w:t>Ko‘p PC bilan kundalik ishlash, monitoring va qurilmani bekor qilish</w:t>
+      </w:r>
+    </w:p>
+    <w:p>
+      <w:pPr>
+        <w:spacing w:line="360" w:lineRule="auto" w:after="0" w:before="0"/>
+        <w:ind w:firstLine="709" w:right="0" w:left="0"/>
+        <w:jc w:val="both"/>
+      </w:pPr>
+      <w:r>
+        <w:rPr>
+          <w:rFonts w:ascii="Times New Roman" w:hAnsi="Times New Roman" w:eastAsia="Times New Roman"/>
+          <w:b w:val="0"/>
+          <w:sz w:val="28"/>
+        </w:rPr>
+        <w:t>Kundalik ishda administrator kompaniyaning foydalanuvchi va qurilmalarini markaziy panel orqali kuzatadi. Tekshiruv sessiyasi ma’lum foydalanuvchi va PC bilan bog‘lanadi. Xodimning holati yoki roli o‘zgarsa, kelgusi so‘rovlarda shu o‘zgarish hisobga olinishi kerak. Biroq bu rol o‘zgarishi Windowsdagi barcha fayl ACL yoki domen guruhlarini avtomatik qayta yozishini anglatmaydi. Boshqaruv panelidagi vakolatlar bilan operatsion tizimning mahalliy vakolatlari orasidagi integratsiya darajasi alohida ko‘rsatiladi.</w:t>
+      </w:r>
+    </w:p>
+    <w:p>
+      <w:pPr>
+        <w:spacing w:line="360" w:lineRule="auto" w:after="0" w:before="0"/>
+        <w:ind w:firstLine="709" w:right="0" w:left="0"/>
+        <w:jc w:val="both"/>
+      </w:pPr>
+      <w:r>
+        <w:rPr>
+          <w:rFonts w:ascii="Times New Roman" w:hAnsi="Times New Roman" w:eastAsia="Times New Roman"/>
+          <w:b w:val="0"/>
+          <w:sz w:val="28"/>
+        </w:rPr>
+        <w:t>AgentHealth va AgentEvent kompaniyadagi qurilmalar holatini kuzatishga xizmat qiladi. Server qabul qilgan vaqt bilan agent xabar qilgan vaqt ajratiladi, chunki ishchi kompyuter soati xato bo‘lishi mumkin. Joriy hujjatga ko‘ra, birinchi heartbeatdan keyin 120 soniya aloqa bo‘lmasa connection_lost hodisasi, aloqa tiklanganda connection_restored hodisasi qayd etiladi. Lekin aloqa uzilishi xodim ataylab agentni o‘chirganini isbotlamaydi: elektr, tarmoq yoki jarayon xatosi ham shunday natija berishi mumkin [12].</w:t>
+      </w:r>
+    </w:p>
+    <w:p>
+      <w:pPr>
+        <w:spacing w:line="360" w:lineRule="auto" w:after="0" w:before="0"/>
+        <w:ind w:firstLine="709" w:right="0" w:left="0"/>
+        <w:jc w:val="both"/>
+      </w:pPr>
+      <w:r>
+        <w:rPr>
+          <w:rFonts w:ascii="Times New Roman" w:hAnsi="Times New Roman" w:eastAsia="Times New Roman"/>
+          <w:b w:val="0"/>
+          <w:sz w:val="28"/>
+        </w:rPr>
+        <w:t>Panel yopiq vaqtda ham monitoring talab qilinsa, davriy sog‘liq tekshiruvi alohida ishga tushiriladi. Buning uchun loyihada Celery worker va Beat yoki check_agent_health boshqaruv buyrug‘ini reja bo‘yicha bajarish yo‘li ko‘rsatilgan. Faqat veb-serverni ishga tushirish ushbu davriy xizmatlarning ham ishlayotganini anglatmaydi. Kompaniyada joriy etish tekshiruvida shu xizmatlar, broker aloqasi va uzilish holatidagi kuzatuv ham qabul mezoniga kiritiladi.</w:t>
+      </w:r>
+    </w:p>
+    <w:p>
+      <w:pPr>
+        <w:spacing w:line="360" w:lineRule="auto" w:after="0" w:before="0"/>
+        <w:ind w:firstLine="709" w:right="0" w:left="0"/>
+        <w:jc w:val="both"/>
+      </w:pPr>
+      <w:r>
+        <w:rPr>
+          <w:rFonts w:ascii="Times New Roman" w:hAnsi="Times New Roman" w:eastAsia="Times New Roman"/>
+          <w:b w:val="0"/>
+          <w:sz w:val="28"/>
+        </w:rPr>
+        <w:t>Vakolatli administrator vaqtinchalik ishlamaslikka ruxsat bersa, uning kimligi, sababi va muddati qayd etiladi. Bunday ruxsat ogohlantirish siyosatiga ta’sir qilishi mumkin, lekin u agent oynasini har qanday sharoitda masofadan yopish degani emas. Server bergan yangi siyosat agentga yetib borishi uchun aloqa kerak bo‘ladi. Shu bois boshqa filialdagi tarmoq uzilishida administrator oynasidagi qaror bilan PC’dagi oxirgi ma’lum holat orasidagi farq hisobga olinadi.</w:t>
+      </w:r>
+    </w:p>
+    <w:p>
+      <w:pPr>
+        <w:spacing w:line="360" w:lineRule="auto" w:after="0" w:before="0"/>
+        <w:ind w:firstLine="709" w:right="0" w:left="0"/>
+        <w:jc w:val="both"/>
+      </w:pPr>
+      <w:r>
+        <w:rPr>
+          <w:rFonts w:ascii="Times New Roman" w:hAnsi="Times New Roman" w:eastAsia="Times New Roman"/>
+          <w:b w:val="0"/>
+          <w:sz w:val="28"/>
+        </w:rPr>
+        <w:t>PC xizmatdan chiqarilsa, boshqa tashkilotga berilsa yoki agent olib tashlansa, oddiy qurilma autentifikatsiyasi bekor qilinadi. Olib tashlash kodi muayyan qurilma va sertifikat avlodiga bog‘lanadi. Jarayon boshlanganidan so‘ng eski kalitdan oddiy autentifikatsiyada foydalanish davom etmasligi kerak. Audit yozuvlari esa hodisalar tarixini saqlash uchun qoladi. Bitta PC’ni bekor qilish boshqa faol kompaniya qurilmalarini avtomatik bloklash uchun asos bo‘lmasligi lozim.</w:t>
+      </w:r>
+    </w:p>
+    <w:p>
+      <w:pPr>
+        <w:spacing w:line="360" w:lineRule="auto" w:after="0" w:before="0"/>
+        <w:ind w:firstLine="709" w:right="0" w:left="0"/>
+        <w:jc w:val="both"/>
+      </w:pPr>
+      <w:r>
+        <w:rPr>
+          <w:rFonts w:ascii="Times New Roman" w:hAnsi="Times New Roman" w:eastAsia="Times New Roman"/>
+          <w:b w:val="0"/>
+          <w:sz w:val="28"/>
+        </w:rPr>
+        <w:t>Kompaniya miqyosidagi yakuniy qabul sinovlari kamida turli PC’larda parallel ro‘yxatga olish, noto‘g‘ri tashkilot administratori bilan tasdiqlash, bir foydalanuvchining turli PC’dagi sessiyalari, tarmoq uzilishi, sertifikat bekor qilinishi va agentni qayta o‘rnatish holatlarini qamrab oladi. Ko‘p foydalanuvchi yuklamasi bo‘yicha esa bir vaqtning o‘zidagi sessiyalar, javob vaqti, bazadagi yozuvlar to‘qnashuvi va navbatlar holati o‘lchanadi. Bu mezonlar tajriba rejasi sifatida beriladi; joriy ishda o‘lchanmagan throughput yoki maksimal PC soni uydirib kiritilmaydi.</w:t>
+      </w:r>
+    </w:p>
+    <w:p>
+      <w:pPr>
         <w:spacing w:line="360" w:lineRule="auto" w:after="0" w:before="0"/>
         <w:ind w:firstLine="709" w:right="0" w:left="0"/>
         <w:jc w:val="both"/>
@@ -11277,7 +12246,7 @@
           <w:b w:val="0"/>
           <w:sz w:val="28"/>
         </w:rPr>
-        <w:t>Diplom loyihasida operatsion tizimlardan foydalanishni nazoratlash va ko‘p faktorli autentifikatsiya usullari o‘rganildi. Identifikatsiya, autentifikatsiya va avtorizatsiyaning vazifalari ajratildi; parol, biometrik belgi hamda autentifikator kalitiga egalikning xavfsizlik xususiyatlari tahlil qilindi. QR havola, qurilma metama’lumoti va shaxsni tasdiqlash dalilini bir tushuncha sifatida talqin qilish mumkin emasligi asoslandi.</w:t>
+        <w:t>Diplom loyihasida kompaniyalarning ko‘p kompyuterli muhitida operatsion tizimlardan foydalanishni markazlashgan tarzda nazoratlash va ko‘p faktorli autentifikatsiya usullari o‘rganildi. Identifikatsiya, autentifikatsiya va avtorizatsiyaning vazifalari ajratildi; parol, biometrik belgi hamda autentifikator kalitiga egalikning xavfsizlik xususiyatlari tahlil qilindi. QR havola, qurilma metama’lumoti va shaxsni tasdiqlash dalilini bir tushuncha sifatida talqin qilish mumkin emasligi asoslandi.</w:t>
       </w:r>
     </w:p>
     <w:p>
@@ -11292,7 +12261,7 @@
           <w:b w:val="0"/>
           <w:sz w:val="28"/>
         </w:rPr>
-        <w:t>Amaliy qismda auth va agent repozitoriylaridagi dasturiy tizim arxitekturasi yoritildi. Django serveri, React boshqaruv interfeysi, Windows agenti va Go yordamchisi o‘rtasidagi vazifalar taqsimoti ko‘rsatildi. Organization, Users, Roles, Device, AgentSession va biometrik modellar orasidagi bog‘lanishlar tahlil qilindi. Qurilmani dastlabki hisobga olish bilan kriptografik aktivatsiya alohida bosqichlar ekanligi tushuntirildi.</w:t>
+        <w:t>Amaliy qismda auth va agent repozitoriylaridagi dasturiy tizim arxitekturasi yoritildi. Django serveri, React boshqaruv interfeysi, Windows agenti va Go yordamchisi o‘rtasidagi vazifalar taqsimoti ko‘rsatildi. Organization, Users, Roles, Device, AgentSession va biometrik modellar orasidagi bog‘lanishlar tahlil qilindi. Qurilmani dastlabki hisobga olish bilan kriptografik aktivatsiya alohida bosqichlar ekanligi tushuntirildi. Kompaniya PC’sida sessiya yaratish, QR orqali administrator tasdig‘i, joylashuvni belgilash va agent ulanishini kutish holatlari haqiqiy mahalliy serverdagi namunaviy yozuvlar bilan tasvirlandi.</w:t>
       </w:r>
     </w:p>
     <w:p>

</xml_diff>

<commit_message>
docs: revise thesis outline and chapters per supervisor feedback
</commit_message>
<xml_diff>
--- a/docs/diplom/Yolchiyev_Rustam_Diplom_Loyihasi.docx
+++ b/docs/diplom/Yolchiyev_Rustam_Diplom_Loyihasi.docx
@@ -2545,7 +2545,7 @@
                 <w:b/>
                 <w:sz w:val="24"/>
               </w:rPr>
-              <w:t>I BOB. OPERATSION TIZIMLARDA AUTENTIFIKATSIYA VA FOYDALANISHNI NAZORATLASH USULLARINING TAHLILI</w:t>
+              <w:t>I BOB. OPERATSION TIZIMLAR VA ULARDA AUTENTIFIKATSIYA HAMDA FOYDALANISHNI NAZORATLASH USULLARINING TAHLILI</w:t>
             </w:r>
           </w:p>
         </w:tc>
@@ -2593,7 +2593,7 @@
                 <w:b w:val="0"/>
                 <w:sz w:val="24"/>
               </w:rPr>
-              <w:t>1.1-§. Operatsion tizimlarda identifikatsiya, autentifikatsiya va foydalanishni nazoratlash asoslari</w:t>
+              <w:t>1.1-§. Operatsion tizimlar va ularda qo‘llaniladigan identifikatsiya, autentifikatsiya va foydalanishni nazoratlash usullari</w:t>
             </w:r>
           </w:p>
         </w:tc>
@@ -2641,7 +2641,7 @@
                 <w:b w:val="0"/>
                 <w:sz w:val="24"/>
               </w:rPr>
-              <w:t>1.2-§. Ko‘p faktorli autentifikatsiya usullari: parol, biometrik tekshiruv va qurilmaga egalik omili</w:t>
+              <w:t>1.2-§. Ko‘p faktorli autentifikatsiya tizimlari tahlili</w:t>
             </w:r>
           </w:p>
         </w:tc>
@@ -2663,7 +2663,7 @@
                 <w:b w:val="0"/>
                 <w:sz w:val="24"/>
               </w:rPr>
-              <w:t>13</w:t>
+              <w:t>14</w:t>
             </w:r>
           </w:p>
         </w:tc>
@@ -2711,7 +2711,7 @@
                 <w:b w:val="0"/>
                 <w:sz w:val="24"/>
               </w:rPr>
-              <w:t>15</w:t>
+              <w:t>18</w:t>
             </w:r>
           </w:p>
         </w:tc>
@@ -2759,7 +2759,7 @@
                 <w:b w:val="0"/>
                 <w:sz w:val="24"/>
               </w:rPr>
-              <w:t>18</w:t>
+              <w:t>21</w:t>
             </w:r>
           </w:p>
         </w:tc>
@@ -2785,55 +2785,7 @@
                 <w:b w:val="0"/>
                 <w:sz w:val="24"/>
               </w:rPr>
-              <w:t>2.1-§. Tizim arxitekturasi, texnologiyalar va ma’lumotlar bazasini loyihalash</w:t>
-            </w:r>
-          </w:p>
-        </w:tc>
-        <w:tc>
-          <w:tcPr>
-            <w:tcW w:type="dxa" w:w="510"/>
-            <w:vAlign w:val="center"/>
-          </w:tcPr>
-          <w:p>
-            <w:pPr>
-              <w:spacing w:line="252" w:lineRule="auto" w:after="80" w:before="80"/>
-              <w:ind w:firstLine="0"/>
-              <w:jc w:val="right"/>
-            </w:pPr>
-            <w:r/>
-            <w:r>
-              <w:rPr>
-                <w:rFonts w:ascii="Times New Roman" w:hAnsi="Times New Roman" w:eastAsia="Times New Roman"/>
-                <w:b w:val="0"/>
-                <w:sz w:val="24"/>
-              </w:rPr>
-              <w:t>18</w:t>
-            </w:r>
-          </w:p>
-        </w:tc>
-      </w:tr>
-      <w:tr>
-        <w:trPr>
-          <w:cantSplit/>
-        </w:trPr>
-        <w:tc>
-          <w:tcPr>
-            <w:tcW w:type="dxa" w:w="8277"/>
-            <w:vAlign w:val="center"/>
-          </w:tcPr>
-          <w:p>
-            <w:pPr>
-              <w:spacing w:line="252" w:lineRule="auto" w:after="80" w:before="80"/>
-              <w:ind w:firstLine="0" w:left="227"/>
-            </w:pPr>
-            <w:r/>
-            <w:r>
-              <w:rPr>
-                <w:rFonts w:ascii="Times New Roman" w:hAnsi="Times New Roman" w:eastAsia="Times New Roman"/>
-                <w:b w:val="0"/>
-                <w:sz w:val="24"/>
-              </w:rPr>
-              <w:t>2.2-§. Server, boshqaruv veb-interfeysi va Windows agentini ishlab chiqish</w:t>
+              <w:t>2.1-§. Ishlab chiqiluvchi tizim arxitekturasi</w:t>
             </w:r>
           </w:p>
         </w:tc>
@@ -2881,7 +2833,7 @@
                 <w:b w:val="0"/>
                 <w:sz w:val="24"/>
               </w:rPr>
-              <w:t>2.3-§. Biometrik tekshiruv, telefon orqali tasdiqlash va qurilmalarni ro‘yxatdan o‘tkazish jarayonlari</w:t>
+              <w:t>2.2-§. Tizimning dasturiy ta’minotini ishlab chiqish</w:t>
             </w:r>
           </w:p>
         </w:tc>
@@ -2903,7 +2855,7 @@
                 <w:b w:val="0"/>
                 <w:sz w:val="24"/>
               </w:rPr>
-              <w:t>25</w:t>
+              <w:t>24</w:t>
             </w:r>
           </w:p>
         </w:tc>
@@ -2929,7 +2881,7 @@
                 <w:b w:val="0"/>
                 <w:sz w:val="24"/>
               </w:rPr>
-              <w:t>2.4-§. Tizim xavfsizligi, sinov natijalari va foydalanish yo‘riqnomasi</w:t>
+              <w:t>2.3-§. Ko‘p faktorli autentifikatsiya tizimini baholash</w:t>
             </w:r>
           </w:p>
         </w:tc>
@@ -2951,7 +2903,7 @@
                 <w:b w:val="0"/>
                 <w:sz w:val="24"/>
               </w:rPr>
-              <w:t>28</w:t>
+              <w:t>45</w:t>
             </w:r>
           </w:p>
         </w:tc>
@@ -2999,7 +2951,7 @@
                 <w:b w:val="0"/>
                 <w:sz w:val="24"/>
               </w:rPr>
-              <w:t>46</w:t>
+              <w:t>48</w:t>
             </w:r>
           </w:p>
         </w:tc>
@@ -3047,7 +2999,7 @@
                 <w:b w:val="0"/>
                 <w:sz w:val="24"/>
               </w:rPr>
-              <w:t>46</w:t>
+              <w:t>48</w:t>
             </w:r>
           </w:p>
         </w:tc>
@@ -3095,7 +3047,7 @@
                 <w:b w:val="0"/>
                 <w:sz w:val="24"/>
               </w:rPr>
-              <w:t>48</w:t>
+              <w:t>50</w:t>
             </w:r>
           </w:p>
         </w:tc>
@@ -3143,7 +3095,7 @@
                 <w:b w:val="0"/>
                 <w:sz w:val="24"/>
               </w:rPr>
-              <w:t>50</w:t>
+              <w:t>52</w:t>
             </w:r>
           </w:p>
         </w:tc>
@@ -3191,7 +3143,7 @@
                 <w:b w:val="0"/>
                 <w:sz w:val="24"/>
               </w:rPr>
-              <w:t>52</w:t>
+              <w:t>54</w:t>
             </w:r>
           </w:p>
         </w:tc>
@@ -3239,7 +3191,7 @@
                 <w:b w:val="0"/>
                 <w:sz w:val="24"/>
               </w:rPr>
-              <w:t>53</w:t>
+              <w:t>55</w:t>
             </w:r>
           </w:p>
         </w:tc>
@@ -3287,7 +3239,7 @@
                 <w:b w:val="0"/>
                 <w:sz w:val="24"/>
               </w:rPr>
-              <w:t>53</w:t>
+              <w:t>55</w:t>
             </w:r>
           </w:p>
         </w:tc>
@@ -3335,7 +3287,7 @@
                 <w:b w:val="0"/>
                 <w:sz w:val="24"/>
               </w:rPr>
-              <w:t>53</w:t>
+              <w:t>55</w:t>
             </w:r>
           </w:p>
         </w:tc>
@@ -3383,7 +3335,7 @@
                 <w:b w:val="0"/>
                 <w:sz w:val="24"/>
               </w:rPr>
-              <w:t>53</w:t>
+              <w:t>55</w:t>
             </w:r>
           </w:p>
         </w:tc>
@@ -3431,7 +3383,7 @@
                 <w:b w:val="0"/>
                 <w:sz w:val="24"/>
               </w:rPr>
-              <w:t>54</w:t>
+              <w:t>56</w:t>
             </w:r>
           </w:p>
         </w:tc>
@@ -3871,7 +3823,7 @@
           <w:b w:val="0"/>
           <w:sz w:val="28"/>
         </w:rPr>
-        <w:t>Diplom loyihasining birinchi bobida operatsion tizimlarda autentifikatsiya va foydalanishni nazoratlash asoslari, ko‘p faktorli autentifikatsiya usullari hamda mavjud yechimlar tahlil qilinadi. Tahlil asosida ishlab chiqiladigan tizimga qo‘yiladigan talablar shakllantiriladi.</w:t>
+        <w:t>Diplom loyihasining birinchi bobida operatsion tizimlarning vazifalari va himoya mexanizmlari, ularda identifikatsiya, autentifikatsiya hamda foydalanishni nazoratlash usullari tahlil qilinadi. Ko‘p faktorli autentifikatsiya tizimlari va mavjud yechimlar qiyoslanib, ishlab chiqiladigan tizimga qo‘yiladigan talablar shakllantiriladi.</w:t>
       </w:r>
     </w:p>
     <w:p>
@@ -3886,7 +3838,7 @@
           <w:b w:val="0"/>
           <w:sz w:val="28"/>
         </w:rPr>
-        <w:t>Diplom loyihasining ikkinchi bobida tizim arxitekturasi, ma’lumotlar bazasi, server, boshqaruv veb-interfeysi va Windows agentining tuzilishi yoritiladi. Yuzni tekshirish, telefon orqali tasdiqlash va qurilmalarni ro‘yxatdan o‘tkazish jarayonlari, xavfsizlik mexanizmlari, dasturiy sinovlar natijalari hamda foydalanish yo‘riqnomasi keltiriladi.</w:t>
+        <w:t>Diplom loyihasining ikkinchi bobida ishlab chiqiluvchi tizim arxitekturasi, dasturiy qismlari va o‘zaro ishlashi yoritiladi. Server, boshqaruv veb-interfeysi va Windows agenti bilan birgalikda biometrik tekshiruv, telefon orqali tasdiqlash, qurilmalarni ro‘yxatdan o‘tkazish va foydalanish tartibi bitta amaliy paragrafda bayon qilinadi. Tizim xavfsizligi, mavjud dasturiy sinovlar natijalari va aniqlangan cheklovlar alohida baholash paragrafida tahlil etiladi.</w:t>
       </w:r>
     </w:p>
     <w:p>
@@ -3932,7 +3884,7 @@
           <w:b/>
           <w:sz w:val="28"/>
         </w:rPr>
-        <w:t>I BOB. OPERATSION TIZIMLARDA AUTENTIFIKATSIYA VA FOYDALANISHNI NAZORATLASH USULLARINING TAHLILI</w:t>
+        <w:t>I BOB. OPERATSION TIZIMLAR VA ULARDA AUTENTIFIKATSIYA HAMDA FOYDALANISHNI NAZORATLASH USULLARINING TAHLILI</w:t>
       </w:r>
     </w:p>
     <w:p>
@@ -3947,7 +3899,7 @@
           <w:b/>
           <w:sz w:val="28"/>
         </w:rPr>
-        <w:t>1.1-§. Operatsion tizimlarda identifikatsiya, autentifikatsiya va foydalanishni nazoratlash asoslari</w:t>
+        <w:t>1.1-§. Operatsion tizimlar va ularda qo‘llaniladigan identifikatsiya, autentifikatsiya va foydalanishni nazoratlash usullari</w:t>
       </w:r>
     </w:p>
     <w:p>
@@ -3962,7 +3914,97 @@
           <w:b w:val="0"/>
           <w:sz w:val="28"/>
         </w:rPr>
-        <w:t>Operatsion tizim foydalanuvchi va hisoblash resurslari o‘rtasidagi asosiy boshqaruv qatlamidir. U jarayonlar, fayllar, xotira, qurilmalar va tarmoq imkoniyatlaridan foydalanishni tartibga soladi. Foydalanuvchining shaxsini tekshirish ushbu boshqaruvning boshlang‘ich sharti bo‘lsa-da, axborot xavfsizligi faqat kirish oynasini ko‘rsatish bilan ta’minlanmaydi. Tekshiruv natijasi himoyalanayotgan resursga kirish qarorini qabul qiladigan ishonchli komponentga yetkazilishi kerak. Shuningdek, sessiya tugashi, foydalanuvchi almashishi va kompyuter bloklanishi paytlarida xavfsizlik holati izchil saqlanishi lozim [1].</w:t>
+        <w:t>Operatsion tizim kompyuter apparat vositalari bilan amaliy dasturlar o‘rtasida ishlaydigan tizimli dasturiy ta’minotdir. U protsessor vaqtini taqsimlaydi, jarayonlarni ishga tushiradi, operativ xotirani boshqaradi, fayllar bilan ishlashni va tashqi qurilmalardan foydalanishni tashkil etadi. Axborot xavfsizligi nuqtayi nazaridan operatsion tizim har bir dastur qaysi foydalanuvchi nomidan va qanday vakolat bilan ishlayotganini hisobga olishi kerak. Shu sababli autentifikatsiya masalasi tizimning jarayon, hisob va ruxsat mexanizmlari bilan bog‘liq holda o‘rganiladi [1].</w:t>
+      </w:r>
+    </w:p>
+    <w:p>
+      <w:pPr>
+        <w:spacing w:line="360" w:lineRule="auto" w:after="0" w:before="0"/>
+        <w:ind w:firstLine="709" w:right="0" w:left="0"/>
+        <w:jc w:val="both"/>
+      </w:pPr>
+      <w:r>
+        <w:rPr>
+          <w:rFonts w:ascii="Times New Roman" w:hAnsi="Times New Roman" w:eastAsia="Times New Roman"/>
+          <w:b w:val="0"/>
+          <w:sz w:val="28"/>
+        </w:rPr>
+        <w:t>Qo‘llanish muhitiga ko‘ra ish stoli, server, mobil va o‘rnatilgan qurilmalar uchun operatsion tizimlar farqlanadi. Ish stoli muhitida foydalanuvchining interaktiv kirishi va ekran blokidan chiqishi muhim bo‘lsa, serverda masofaviy sessiyalar hamda xizmat hisoblarining vakolatlari ham nazorat qilinadi. Mobil tizim ushbu loyihada telefon orqali tasdiqlash vositasining muhitidir. Ishchi kompyuter agentining asosiy platformasi Windows hisoblanadi. Linux va macOS tizimlari nazariy taqqoslash uchun ko‘rib chiqiladi, ularda to‘liq agent ishlab chiqilgani da’vo qilinmaydi.</w:t>
+      </w:r>
+    </w:p>
+    <w:p>
+      <w:pPr>
+        <w:spacing w:line="360" w:lineRule="auto" w:after="0" w:before="0"/>
+        <w:ind w:firstLine="709" w:right="0" w:left="0"/>
+        <w:jc w:val="both"/>
+      </w:pPr>
+      <w:r>
+        <w:rPr>
+          <w:rFonts w:ascii="Times New Roman" w:hAnsi="Times New Roman" w:eastAsia="Times New Roman"/>
+          <w:b w:val="0"/>
+          <w:sz w:val="28"/>
+        </w:rPr>
+        <w:t>Tizim yadrosi va foydalanuvchi dasturlari turli vakolat darajalarida ishlaydi. Oddiy dastur oynasi autentifikatsiya natijasini ko‘rsatishi mumkin, biroq himoyalangan resurs ustidagi yakuniy qaror tegishli ishonchli komponent tomonidan bajarilishi lozim. Masalan, foydalanuvchini tekshirgan dastur yopilishi bilan uning nazorati chetlab o‘tilsa, bu mexanizm operatsion tizimning barcha kirish yo‘llari uchun mustaqil xavfsizlik chegarasi bo‘la olmaydi. Loyihani baholashda interfeysdagi holat bilan tizim darajasida bajarilgan ruxsat qarori shu sababli ajratiladi.</w:t>
+      </w:r>
+    </w:p>
+    <w:p>
+      <w:pPr>
+        <w:spacing w:line="360" w:lineRule="auto" w:after="0" w:before="0"/>
+        <w:ind w:firstLine="709" w:right="0" w:left="0"/>
+        <w:jc w:val="both"/>
+      </w:pPr>
+      <w:r>
+        <w:rPr>
+          <w:rFonts w:ascii="Times New Roman" w:hAnsi="Times New Roman" w:eastAsia="Times New Roman"/>
+          <w:b w:val="0"/>
+          <w:sz w:val="28"/>
+        </w:rPr>
+        <w:t>Windows muhitida foydalanuvchi hisobi, guruhlar va xavfsizlik identifikatorlari ruxsatlarni belgilashda qatnashadi. Interaktiv kirish jarayonida hisob ma’lumotlarini olish, ularni tekshirish va foydalanuvchi sessiyasini yaratish turli komponentlarning vazifasidir. Kirish interfeysini kengaytiruvchi Credential Provider bilan oddiy foydalanuvchi sessiyasida ishlaydigan agentning vakolati bir xil emas. Windows Hello for Business esa qurilmaga bog‘langan kalit va foydalanuvchining mahalliy tasdig‘iga tayangan yondashuvlardan biridir. Mazkur loyihaning agenti server bilan imzoli so‘rov almashadi, ammo barcha Credential Provider va himoyalangan ish stoli oqimlari bilan yakuniy integratsiya alohida tekshirilishi kerak [9, 13].</w:t>
+      </w:r>
+    </w:p>
+    <w:p>
+      <w:pPr>
+        <w:spacing w:line="360" w:lineRule="auto" w:after="0" w:before="0"/>
+        <w:ind w:firstLine="709" w:right="0" w:left="0"/>
+        <w:jc w:val="both"/>
+      </w:pPr>
+      <w:r>
+        <w:rPr>
+          <w:rFonts w:ascii="Times New Roman" w:hAnsi="Times New Roman" w:eastAsia="Times New Roman"/>
+          <w:b w:val="0"/>
+          <w:sz w:val="28"/>
+        </w:rPr>
+        <w:t>Linux tizimlarida foydalanuvchi va guruh identifikatorlari, fayl ruxsatlari hamda imtiyozli amallarni cheklash mexanizmlari muhim o‘rin tutadi. PAM ishlatiladigan xizmatlarda autentifikatsiya modullari muayyan xizmat uchun belgilangan tartibda chaqiriladi. Bitta xizmatdagi qo‘shimcha tekshiruv barcha lokal va masofaviy kirish usullariga avtomatik tatbiq etilmaydi. macOS ham hisob, sessiya va tizim vakolatlarini o‘z mexanizmlari orqali boshqaradi. Har bir platformaga mos integratsiya nuqtasi va tiklash tartibini aniqlash ko‘p platformali yechimning alohida vazifasidir.</w:t>
+      </w:r>
+    </w:p>
+    <w:p>
+      <w:pPr>
+        <w:spacing w:line="360" w:lineRule="auto" w:after="0" w:before="0"/>
+        <w:ind w:firstLine="709" w:right="0" w:left="0"/>
+        <w:jc w:val="both"/>
+      </w:pPr>
+      <w:r>
+        <w:rPr>
+          <w:rFonts w:ascii="Times New Roman" w:hAnsi="Times New Roman" w:eastAsia="Times New Roman"/>
+          <w:b w:val="0"/>
+          <w:sz w:val="28"/>
+        </w:rPr>
+        <w:t>Kompaniya muhitida mahalliy hisoblar bilan markaziy boshqariladigan hisoblarni farqlash zarur. Bir nechta tarmoq yoki filialda ishlaydigan PC’larning bitta boshqaruv serveriga ulanishi ularning operatsion tizim hisoblarini avtomatik birlashtirmaydi. Loyihadagi Organization va Users yozuvlari boshqaruv tizimiga tegishli, Device esa ishchi qurilmani ifodalaydi. Ushbu yozuvlar bilan Windows hisobi, domen guruhlari yoki fayl ACL ruxsatlari o‘rtasidagi bog‘lanish amalga oshirilgan darajada tavsiflanadi. Qurilmani ro‘yxatdan o‘tkazish foydalanuvchining operatsion tizimga kirish huquqini mustaqil isbotlamaydi.</w:t>
+      </w:r>
+    </w:p>
+    <w:p>
+      <w:pPr>
+        <w:spacing w:line="360" w:lineRule="auto" w:after="0" w:before="0"/>
+        <w:ind w:firstLine="709" w:right="0" w:left="0"/>
+        <w:jc w:val="both"/>
+      </w:pPr>
+      <w:r>
+        <w:rPr>
+          <w:rFonts w:ascii="Times New Roman" w:hAnsi="Times New Roman" w:eastAsia="Times New Roman"/>
+          <w:b w:val="0"/>
+          <w:sz w:val="28"/>
+        </w:rPr>
+        <w:t>Nazorat talabini belgilashda dastlabki kirish, bloklangan sessiyani ochish, foydalanuvchini almashtirish, masofaviy kirish va tarmoq uzilishidagi ishlash holatlari alohida ko‘rib chiqiladi. Har bir holat uchun kimni tekshirish, qaysi dalillarni talab qilish, rad etishda qanday javob qaytarish va hodisani qay tarzda saqlash belgilanadi. Bu talablar agent o‘rnatilganini tekshirish bilan cheklanmaydi. Keyingi bo‘limlarda identifikatsiya, autentifikatsiya va foydalanishni nazoratlash usullari ana shu tizimli muhit bilan bog‘liq holda tahlil qilinadi.</w:t>
       </w:r>
     </w:p>
     <w:p>
@@ -4450,7 +4492,22 @@
           <w:b/>
           <w:sz w:val="28"/>
         </w:rPr>
-        <w:t>1.2-§. Ko‘p faktorli autentifikatsiya usullari: parol, biometrik tekshiruv va qurilmaga egalik omili</w:t>
+        <w:t>1.2-§. Ko‘p faktorli autentifikatsiya tizimlari tahlili</w:t>
+      </w:r>
+    </w:p>
+    <w:p>
+      <w:pPr>
+        <w:spacing w:line="360" w:lineRule="auto" w:after="0" w:before="0"/>
+        <w:ind w:firstLine="709" w:right="0" w:left="0"/>
+        <w:jc w:val="both"/>
+      </w:pPr>
+      <w:r>
+        <w:rPr>
+          <w:rFonts w:ascii="Times New Roman" w:hAnsi="Times New Roman" w:eastAsia="Times New Roman"/>
+          <w:b w:val="0"/>
+          <w:sz w:val="28"/>
+        </w:rPr>
+        <w:t>Ko‘p faktorli autentifikatsiya tizimi omillarni tekshiruvchi alohida dasturlarning yig‘indisidan kengroq tushunchadir. Bunday tizim foydalanuvchini dastlab ro‘yxatdan o‘tkazadi, autentifikatorni hisobga bog‘laydi, kirish urinishiga tegishli dalillarni tekshiradi va siyosat asosida qaror chiqaradi. Shuningdek, autentifikator yo‘qolganda tiklash, hisob yoki kalitni bekor qilish hamda hodisalarni qayd etish tartibini belgilaydi. Tizimning ko‘p faktorli ekanini baholashda aynan talab etilgan omillarning bir sessiyada tekshirilishi va o‘zaro bog‘lanishi aniqlanadi [2, 4].</w:t>
       </w:r>
     </w:p>
     <w:p>
@@ -4575,6 +4632,66 @@
     </w:p>
     <w:p>
       <w:pPr>
+        <w:spacing w:line="360" w:lineRule="auto" w:after="0" w:before="0"/>
+        <w:ind w:firstLine="709" w:right="0" w:left="0"/>
+        <w:jc w:val="both"/>
+      </w:pPr>
+      <w:r>
+        <w:rPr>
+          <w:rFonts w:ascii="Times New Roman" w:hAnsi="Times New Roman" w:eastAsia="Times New Roman"/>
+          <w:b w:val="0"/>
+          <w:sz w:val="28"/>
+        </w:rPr>
+        <w:t>Parol va bir martalik kodga asoslangan tizimlarda foydalanuvchi bilim omili bilan birga ro‘yxatdan o‘tgan telefon yoki autentifikatsiya ilovasidan foydalanadi. Bu yondashuvni joriy qilish imkoniyati telefon raqami, ilova siri va tiklash tartibiga bog‘liq. Kodni soxta sahifaga topshirish yoki foydalanuvchini noto‘g‘ri urinishni tasdiqlashga undash xavfi saqlanadi. Shu sababli parol bilan birga yana bir kiritish oynasini ko‘rsatishning o‘zi tizimning barcha muhim talablarini bajarganini anglatmaydi.</w:t>
+      </w:r>
+    </w:p>
+    <w:p>
+      <w:pPr>
+        <w:spacing w:line="360" w:lineRule="auto" w:after="0" w:before="0"/>
+        <w:ind w:firstLine="709" w:right="0" w:left="0"/>
+        <w:jc w:val="both"/>
+      </w:pPr>
+      <w:r>
+        <w:rPr>
+          <w:rFonts w:ascii="Times New Roman" w:hAnsi="Times New Roman" w:eastAsia="Times New Roman"/>
+          <w:b w:val="0"/>
+          <w:sz w:val="28"/>
+        </w:rPr>
+        <w:t>Ochiq kalitli autentifikatorga asoslangan tizimlarda server ro‘yxatdan o‘tgan kalit bilan yaratilgan javobni tekshiradi. Foydalanuvchining mahalliy tasdig‘i PIN yoki biometrik tekshiruv orqali bajarilishi mumkin. WebAuthn uchun origin va RP ID bilan bog‘lash muhim, operatsion tizimning kirish nuqtasiga ulanish esa alohida integratsiyani talab qiladi. Biometrik namunaning serverga uzatilishi yoki qurilmada tekshirilishi ham tizimning ma’lumotlarni himoyalash talablari va himoya chegarasiga ta’sir qiladi [2, 4].</w:t>
+      </w:r>
+    </w:p>
+    <w:p>
+      <w:pPr>
+        <w:spacing w:line="360" w:lineRule="auto" w:after="0" w:before="0"/>
+        <w:ind w:firstLine="709" w:right="0" w:left="0"/>
+        <w:jc w:val="both"/>
+      </w:pPr>
+      <w:r>
+        <w:rPr>
+          <w:rFonts w:ascii="Times New Roman" w:hAnsi="Times New Roman" w:eastAsia="Times New Roman"/>
+          <w:b w:val="0"/>
+          <w:sz w:val="28"/>
+        </w:rPr>
+        <w:t>Markaziy serverga tayanuvchi korporativ tizimlarda administrator siyosat, hisob va autentifikator holatini umumiy boshqaradi. Ishchi kompyuterdagi agent foydalanuvchi bilan aloqa qiladi va serverga dalil yuboradi. Bunda tarmoq mavjudligi, qurilma kalitini himoyalash, sertifikatni bekor qilish va sessiya holatini izchil yuritish talab etiladi. Mahalliy tekshiruvga tayanuvchi yechimlarda esa qarorning qaysi qismi qurilmada bajarilishi hamda markazdagi o‘zgarishning qurilmaga qanday yetib borishi aniqlanishi kerak. Offline imkoniyati faqat mavjudligi bilan baholanmaydi, uning amal muddati va bekor qilishga munosabati ham tekshiriladi.</w:t>
+      </w:r>
+    </w:p>
+    <w:p>
+      <w:pPr>
+        <w:spacing w:line="360" w:lineRule="auto" w:after="0" w:before="0"/>
+        <w:ind w:firstLine="709" w:right="0" w:left="0"/>
+        <w:jc w:val="both"/>
+      </w:pPr>
+      <w:r>
+        <w:rPr>
+          <w:rFonts w:ascii="Times New Roman" w:hAnsi="Times New Roman" w:eastAsia="Times New Roman"/>
+          <w:b w:val="0"/>
+          <w:sz w:val="28"/>
+        </w:rPr>
+        <w:t>Tizimlarni taqqoslash mezonlari omillarning mustaqilligi, dalilni joriy sessiyaga bog‘lash, operatsion tizimga integratsiya, ro‘yxatdan o‘tkazish va tiklash tartibini qamrab oladi. Shuningdek, boshqaruvning qulayligi va ishlash uzilishlari hisobga olinadi. Qaysi tizimni tanlash tashkilotning tahdid modeli va texnik muhitiga bog‘liq. Ushbu tahlilda universal aniqlik foizi yoki barcha muhit uchun bir xil ustunlik belgilanmaydi.</w:t>
+      </w:r>
+    </w:p>
+    <w:p>
+      <w:pPr>
         <w:keepNext/>
         <w:spacing w:line="252" w:lineRule="auto" w:after="80" w:before="160"/>
         <w:ind w:firstLine="0" w:right="0" w:left="0"/>
@@ -4586,7 +4703,7 @@
           <w:b w:val="0"/>
           <w:sz w:val="24"/>
         </w:rPr>
-        <w:t>1.2-jadval. Autentifikatsiya dalillari va cheklovlari</w:t>
+        <w:t>1.2-jadval. Ko‘p faktorli autentifikatsiya tizimlari va baholash mezonlari</w:t>
       </w:r>
     </w:p>
     <w:tbl>
@@ -4622,7 +4739,7 @@
                 <w:b/>
                 <w:sz w:val="22"/>
               </w:rPr>
-              <w:t>Tekshiruv</w:t>
+              <w:t>Tizim turi</w:t>
             </w:r>
           </w:p>
         </w:tc>
@@ -4643,7 +4760,7 @@
                 <w:b/>
                 <w:sz w:val="22"/>
               </w:rPr>
-              <w:t>Asosiy dalil</w:t>
+              <w:t>Tekshirish tamoyili</w:t>
             </w:r>
           </w:p>
         </w:tc>
@@ -4664,7 +4781,7 @@
                 <w:b/>
                 <w:sz w:val="22"/>
               </w:rPr>
-              <w:t>Muhim cheklov</w:t>
+              <w:t>Baholashdagi asosiy jihat</w:t>
             </w:r>
           </w:p>
         </w:tc>
@@ -4690,7 +4807,7 @@
                 <w:b w:val="0"/>
                 <w:sz w:val="22"/>
               </w:rPr>
-              <w:t>Parol</w:t>
+              <w:t>Parol va bir martalik kod</w:t>
             </w:r>
           </w:p>
         </w:tc>
@@ -4711,7 +4828,7 @@
                 <w:b w:val="0"/>
                 <w:sz w:val="22"/>
               </w:rPr>
-              <w:t>Sirni bilish</w:t>
+              <w:t>Bilim hamda ro‘yxatdagi vositaga egalik</w:t>
             </w:r>
           </w:p>
         </w:tc>
@@ -4732,7 +4849,7 @@
                 <w:b w:val="0"/>
                 <w:sz w:val="22"/>
               </w:rPr>
-              <w:t>Fishing yoki oshkor bo‘lish xavfi</w:t>
+              <w:t>Fishing va hisobni tiklash tartibi</w:t>
             </w:r>
           </w:p>
         </w:tc>
@@ -4758,7 +4875,7 @@
                 <w:b w:val="0"/>
                 <w:sz w:val="22"/>
               </w:rPr>
-              <w:t>Yuzni solishtirish</w:t>
+              <w:t>WebAuthn autentifikatori</w:t>
             </w:r>
           </w:p>
         </w:tc>
@@ -4779,7 +4896,7 @@
                 <w:b w:val="0"/>
                 <w:sz w:val="22"/>
               </w:rPr>
-              <w:t>Biometrik namunaga o‘xshashlik</w:t>
+              <w:t>Kalitga egalik va mahalliy foydalanuvchi tasdig‘i</w:t>
             </w:r>
           </w:p>
         </w:tc>
@@ -4800,7 +4917,7 @@
                 <w:b w:val="0"/>
                 <w:sz w:val="22"/>
               </w:rPr>
-              <w:t>Tasvir sifati va tiriklikni tekshirish talabi</w:t>
+              <w:t>Origin, RP ID va autentifikator bog‘lanishi</w:t>
             </w:r>
           </w:p>
         </w:tc>
@@ -4826,7 +4943,7 @@
                 <w:b w:val="0"/>
                 <w:sz w:val="22"/>
               </w:rPr>
-              <w:t>Qurilma so‘rovi imzosi</w:t>
+              <w:t>Biometrik omilli tizim</w:t>
             </w:r>
           </w:p>
         </w:tc>
@@ -4847,7 +4964,7 @@
                 <w:b w:val="0"/>
                 <w:sz w:val="22"/>
               </w:rPr>
-              <w:t>Ro‘yxatdagi maxfiy kalitga egalik</w:t>
+              <w:t>Biometrik tekshiruv va mustaqil qo‘shimcha omil</w:t>
             </w:r>
           </w:p>
         </w:tc>
@@ -4868,7 +4985,7 @@
                 <w:b w:val="0"/>
                 <w:sz w:val="22"/>
               </w:rPr>
-              <w:t>Kalit o‘g‘irlanishi va mahalliy qurilma xavfsizligi</w:t>
+              <w:t>Tiriklik, FAR/FRR va namunani himoyalash</w:t>
             </w:r>
           </w:p>
         </w:tc>
@@ -4894,7 +5011,7 @@
                 <w:b w:val="0"/>
                 <w:sz w:val="22"/>
               </w:rPr>
-              <w:t>Telefon WebAuthn javobi</w:t>
+              <w:t>Telefon orqali tasdiqlash tizimi</w:t>
             </w:r>
           </w:p>
         </w:tc>
@@ -4915,7 +5032,7 @@
                 <w:b w:val="0"/>
                 <w:sz w:val="22"/>
               </w:rPr>
-              <w:t>Autentifikator kaliti va mahalliy tekshiruv</w:t>
+              <w:t>Ro‘yxatdagi autentifikator javobi va sessiya</w:t>
             </w:r>
           </w:p>
         </w:tc>
@@ -4936,7 +5053,7 @@
                 <w:b w:val="0"/>
                 <w:sz w:val="22"/>
               </w:rPr>
-              <w:t>Ro‘yxatga olish, origin va sessiyaga bog‘lash talabi</w:t>
+              <w:t>QR mustaqil omil emas, sessiya havolasi</w:t>
             </w:r>
           </w:p>
         </w:tc>
@@ -4962,7 +5079,7 @@
                 <w:b w:val="0"/>
                 <w:sz w:val="22"/>
               </w:rPr>
-              <w:t>QR havola</w:t>
+              <w:t>Markaziy server va agent</w:t>
             </w:r>
           </w:p>
         </w:tc>
@@ -4983,7 +5100,7 @@
                 <w:b w:val="0"/>
                 <w:sz w:val="22"/>
               </w:rPr>
-              <w:t>Sessiyaga o‘tish manzili</w:t>
+              <w:t>Siyosat asosida foydalanuvchi va qurilma tekshiruvi</w:t>
             </w:r>
           </w:p>
         </w:tc>
@@ -5004,7 +5121,7 @@
                 <w:b w:val="0"/>
                 <w:sz w:val="22"/>
               </w:rPr>
-              <w:t>Mustaqil shaxsni tasdiqlash dalili emas</w:t>
+              <w:t>Majburiy omillar, OS integratsiyasi va aloqa uzilishi</w:t>
             </w:r>
           </w:p>
         </w:tc>
@@ -6074,7 +6191,7 @@
           <w:b/>
           <w:sz w:val="28"/>
         </w:rPr>
-        <w:t>2.1-§. Tizim arxitekturasi, texnologiyalar va ma’lumotlar bazasini loyihalash</w:t>
+        <w:t>2.1-§. Ishlab chiqiluvchi tizim arxitekturasi</w:t>
       </w:r>
     </w:p>
     <w:p>
@@ -7699,7 +7816,37 @@
           <w:b/>
           <w:sz w:val="28"/>
         </w:rPr>
-        <w:t>2.2-§. Server, boshqaruv veb-interfeysi va Windows agentini ishlab chiqish</w:t>
+        <w:t>2.2-§. Tizimning dasturiy ta’minotini ishlab chiqish</w:t>
+      </w:r>
+    </w:p>
+    <w:p>
+      <w:pPr>
+        <w:spacing w:line="360" w:lineRule="auto" w:after="0" w:before="0"/>
+        <w:ind w:firstLine="709" w:right="0" w:left="0"/>
+        <w:jc w:val="both"/>
+      </w:pPr>
+      <w:r>
+        <w:rPr>
+          <w:rFonts w:ascii="Times New Roman" w:hAnsi="Times New Roman" w:eastAsia="Times New Roman"/>
+          <w:b w:val="0"/>
+          <w:sz w:val="28"/>
+        </w:rPr>
+        <w:t>Ushbu paragrafda server, boshqaruv veb-interfeysi va Windows agentining dasturiy tuzilishi yagona ishlash jarayoni sifatida yoritiladi. Biometrik tekshiruv, telefon orqali tasdiqlash, foydalanuvchi va qurilmalarni ro‘yxatga olish hamda kompaniyada foydalanish tartibi shu komponentlar bilan bog‘liq holda bayon etiladi. Tizim arxitekturasi 2.1-paragrafda, xavfsizlik va dasturiy sinovlarga tayangan baholash esa 2.3-paragrafda ko‘rib chiqiladi.</w:t>
+      </w:r>
+    </w:p>
+    <w:p>
+      <w:pPr>
+        <w:pStyle w:val="Heading3"/>
+        <w:ind w:right="0" w:left="0"/>
+        <w:jc w:val="both"/>
+      </w:pPr>
+      <w:r>
+        <w:rPr>
+          <w:rFonts w:ascii="Times New Roman" w:hAnsi="Times New Roman" w:eastAsia="Times New Roman"/>
+          <w:b/>
+          <w:sz w:val="28"/>
+        </w:rPr>
+        <w:t>Server, boshqaruv interfeysi va Windows agenti</w:t>
       </w:r>
     </w:p>
     <w:p>
@@ -8512,7 +8659,7 @@
     </w:p>
     <w:p>
       <w:pPr>
-        <w:pStyle w:val="Heading2"/>
+        <w:pStyle w:val="Heading3"/>
         <w:ind w:right="0" w:left="0"/>
         <w:jc w:val="both"/>
       </w:pPr>
@@ -8522,7 +8669,7 @@
           <w:b/>
           <w:sz w:val="28"/>
         </w:rPr>
-        <w:t>2.3-§. Biometrik tekshiruv, telefon orqali tasdiqlash va qurilmalarni ro‘yxatdan o‘tkazish jarayonlari</w:t>
+        <w:t>Biometrik tekshiruv va qurilmalarni ro‘yxatga olish</w:t>
       </w:r>
     </w:p>
     <w:p>
@@ -8718,7 +8865,7 @@
     </w:p>
     <w:p>
       <w:pPr>
-        <w:pStyle w:val="Heading2"/>
+        <w:pStyle w:val="Heading3"/>
         <w:ind w:right="0" w:left="0"/>
         <w:jc w:val="both"/>
       </w:pPr>
@@ -8728,7 +8875,1629 @@
           <w:b/>
           <w:sz w:val="28"/>
         </w:rPr>
-        <w:t>2.4-§. Tizim xavfsizligi, sinov natijalari va foydalanish yo‘riqnomasi</w:t>
+        <w:t>Tizimdan foydalanish tartibi</w:t>
+      </w:r>
+    </w:p>
+    <w:p>
+      <w:pPr>
+        <w:keepNext/>
+        <w:ind w:firstLine="0" w:right="0" w:left="0"/>
+        <w:jc w:val="center"/>
+      </w:pPr>
+      <w:r>
+        <w:drawing>
+          <wp:inline xmlns:a="http://schemas.openxmlformats.org/drawingml/2006/main" xmlns:pic="http://schemas.openxmlformats.org/drawingml/2006/picture">
+            <wp:extent cx="5400000" cy="3557833"/>
+            <wp:docPr id="5" name="Picture 5"/>
+            <wp:cNvGraphicFramePr>
+              <a:graphicFrameLocks noChangeAspect="1"/>
+            </wp:cNvGraphicFramePr>
+            <a:graphic>
+              <a:graphicData uri="http://schemas.openxmlformats.org/drawingml/2006/picture">
+                <pic:pic>
+                  <pic:nvPicPr>
+                    <pic:cNvPr id="0" name="login.png"/>
+                    <pic:cNvPicPr/>
+                  </pic:nvPicPr>
+                  <pic:blipFill>
+                    <a:blip r:embed="rId14"/>
+                    <a:stretch>
+                      <a:fillRect/>
+                    </a:stretch>
+                  </pic:blipFill>
+                  <pic:spPr>
+                    <a:xfrm>
+                      <a:off x="0" y="0"/>
+                      <a:ext cx="5400000" cy="3557833"/>
+                    </a:xfrm>
+                    <a:prstGeom prst="rect"/>
+                  </pic:spPr>
+                </pic:pic>
+              </a:graphicData>
+            </a:graphic>
+          </wp:inline>
+        </w:drawing>
+      </w:r>
+    </w:p>
+    <w:p>
+      <w:pPr>
+        <w:spacing w:line="252" w:lineRule="auto" w:after="200" w:before="0"/>
+        <w:ind w:firstLine="0" w:right="0" w:left="0"/>
+        <w:jc w:val="center"/>
+      </w:pPr>
+      <w:r>
+        <w:rPr>
+          <w:rFonts w:ascii="Times New Roman" w:hAnsi="Times New Roman" w:eastAsia="Times New Roman"/>
+          <w:b w:val="0"/>
+          <w:sz w:val="24"/>
+        </w:rPr>
+        <w:t>2.5-rasm. Mahalliy serverdagi administrator kirish oynasi</w:t>
+      </w:r>
+    </w:p>
+    <w:p>
+      <w:pPr>
+        <w:spacing w:line="360" w:lineRule="auto" w:after="0" w:before="0"/>
+        <w:ind w:firstLine="709" w:right="0" w:left="0"/>
+        <w:jc w:val="both"/>
+      </w:pPr>
+      <w:r>
+        <w:rPr>
+          <w:rFonts w:ascii="Times New Roman" w:hAnsi="Times New Roman" w:eastAsia="Times New Roman"/>
+          <w:b w:val="0"/>
+          <w:sz w:val="28"/>
+        </w:rPr>
+        <w:t>Foydalanishni boshlash uchun administrator avval server va veb-interfeysni tayyorlaydi. Python bog‘liqliklari req.text bo‘yicha o‘rnatiladi, manage.py migrate orqali baza holati yangilanadi. Frontendda npm ci va npm run build bajariladi. PUBLIC_SITE_URL foydalanuvchi ochadigan manzil bilan mos bo‘lishi kerak. Telefon bilan ishlashda telefon o‘zi ulana oladigan HTTPS manzil talab etiladi; uning localhost manzili ishchi kompyuterni ko‘rsatmaydi.</w:t>
+      </w:r>
+    </w:p>
+    <w:p>
+      <w:pPr>
+        <w:spacing w:line="360" w:lineRule="auto" w:after="0" w:before="0"/>
+        <w:ind w:firstLine="709" w:right="0" w:left="0"/>
+        <w:jc w:val="both"/>
+      </w:pPr>
+      <w:r>
+        <w:rPr>
+          <w:rFonts w:ascii="Times New Roman" w:hAnsi="Times New Roman" w:eastAsia="Times New Roman"/>
+          <w:b w:val="0"/>
+          <w:sz w:val="28"/>
+        </w:rPr>
+        <w:t>Tashkilot administratori kirgach, tegishli ish maydonini tanlaydi va foydalanuvchi hamda rollarni boshqaradi. Qurilmani ro‘yxatdan o‘tkazishda foydalanuvchi Scan this PC amalini boshlaydi, mos yordamchini oladi va uni ongli ravishda ishga tushiradi. Administrator ko‘rsatilgan hostname, platforma va identifikatorlarni haqiqiy kompyuter bilan solishtiradi. Tasdiqlashdan oldin qurilma kimga va qaysi joylashuvga tegishli ekani tekshiriladi.</w:t>
+      </w:r>
+    </w:p>
+    <w:p>
+      <w:pPr>
+        <w:spacing w:line="360" w:lineRule="auto" w:after="0" w:before="0"/>
+        <w:ind w:firstLine="709" w:right="0" w:left="0"/>
+        <w:jc w:val="both"/>
+      </w:pPr>
+      <w:r>
+        <w:rPr>
+          <w:rFonts w:ascii="Times New Roman" w:hAnsi="Times New Roman" w:eastAsia="Times New Roman"/>
+          <w:b w:val="0"/>
+          <w:sz w:val="28"/>
+        </w:rPr>
+        <w:t>Keyingi bosqichda mos Windows agenti olinadi va aktivatsiya boshlanadi. Tashkilot tokeni chat, ochiq hujjat yoki buyruq argumentiga yozilmaydi; o‘rnatishning tegishli kiritish oynasi ishlatiladi. Muvaffaqiyatsiz aktivatsiyada foydalanuvchi xato sababini ko‘rib, qayta urinadi yoki bekor qiladi. Kriptografik aktivatsiya muvaffaqiyatli tugagach, foydalanuvchi uchun biometrik namuna yoki telefon autentifikatori vakolatli oqim orqali ro‘yxatdan o‘tkaziladi.</w:t>
+      </w:r>
+    </w:p>
+    <w:p>
+      <w:pPr>
+        <w:keepNext/>
+        <w:ind w:firstLine="0" w:right="0" w:left="0"/>
+        <w:jc w:val="center"/>
+      </w:pPr>
+      <w:r>
+        <w:drawing>
+          <wp:inline xmlns:a="http://schemas.openxmlformats.org/drawingml/2006/main" xmlns:pic="http://schemas.openxmlformats.org/drawingml/2006/picture">
+            <wp:extent cx="5400000" cy="3557833"/>
+            <wp:docPr id="6" name="Picture 6"/>
+            <wp:cNvGraphicFramePr>
+              <a:graphicFrameLocks noChangeAspect="1"/>
+            </wp:cNvGraphicFramePr>
+            <a:graphic>
+              <a:graphicData uri="http://schemas.openxmlformats.org/drawingml/2006/picture">
+                <pic:pic>
+                  <pic:nvPicPr>
+                    <pic:cNvPr id="0" name="downloads.png"/>
+                    <pic:cNvPicPr/>
+                  </pic:nvPicPr>
+                  <pic:blipFill>
+                    <a:blip r:embed="rId15"/>
+                    <a:stretch>
+                      <a:fillRect/>
+                    </a:stretch>
+                  </pic:blipFill>
+                  <pic:spPr>
+                    <a:xfrm>
+                      <a:off x="0" y="0"/>
+                      <a:ext cx="5400000" cy="3557833"/>
+                    </a:xfrm>
+                    <a:prstGeom prst="rect"/>
+                  </pic:spPr>
+                </pic:pic>
+              </a:graphicData>
+            </a:graphic>
+          </wp:inline>
+        </w:drawing>
+      </w:r>
+    </w:p>
+    <w:p>
+      <w:pPr>
+        <w:spacing w:line="252" w:lineRule="auto" w:after="200" w:before="0"/>
+        <w:ind w:firstLine="0" w:right="0" w:left="0"/>
+        <w:jc w:val="center"/>
+      </w:pPr>
+      <w:r>
+        <w:rPr>
+          <w:rFonts w:ascii="Times New Roman" w:hAnsi="Times New Roman" w:eastAsia="Times New Roman"/>
+          <w:b w:val="0"/>
+          <w:sz w:val="24"/>
+        </w:rPr>
+        <w:t>2.6-rasm. Agent paketlari va platformalar holatini ko‘rsatuvchi yuklab olish sahifasi</w:t>
+      </w:r>
+    </w:p>
+    <w:p>
+      <w:pPr>
+        <w:spacing w:line="360" w:lineRule="auto" w:after="0" w:before="0"/>
+        <w:ind w:firstLine="709" w:right="0" w:left="0"/>
+        <w:jc w:val="both"/>
+      </w:pPr>
+      <w:r>
+        <w:rPr>
+          <w:rFonts w:ascii="Times New Roman" w:hAnsi="Times New Roman" w:eastAsia="Times New Roman"/>
+          <w:b w:val="0"/>
+          <w:sz w:val="28"/>
+        </w:rPr>
+        <w:t>Kirish tekshiruvida foydalanuvchi agentdagi tegishli usulni tanlaydi. Yuz usulida kamera ruxsati va yoritish tekshiriladi. Telefon usulida QR havola aynan shu kompyuter sessiyasiga tegishli ekaniga e’tibor beriladi va telefon autentifikatori bilan tasdiqlanadi. Tasdiqlash tugagach, natija server hamda auditda qayd etiladi. Xatoda yuz namunasi yoki telefon ro‘yxati darhol qayta yaratilib yuborilmasdan, avval sessiya, tarmoq va vakolat holati aniqlanadi.</w:t>
+      </w:r>
+    </w:p>
+    <w:p>
+      <w:pPr>
+        <w:spacing w:line="360" w:lineRule="auto" w:after="0" w:before="0"/>
+        <w:ind w:firstLine="709" w:right="0" w:left="0"/>
+        <w:jc w:val="both"/>
+      </w:pPr>
+      <w:r>
+        <w:rPr>
+          <w:rFonts w:ascii="Times New Roman" w:hAnsi="Times New Roman" w:eastAsia="Times New Roman"/>
+          <w:b w:val="0"/>
+          <w:sz w:val="28"/>
+        </w:rPr>
+        <w:t>Agentni olib tashlash ham nazorat qilinadigan jarayondir. Kompaniya administratori yoki shaxsiy hisob egasi muayyan qurilmaga bog‘langan qisqa muddatli kod chiqaradi. Joriy oqimda kod sertifikat avlodiga bog‘lanadi; boshlash amali uni atomik sarflaydi va oddiy qurilma autentifikatsiyasini bekor qiladi. Keyin fayllar va foydalanuvchi hisobidagi kalitlar tozalanadi, server esa yakunlangan holatni tasdiqlaydi. Uzilish yuz bersa tayyorlangan tiklash oqimi ishlatiladi. Bu jarayonning barcha UAC, qayta yuklash va bloklangan fayl holatlari Windows virtual mashinasida qo‘shimcha tekshirilishi kerak [13].</w:t>
+      </w:r>
+    </w:p>
+    <w:p>
+      <w:pPr>
+        <w:keepNext/>
+        <w:spacing w:line="252" w:lineRule="auto" w:after="80" w:before="160"/>
+        <w:ind w:firstLine="0" w:right="0" w:left="0"/>
+        <w:jc w:val="right"/>
+      </w:pPr>
+      <w:r>
+        <w:rPr>
+          <w:rFonts w:ascii="Times New Roman" w:hAnsi="Times New Roman" w:eastAsia="Times New Roman"/>
+          <w:b w:val="0"/>
+          <w:sz w:val="24"/>
+        </w:rPr>
+        <w:t>2.4-jadval. Foydalanishda yuz beradigan muammolar</w:t>
+      </w:r>
+    </w:p>
+    <w:tbl>
+      <w:tblPr>
+        <w:tblStyle w:val="TableGrid"/>
+        <w:tblW w:type="auto" w:w="0"/>
+        <w:tblLayout w:type="fixed"/>
+        <w:tblLook w:firstColumn="1" w:firstRow="1" w:lastColumn="0" w:lastRow="0" w:noHBand="0" w:noVBand="1" w:val="04A0"/>
+      </w:tblPr>
+      <w:tblGrid>
+        <w:gridCol w:w="3118"/>
+        <w:gridCol w:w="3118"/>
+        <w:gridCol w:w="3118"/>
+      </w:tblGrid>
+      <w:tr>
+        <w:trPr>
+          <w:tblHeader/>
+        </w:trPr>
+        <w:tc>
+          <w:tcPr>
+            <w:tcW w:type="dxa" w:w="3118"/>
+            <w:vAlign w:val="center"/>
+          </w:tcPr>
+          <w:p>
+            <w:pPr>
+              <w:spacing w:line="252" w:lineRule="auto" w:after="80" w:before="80"/>
+              <w:ind w:firstLine="0"/>
+            </w:pPr>
+            <w:r/>
+            <w:r>
+              <w:rPr>
+                <w:rFonts w:ascii="Times New Roman" w:hAnsi="Times New Roman" w:eastAsia="Times New Roman"/>
+                <w:b/>
+                <w:sz w:val="22"/>
+              </w:rPr>
+              <w:t>Kuzatilgan muammo</w:t>
+            </w:r>
+          </w:p>
+        </w:tc>
+        <w:tc>
+          <w:tcPr>
+            <w:tcW w:type="dxa" w:w="3118"/>
+            <w:vAlign w:val="center"/>
+          </w:tcPr>
+          <w:p>
+            <w:pPr>
+              <w:spacing w:line="252" w:lineRule="auto" w:after="80" w:before="80"/>
+              <w:ind w:firstLine="0"/>
+            </w:pPr>
+            <w:r/>
+            <w:r>
+              <w:rPr>
+                <w:rFonts w:ascii="Times New Roman" w:hAnsi="Times New Roman" w:eastAsia="Times New Roman"/>
+                <w:b/>
+                <w:sz w:val="22"/>
+              </w:rPr>
+              <w:t>Tekshiriladigan holat</w:t>
+            </w:r>
+          </w:p>
+        </w:tc>
+        <w:tc>
+          <w:tcPr>
+            <w:tcW w:type="dxa" w:w="3118"/>
+            <w:vAlign w:val="center"/>
+          </w:tcPr>
+          <w:p>
+            <w:pPr>
+              <w:spacing w:line="252" w:lineRule="auto" w:after="80" w:before="80"/>
+              <w:ind w:firstLine="0"/>
+            </w:pPr>
+            <w:r/>
+            <w:r>
+              <w:rPr>
+                <w:rFonts w:ascii="Times New Roman" w:hAnsi="Times New Roman" w:eastAsia="Times New Roman"/>
+                <w:b/>
+                <w:sz w:val="22"/>
+              </w:rPr>
+              <w:t>Amaliy harakat</w:t>
+            </w:r>
+          </w:p>
+        </w:tc>
+      </w:tr>
+      <w:tr>
+        <w:trPr>
+          <w:cantSplit/>
+        </w:trPr>
+        <w:tc>
+          <w:tcPr>
+            <w:tcW w:type="dxa" w:w="3118"/>
+            <w:vAlign w:val="center"/>
+          </w:tcPr>
+          <w:p>
+            <w:pPr>
+              <w:spacing w:line="252" w:lineRule="auto" w:after="80" w:before="80"/>
+              <w:ind w:firstLine="0"/>
+            </w:pPr>
+            <w:r/>
+            <w:r>
+              <w:rPr>
+                <w:rFonts w:ascii="Times New Roman" w:hAnsi="Times New Roman" w:eastAsia="Times New Roman"/>
+                <w:b w:val="0"/>
+                <w:sz w:val="22"/>
+              </w:rPr>
+              <w:t>QR telefon orqali ochilmaydi</w:t>
+            </w:r>
+          </w:p>
+        </w:tc>
+        <w:tc>
+          <w:tcPr>
+            <w:tcW w:type="dxa" w:w="3118"/>
+            <w:vAlign w:val="center"/>
+          </w:tcPr>
+          <w:p>
+            <w:pPr>
+              <w:spacing w:line="252" w:lineRule="auto" w:after="80" w:before="80"/>
+              <w:ind w:firstLine="0"/>
+            </w:pPr>
+            <w:r/>
+            <w:r>
+              <w:rPr>
+                <w:rFonts w:ascii="Times New Roman" w:hAnsi="Times New Roman" w:eastAsia="Times New Roman"/>
+                <w:b w:val="0"/>
+                <w:sz w:val="22"/>
+              </w:rPr>
+              <w:t>PUBLIC_SITE_URL va telefon tarmoq kirishi</w:t>
+            </w:r>
+          </w:p>
+        </w:tc>
+        <w:tc>
+          <w:tcPr>
+            <w:tcW w:type="dxa" w:w="3118"/>
+            <w:vAlign w:val="center"/>
+          </w:tcPr>
+          <w:p>
+            <w:pPr>
+              <w:spacing w:line="252" w:lineRule="auto" w:after="80" w:before="80"/>
+              <w:ind w:firstLine="0"/>
+            </w:pPr>
+            <w:r/>
+            <w:r>
+              <w:rPr>
+                <w:rFonts w:ascii="Times New Roman" w:hAnsi="Times New Roman" w:eastAsia="Times New Roman"/>
+                <w:b w:val="0"/>
+                <w:sz w:val="22"/>
+              </w:rPr>
+              <w:t>Telefon erisha oladigan HTTPS origin tanlash</w:t>
+            </w:r>
+          </w:p>
+        </w:tc>
+      </w:tr>
+      <w:tr>
+        <w:trPr>
+          <w:cantSplit/>
+        </w:trPr>
+        <w:tc>
+          <w:tcPr>
+            <w:tcW w:type="dxa" w:w="3118"/>
+            <w:vAlign w:val="center"/>
+          </w:tcPr>
+          <w:p>
+            <w:pPr>
+              <w:spacing w:line="252" w:lineRule="auto" w:after="80" w:before="80"/>
+              <w:ind w:firstLine="0"/>
+            </w:pPr>
+            <w:r/>
+            <w:r>
+              <w:rPr>
+                <w:rFonts w:ascii="Times New Roman" w:hAnsi="Times New Roman" w:eastAsia="Times New Roman"/>
+                <w:b w:val="0"/>
+                <w:sz w:val="22"/>
+              </w:rPr>
+              <w:t>Agent so‘rovi rad etiladi</w:t>
+            </w:r>
+          </w:p>
+        </w:tc>
+        <w:tc>
+          <w:tcPr>
+            <w:tcW w:type="dxa" w:w="3118"/>
+            <w:vAlign w:val="center"/>
+          </w:tcPr>
+          <w:p>
+            <w:pPr>
+              <w:spacing w:line="252" w:lineRule="auto" w:after="80" w:before="80"/>
+              <w:ind w:firstLine="0"/>
+            </w:pPr>
+            <w:r/>
+            <w:r>
+              <w:rPr>
+                <w:rFonts w:ascii="Times New Roman" w:hAnsi="Times New Roman" w:eastAsia="Times New Roman"/>
+                <w:b w:val="0"/>
+                <w:sz w:val="22"/>
+              </w:rPr>
+              <w:t>Sertifikat, faol qurilma, vaqt va nonce</w:t>
+            </w:r>
+          </w:p>
+        </w:tc>
+        <w:tc>
+          <w:tcPr>
+            <w:tcW w:type="dxa" w:w="3118"/>
+            <w:vAlign w:val="center"/>
+          </w:tcPr>
+          <w:p>
+            <w:pPr>
+              <w:spacing w:line="252" w:lineRule="auto" w:after="80" w:before="80"/>
+              <w:ind w:firstLine="0"/>
+            </w:pPr>
+            <w:r/>
+            <w:r>
+              <w:rPr>
+                <w:rFonts w:ascii="Times New Roman" w:hAnsi="Times New Roman" w:eastAsia="Times New Roman"/>
+                <w:b w:val="0"/>
+                <w:sz w:val="22"/>
+              </w:rPr>
+              <w:t>Sababni auditdan aniqlash; TLS yoki imzoni o‘chirmaslik</w:t>
+            </w:r>
+          </w:p>
+        </w:tc>
+      </w:tr>
+      <w:tr>
+        <w:trPr>
+          <w:cantSplit/>
+        </w:trPr>
+        <w:tc>
+          <w:tcPr>
+            <w:tcW w:type="dxa" w:w="3118"/>
+            <w:vAlign w:val="center"/>
+          </w:tcPr>
+          <w:p>
+            <w:pPr>
+              <w:spacing w:line="252" w:lineRule="auto" w:after="80" w:before="80"/>
+              <w:ind w:firstLine="0"/>
+            </w:pPr>
+            <w:r/>
+            <w:r>
+              <w:rPr>
+                <w:rFonts w:ascii="Times New Roman" w:hAnsi="Times New Roman" w:eastAsia="Times New Roman"/>
+                <w:b w:val="0"/>
+                <w:sz w:val="22"/>
+              </w:rPr>
+              <w:t>Yuz topilmadi yoki mos emas</w:t>
+            </w:r>
+          </w:p>
+        </w:tc>
+        <w:tc>
+          <w:tcPr>
+            <w:tcW w:type="dxa" w:w="3118"/>
+            <w:vAlign w:val="center"/>
+          </w:tcPr>
+          <w:p>
+            <w:pPr>
+              <w:spacing w:line="252" w:lineRule="auto" w:after="80" w:before="80"/>
+              <w:ind w:firstLine="0"/>
+            </w:pPr>
+            <w:r/>
+            <w:r>
+              <w:rPr>
+                <w:rFonts w:ascii="Times New Roman" w:hAnsi="Times New Roman" w:eastAsia="Times New Roman"/>
+                <w:b w:val="0"/>
+                <w:sz w:val="22"/>
+              </w:rPr>
+              <w:t>Kamera, yoritish, namuna va sessiya</w:t>
+            </w:r>
+          </w:p>
+        </w:tc>
+        <w:tc>
+          <w:tcPr>
+            <w:tcW w:type="dxa" w:w="3118"/>
+            <w:vAlign w:val="center"/>
+          </w:tcPr>
+          <w:p>
+            <w:pPr>
+              <w:spacing w:line="252" w:lineRule="auto" w:after="80" w:before="80"/>
+              <w:ind w:firstLine="0"/>
+            </w:pPr>
+            <w:r/>
+            <w:r>
+              <w:rPr>
+                <w:rFonts w:ascii="Times New Roman" w:hAnsi="Times New Roman" w:eastAsia="Times New Roman"/>
+                <w:b w:val="0"/>
+                <w:sz w:val="22"/>
+              </w:rPr>
+              <w:t>Sifatni tekshirish; chegarani asossiz yumshatmaslik</w:t>
+            </w:r>
+          </w:p>
+        </w:tc>
+      </w:tr>
+      <w:tr>
+        <w:trPr>
+          <w:cantSplit/>
+        </w:trPr>
+        <w:tc>
+          <w:tcPr>
+            <w:tcW w:type="dxa" w:w="3118"/>
+            <w:vAlign w:val="center"/>
+          </w:tcPr>
+          <w:p>
+            <w:pPr>
+              <w:spacing w:line="252" w:lineRule="auto" w:after="80" w:before="80"/>
+              <w:ind w:firstLine="0"/>
+            </w:pPr>
+            <w:r/>
+            <w:r>
+              <w:rPr>
+                <w:rFonts w:ascii="Times New Roman" w:hAnsi="Times New Roman" w:eastAsia="Times New Roman"/>
+                <w:b w:val="0"/>
+                <w:sz w:val="22"/>
+              </w:rPr>
+              <w:t>WebAuthn javobi rad etildi</w:t>
+            </w:r>
+          </w:p>
+        </w:tc>
+        <w:tc>
+          <w:tcPr>
+            <w:tcW w:type="dxa" w:w="3118"/>
+            <w:vAlign w:val="center"/>
+          </w:tcPr>
+          <w:p>
+            <w:pPr>
+              <w:spacing w:line="252" w:lineRule="auto" w:after="80" w:before="80"/>
+              <w:ind w:firstLine="0"/>
+            </w:pPr>
+            <w:r/>
+            <w:r>
+              <w:rPr>
+                <w:rFonts w:ascii="Times New Roman" w:hAnsi="Times New Roman" w:eastAsia="Times New Roman"/>
+                <w:b w:val="0"/>
+                <w:sz w:val="22"/>
+              </w:rPr>
+              <w:t>Origin, RP ID, challenge va ro‘yxatdagi credential</w:t>
+            </w:r>
+          </w:p>
+        </w:tc>
+        <w:tc>
+          <w:tcPr>
+            <w:tcW w:type="dxa" w:w="3118"/>
+            <w:vAlign w:val="center"/>
+          </w:tcPr>
+          <w:p>
+            <w:pPr>
+              <w:spacing w:line="252" w:lineRule="auto" w:after="80" w:before="80"/>
+              <w:ind w:firstLine="0"/>
+            </w:pPr>
+            <w:r/>
+            <w:r>
+              <w:rPr>
+                <w:rFonts w:ascii="Times New Roman" w:hAnsi="Times New Roman" w:eastAsia="Times New Roman"/>
+                <w:b w:val="0"/>
+                <w:sz w:val="22"/>
+              </w:rPr>
+              <w:t>Ro‘yxatdan o‘tish hamda joriy sessiya mosligini tekshirish</w:t>
+            </w:r>
+          </w:p>
+        </w:tc>
+      </w:tr>
+      <w:tr>
+        <w:trPr>
+          <w:cantSplit/>
+        </w:trPr>
+        <w:tc>
+          <w:tcPr>
+            <w:tcW w:type="dxa" w:w="3118"/>
+            <w:vAlign w:val="center"/>
+          </w:tcPr>
+          <w:p>
+            <w:pPr>
+              <w:spacing w:line="252" w:lineRule="auto" w:after="80" w:before="80"/>
+              <w:ind w:firstLine="0"/>
+            </w:pPr>
+            <w:r/>
+            <w:r>
+              <w:rPr>
+                <w:rFonts w:ascii="Times New Roman" w:hAnsi="Times New Roman" w:eastAsia="Times New Roman"/>
+                <w:b w:val="0"/>
+                <w:sz w:val="22"/>
+              </w:rPr>
+              <w:t>Olib tashlash uzildi</w:t>
+            </w:r>
+          </w:p>
+        </w:tc>
+        <w:tc>
+          <w:tcPr>
+            <w:tcW w:type="dxa" w:w="3118"/>
+            <w:vAlign w:val="center"/>
+          </w:tcPr>
+          <w:p>
+            <w:pPr>
+              <w:spacing w:line="252" w:lineRule="auto" w:after="80" w:before="80"/>
+              <w:ind w:firstLine="0"/>
+            </w:pPr>
+            <w:r/>
+            <w:r>
+              <w:rPr>
+                <w:rFonts w:ascii="Times New Roman" w:hAnsi="Times New Roman" w:eastAsia="Times New Roman"/>
+                <w:b w:val="0"/>
+                <w:sz w:val="22"/>
+              </w:rPr>
+              <w:t>Server removal holati va asl foydalanuvchi konteksti</w:t>
+            </w:r>
+          </w:p>
+        </w:tc>
+        <w:tc>
+          <w:tcPr>
+            <w:tcW w:type="dxa" w:w="3118"/>
+            <w:vAlign w:val="center"/>
+          </w:tcPr>
+          <w:p>
+            <w:pPr>
+              <w:spacing w:line="252" w:lineRule="auto" w:after="80" w:before="80"/>
+              <w:ind w:firstLine="0"/>
+            </w:pPr>
+            <w:r/>
+            <w:r>
+              <w:rPr>
+                <w:rFonts w:ascii="Times New Roman" w:hAnsi="Times New Roman" w:eastAsia="Times New Roman"/>
+                <w:b w:val="0"/>
+                <w:sz w:val="22"/>
+              </w:rPr>
+              <w:t>Hujjatlangan resume/retry oqimidan foydalanish</w:t>
+            </w:r>
+          </w:p>
+        </w:tc>
+      </w:tr>
+    </w:tbl>
+    <w:p>
+      <w:pPr>
+        <w:spacing w:line="240" w:lineRule="auto" w:after="0" w:before="0"/>
+        <w:ind w:firstLine="0" w:right="0" w:left="0"/>
+        <w:jc w:val="both"/>
+      </w:pPr>
+      <w:r>
+        <w:rPr>
+          <w:rFonts w:ascii="Times New Roman" w:hAnsi="Times New Roman" w:eastAsia="Times New Roman"/>
+          <w:b w:val="0"/>
+          <w:sz w:val="8"/>
+        </w:rPr>
+      </w:r>
+    </w:p>
+    <w:p>
+      <w:pPr>
+        <w:pStyle w:val="Heading3"/>
+        <w:ind w:right="0" w:left="0"/>
+        <w:jc w:val="both"/>
+      </w:pPr>
+      <w:r>
+        <w:rPr>
+          <w:rFonts w:ascii="Times New Roman" w:hAnsi="Times New Roman" w:eastAsia="Times New Roman"/>
+          <w:b/>
+          <w:sz w:val="28"/>
+        </w:rPr>
+        <w:t>Kompaniyaning ko‘p kompyuterli muhitida ishlash modeli</w:t>
+      </w:r>
+    </w:p>
+    <w:p>
+      <w:pPr>
+        <w:spacing w:line="360" w:lineRule="auto" w:after="0" w:before="0"/>
+        <w:ind w:firstLine="709" w:right="0" w:left="0"/>
+        <w:jc w:val="both"/>
+      </w:pPr>
+      <w:r>
+        <w:rPr>
+          <w:rFonts w:ascii="Times New Roman" w:hAnsi="Times New Roman" w:eastAsia="Times New Roman"/>
+          <w:b w:val="0"/>
+          <w:sz w:val="28"/>
+        </w:rPr>
+        <w:t>Tizimning asosiy qo‘llanish sohasi bir kompaniyaga tegishli ko‘plab ishchi kompyuterlarni yagona markazdan hisobga olish va ulardagi autentifikatsiya jarayonlarini boshqarishdir. Bitta PC uchun dastur o‘rnatish bu vazifaning faqat boshlang‘ich qismidir. Kompaniya miqyosida qaysi qurilma qaysi tashkilotga tegishli ekani, uni kim ro‘yxatga olgani, qaysi foydalanuvchi sessiyasi tekshirilgani va oxirgi aloqa qachon bo‘lgani aniqlanishi kerak. Shaxsiy hisob oqimi mavjud bo‘lsa-da, mazkur ishning asosiy amaliy ssenariysi kompaniya kompyuterlari parkidir.</w:t>
+      </w:r>
+    </w:p>
+    <w:p>
+      <w:pPr>
+        <w:spacing w:line="360" w:lineRule="auto" w:after="0" w:before="0"/>
+        <w:ind w:firstLine="709" w:right="0" w:left="0"/>
+        <w:jc w:val="both"/>
+      </w:pPr>
+      <w:r>
+        <w:rPr>
+          <w:rFonts w:ascii="Times New Roman" w:hAnsi="Times New Roman" w:eastAsia="Times New Roman"/>
+          <w:b w:val="0"/>
+          <w:sz w:val="28"/>
+        </w:rPr>
+        <w:t>Kompaniyaning ishchi kompyuterlari turli bo‘lim, filial yoki lokal tarmoqlarda joylashishi mumkin. Bunda agent va markaziy server o‘rtasidagi aloqa uchun kompyuterlarning bitta lokal broadcast domenida bo‘lishi shart emas. Har bir agent sozlangan server manziliga murojaat qiladi. Lekin bu imkoniyat serverga yo‘l mavjudligini avtomatik ta’minlamaydi: DNS, HTTPS chiqish ruxsati, reverse proxy, sertifikat zanjiri va vaqt sinxronligi korporativ infratuzilmada alohida tayyorlanadi. Quyidagi sxema loyihaviy joylashuvni ko‘rsatadi; bir nechta haqiqiy filial tarmog‘idagi yuklama tajribasi bajarilgan deb talqin qilinmaydi.</w:t>
+      </w:r>
+    </w:p>
+    <w:p>
+      <w:pPr>
+        <w:keepNext/>
+        <w:ind w:firstLine="0" w:right="0" w:left="0"/>
+        <w:jc w:val="center"/>
+      </w:pPr>
+      <w:r>
+        <w:drawing>
+          <wp:inline xmlns:a="http://schemas.openxmlformats.org/drawingml/2006/main" xmlns:pic="http://schemas.openxmlformats.org/drawingml/2006/picture">
+            <wp:extent cx="5400000" cy="2469561"/>
+            <wp:docPr id="7" name="Picture 7"/>
+            <wp:cNvGraphicFramePr>
+              <a:graphicFrameLocks noChangeAspect="1"/>
+            </wp:cNvGraphicFramePr>
+            <a:graphic>
+              <a:graphicData uri="http://schemas.openxmlformats.org/drawingml/2006/picture">
+                <pic:pic>
+                  <pic:nvPicPr>
+                    <pic:cNvPr id="0" name="company_network.png"/>
+                    <pic:cNvPicPr/>
+                  </pic:nvPicPr>
+                  <pic:blipFill>
+                    <a:blip r:embed="rId16"/>
+                    <a:stretch>
+                      <a:fillRect/>
+                    </a:stretch>
+                  </pic:blipFill>
+                  <pic:spPr>
+                    <a:xfrm>
+                      <a:off x="0" y="0"/>
+                      <a:ext cx="5400000" cy="2469561"/>
+                    </a:xfrm>
+                    <a:prstGeom prst="rect"/>
+                  </pic:spPr>
+                </pic:pic>
+              </a:graphicData>
+            </a:graphic>
+          </wp:inline>
+        </w:drawing>
+      </w:r>
+    </w:p>
+    <w:p>
+      <w:pPr>
+        <w:spacing w:line="252" w:lineRule="auto" w:after="200" w:before="0"/>
+        <w:ind w:firstLine="0" w:right="0" w:left="0"/>
+        <w:jc w:val="center"/>
+      </w:pPr>
+      <w:r>
+        <w:rPr>
+          <w:rFonts w:ascii="Times New Roman" w:hAnsi="Times New Roman" w:eastAsia="Times New Roman"/>
+          <w:b w:val="0"/>
+          <w:sz w:val="24"/>
+        </w:rPr>
+        <w:t>2.7-rasm. Turli tarmoqlardagi kompaniya PC’larining markaziy serverga ulanish modeli</w:t>
+      </w:r>
+    </w:p>
+    <w:p>
+      <w:pPr>
+        <w:spacing w:line="360" w:lineRule="auto" w:after="0" w:before="0"/>
+        <w:ind w:firstLine="709" w:right="0" w:left="0"/>
+        <w:jc w:val="both"/>
+      </w:pPr>
+      <w:r>
+        <w:rPr>
+          <w:rFonts w:ascii="Times New Roman" w:hAnsi="Times New Roman" w:eastAsia="Times New Roman"/>
+          <w:b w:val="0"/>
+          <w:sz w:val="28"/>
+        </w:rPr>
+        <w:t>Serverning tashkilot bo‘yicha ajratishi tarmoqni VLAN yoki firewall bilan segmentlashning o‘rnini bosmaydi. Bir tarmoqdagi begona qurilma boshqa tashkilot nomidan autentifikatsiyalana olmasligi uchun har bir server so‘rovida tashkilot va qurilma holati tekshiriladi. Aksincha, bir kompaniyaning boshqa filialidagi vakolatli agent faqat uning IP-manzili boshqacha bo‘lgani uchun yangi shaxs deb olinmaydi: identifikatsiyada ro‘yxatdagi kriptografik kalit va server yozuvi ustuvor bo‘ladi. IP-manzil audit konteksti bo‘lib xizmat qiladi.</w:t>
+      </w:r>
+    </w:p>
+    <w:p>
+      <w:pPr>
+        <w:spacing w:line="360" w:lineRule="auto" w:after="0" w:before="0"/>
+        <w:ind w:firstLine="709" w:right="0" w:left="0"/>
+        <w:jc w:val="both"/>
+      </w:pPr>
+      <w:r>
+        <w:rPr>
+          <w:rFonts w:ascii="Times New Roman" w:hAnsi="Times New Roman" w:eastAsia="Times New Roman"/>
+          <w:b w:val="0"/>
+          <w:sz w:val="28"/>
+        </w:rPr>
+        <w:t>Joriy modelda alohida Filial yoki TarmoqSegmenti obyekti mavjud emas. Qurilma joylashuvi Device.location maydoni orqali tavsiflanadi. Shuning uchun hujjatda to‘liq filiallar iyerarxiyasi yoki avtomatik tarmoq topologiyasi boshqaruvi amalga oshirilgan deb ko‘rsatilmaydi. Bunday imkoniyat kerak bo‘lsa, filial modeli, unga tayinlangan administratorlar va obyektlararo ruxsatlar alohida ishlab chiqiladi. Hozirgi versiyada tashkilot chegarasi va qurilma joylashuvi asosiy hisobga olish vositalaridir.</w:t>
+      </w:r>
+    </w:p>
+    <w:p>
+      <w:pPr>
+        <w:spacing w:line="360" w:lineRule="auto" w:after="0" w:before="0"/>
+        <w:ind w:firstLine="709" w:right="0" w:left="0"/>
+        <w:jc w:val="both"/>
+      </w:pPr>
+      <w:r>
+        <w:rPr>
+          <w:rFonts w:ascii="Times New Roman" w:hAnsi="Times New Roman" w:eastAsia="Times New Roman"/>
+          <w:b w:val="0"/>
+          <w:sz w:val="28"/>
+        </w:rPr>
+        <w:t>Xodim va PC o‘rtasidagi bog‘lanish ham aniq talqin qilinadi. Users tashkilotga hamda rolga, Device esa tashkilotga bog‘langan; AgentSession esa muayyan tekshiruvda foydalanuvchi va qurilmani birlashtiradi. Device modelida har bir PC uchun doimiy yagona xodim egasi maydoni yo‘q. Shu sababli tizim bir xodim bir PC bilan abadiy bog‘langan degan taxminga tayangan holda tavsiflanmaydi. Umumiy foydalaniladigan kompyuterlarda aynan joriy sessiyadagi foydalanuvchi muhimdir.</w:t>
+      </w:r>
+    </w:p>
+    <w:p>
+      <w:pPr>
+        <w:pStyle w:val="Heading3"/>
+        <w:ind w:right="0" w:left="0"/>
+        <w:jc w:val="both"/>
+      </w:pPr>
+      <w:r>
+        <w:rPr>
+          <w:rFonts w:ascii="Times New Roman" w:hAnsi="Times New Roman" w:eastAsia="Times New Roman"/>
+          <w:b/>
+          <w:sz w:val="28"/>
+        </w:rPr>
+        <w:t>Kompaniya PC’sini dastlabki ro‘yxatdan o‘tkazish</w:t>
+      </w:r>
+    </w:p>
+    <w:p>
+      <w:pPr>
+        <w:spacing w:line="360" w:lineRule="auto" w:after="0" w:before="0"/>
+        <w:ind w:firstLine="709" w:right="0" w:left="0"/>
+        <w:jc w:val="both"/>
+      </w:pPr>
+      <w:r>
+        <w:rPr>
+          <w:rFonts w:ascii="Times New Roman" w:hAnsi="Times New Roman" w:eastAsia="Times New Roman"/>
+          <w:b w:val="0"/>
+          <w:sz w:val="28"/>
+        </w:rPr>
+        <w:t>Quyidagi ekranlar ishlayotgan mahalliy serverdan olingan. Ko‘rsatish uchun vaqtinchalik Namuna kompaniya (diplom), NAMUNA-OFFICE-PC01 va DEMO-PC-001 yozuvlari ishlatilgan. Apparat identifikatorlari namuna sifatida kiritilgan; ushbu suratlar Go yordamchisi haqiqiy Windows qurilmasida ishga tushirilganining dalili emas. Administrator tasdig‘i esa haqiqiy server endpointlari orqali bajarilgan. Tasvirga olish tugagach, namunaviy yozuvlar va sessiyalar o‘chirilib, rasmdagi QR hamda tasdiqlash kodi amaldan chiqarilgan.</w:t>
+      </w:r>
+    </w:p>
+    <w:p>
+      <w:pPr>
+        <w:spacing w:line="360" w:lineRule="auto" w:after="0" w:before="0"/>
+        <w:ind w:firstLine="709" w:right="0" w:left="0"/>
+        <w:jc w:val="both"/>
+      </w:pPr>
+      <w:r>
+        <w:rPr>
+          <w:rFonts w:ascii="Times New Roman" w:hAnsi="Times New Roman" w:eastAsia="Times New Roman"/>
+          <w:b w:val="0"/>
+          <w:sz w:val="28"/>
+        </w:rPr>
+        <w:t>Birinchi bosqichda xodim ulanadigan PC brauzerida /device/scan sahifasini ochadi. Sahifa bu amal qaysi kompyuterda bajarilishi kerakligini tushuntiradi. Yangi ulanishni boshlash tugmasi serverda qisqa muddatli sessiya yaratadi. Kompaniyada bir nechta PC bir vaqtning o‘zida tayyorlanayotgan bo‘lsa, har bir kompyuter o‘z sessiyasini boshlaydi; bir PC uchun yaratilgan paket yoki havola boshqasiga ko‘chirib ishlatilmaydi.</w:t>
+      </w:r>
+    </w:p>
+    <w:p>
+      <w:pPr>
+        <w:keepNext/>
+        <w:ind w:firstLine="0" w:right="0" w:left="0"/>
+        <w:jc w:val="center"/>
+      </w:pPr>
+      <w:r>
+        <w:drawing>
+          <wp:inline xmlns:a="http://schemas.openxmlformats.org/drawingml/2006/main" xmlns:pic="http://schemas.openxmlformats.org/drawingml/2006/picture">
+            <wp:extent cx="5400000" cy="2824615"/>
+            <wp:docPr id="8" name="Picture 8"/>
+            <wp:cNvGraphicFramePr>
+              <a:graphicFrameLocks noChangeAspect="1"/>
+            </wp:cNvGraphicFramePr>
+            <a:graphic>
+              <a:graphicData uri="http://schemas.openxmlformats.org/drawingml/2006/picture">
+                <pic:pic>
+                  <pic:nvPicPr>
+                    <pic:cNvPr id="0" name="company_pc_start.png"/>
+                    <pic:cNvPicPr/>
+                  </pic:nvPicPr>
+                  <pic:blipFill>
+                    <a:blip r:embed="rId17"/>
+                    <a:stretch>
+                      <a:fillRect/>
+                    </a:stretch>
+                  </pic:blipFill>
+                  <pic:spPr>
+                    <a:xfrm>
+                      <a:off x="0" y="0"/>
+                      <a:ext cx="5400000" cy="2824615"/>
+                    </a:xfrm>
+                    <a:prstGeom prst="rect"/>
+                  </pic:spPr>
+                </pic:pic>
+              </a:graphicData>
+            </a:graphic>
+          </wp:inline>
+        </w:drawing>
+      </w:r>
+    </w:p>
+    <w:p>
+      <w:pPr>
+        <w:spacing w:line="252" w:lineRule="auto" w:after="200" w:before="0"/>
+        <w:ind w:firstLine="0" w:right="0" w:left="0"/>
+        <w:jc w:val="center"/>
+      </w:pPr>
+      <w:r>
+        <w:rPr>
+          <w:rFonts w:ascii="Times New Roman" w:hAnsi="Times New Roman" w:eastAsia="Times New Roman"/>
+          <w:b w:val="0"/>
+          <w:sz w:val="24"/>
+        </w:rPr>
+        <w:t>2.8-rasm. Kompaniya PC’sida yangi ulanishni boshlash sahifasi</w:t>
+      </w:r>
+    </w:p>
+    <w:p>
+      <w:pPr>
+        <w:spacing w:line="360" w:lineRule="auto" w:after="0" w:before="0"/>
+        <w:ind w:firstLine="709" w:right="0" w:left="0"/>
+        <w:jc w:val="both"/>
+      </w:pPr>
+      <w:r>
+        <w:rPr>
+          <w:rFonts w:ascii="Times New Roman" w:hAnsi="Times New Roman" w:eastAsia="Times New Roman"/>
+          <w:b w:val="0"/>
+          <w:sz w:val="28"/>
+        </w:rPr>
+        <w:t>Ikkinchi bosqichda operatsion tizim va arxitektura tanlanadi. Masalan, Windows hamda Intel / AMD (x64) tanlovlari shu platforma uchun yordamchi paketni olishga xizmat qiladi. Ushbu paket asosiy agent o‘rnatuvchisi emas. Yordamchining vazifasi joriy PC identifikatorlarini ro‘yxat sessiyasiga yuborishdir. Asosiy agent esa keyinchalik kalit va sertifikat bilan doimiy ishlaydigan komponent sifatida alohida o‘rnatiladi.</w:t>
+      </w:r>
+    </w:p>
+    <w:p>
+      <w:pPr>
+        <w:keepNext/>
+        <w:ind w:firstLine="0" w:right="0" w:left="0"/>
+        <w:jc w:val="center"/>
+      </w:pPr>
+      <w:r>
+        <w:drawing>
+          <wp:inline xmlns:a="http://schemas.openxmlformats.org/drawingml/2006/main" xmlns:pic="http://schemas.openxmlformats.org/drawingml/2006/picture">
+            <wp:extent cx="5400000" cy="4037538"/>
+            <wp:docPr id="9" name="Picture 9"/>
+            <wp:cNvGraphicFramePr>
+              <a:graphicFrameLocks noChangeAspect="1"/>
+            </wp:cNvGraphicFramePr>
+            <a:graphic>
+              <a:graphicData uri="http://schemas.openxmlformats.org/drawingml/2006/picture">
+                <pic:pic>
+                  <pic:nvPicPr>
+                    <pic:cNvPr id="0" name="company_pc_helper.png"/>
+                    <pic:cNvPicPr/>
+                  </pic:nvPicPr>
+                  <pic:blipFill>
+                    <a:blip r:embed="rId18"/>
+                    <a:stretch>
+                      <a:fillRect/>
+                    </a:stretch>
+                  </pic:blipFill>
+                  <pic:spPr>
+                    <a:xfrm>
+                      <a:off x="0" y="0"/>
+                      <a:ext cx="5400000" cy="4037538"/>
+                    </a:xfrm>
+                    <a:prstGeom prst="rect"/>
+                  </pic:spPr>
+                </pic:pic>
+              </a:graphicData>
+            </a:graphic>
+          </wp:inline>
+        </w:drawing>
+      </w:r>
+    </w:p>
+    <w:p>
+      <w:pPr>
+        <w:spacing w:line="252" w:lineRule="auto" w:after="200" w:before="0"/>
+        <w:ind w:firstLine="0" w:right="0" w:left="0"/>
+        <w:jc w:val="center"/>
+      </w:pPr>
+      <w:r>
+        <w:rPr>
+          <w:rFonts w:ascii="Times New Roman" w:hAnsi="Times New Roman" w:eastAsia="Times New Roman"/>
+          <w:b w:val="0"/>
+          <w:sz w:val="24"/>
+        </w:rPr>
+        <w:t>2.9-rasm. PC uchun platforma va yordamchi paketni tanlash</w:t>
+      </w:r>
+    </w:p>
+    <w:p>
+      <w:pPr>
+        <w:spacing w:line="360" w:lineRule="auto" w:after="0" w:before="0"/>
+        <w:ind w:firstLine="709" w:right="0" w:left="0"/>
+        <w:jc w:val="both"/>
+      </w:pPr>
+      <w:r>
+        <w:rPr>
+          <w:rFonts w:ascii="Times New Roman" w:hAnsi="Times New Roman" w:eastAsia="Times New Roman"/>
+          <w:b w:val="0"/>
+          <w:sz w:val="28"/>
+        </w:rPr>
+        <w:t>Uchinchi bosqichda yordamchi yuborgan identifikatorlar sessiyaga bir martalik scan token orqali qabul qilinadi. Server asosiy identifikator va device_id qiymatining mosligini tekshiradi. Shundan keyin PC ekranida QR-kod hamda solishtirish kodi ko‘rinadi. Qurilma hali faol agent sifatida ishlamaydi. Bu holat faqat administrator tekshirishi uchun ma’lumotlar tayyor bo‘lganini anglatadi.</w:t>
+      </w:r>
+    </w:p>
+    <w:p>
+      <w:pPr>
+        <w:keepNext/>
+        <w:ind w:firstLine="0" w:right="0" w:left="0"/>
+        <w:jc w:val="center"/>
+      </w:pPr>
+      <w:r>
+        <w:drawing>
+          <wp:inline xmlns:a="http://schemas.openxmlformats.org/drawingml/2006/main" xmlns:pic="http://schemas.openxmlformats.org/drawingml/2006/picture">
+            <wp:extent cx="3460750" cy="4679999"/>
+            <wp:docPr id="10" name="Picture 10"/>
+            <wp:cNvGraphicFramePr>
+              <a:graphicFrameLocks noChangeAspect="1"/>
+            </wp:cNvGraphicFramePr>
+            <a:graphic>
+              <a:graphicData uri="http://schemas.openxmlformats.org/drawingml/2006/picture">
+                <pic:pic>
+                  <pic:nvPicPr>
+                    <pic:cNvPr id="0" name="company_pc_qr.png"/>
+                    <pic:cNvPicPr/>
+                  </pic:nvPicPr>
+                  <pic:blipFill>
+                    <a:blip r:embed="rId19"/>
+                    <a:stretch>
+                      <a:fillRect/>
+                    </a:stretch>
+                  </pic:blipFill>
+                  <pic:spPr>
+                    <a:xfrm>
+                      <a:off x="0" y="0"/>
+                      <a:ext cx="3460750" cy="4679999"/>
+                    </a:xfrm>
+                    <a:prstGeom prst="rect"/>
+                  </pic:spPr>
+                </pic:pic>
+              </a:graphicData>
+            </a:graphic>
+          </wp:inline>
+        </w:drawing>
+      </w:r>
+    </w:p>
+    <w:p>
+      <w:pPr>
+        <w:spacing w:line="252" w:lineRule="auto" w:after="200" w:before="0"/>
+        <w:ind w:firstLine="0" w:right="0" w:left="0"/>
+        <w:jc w:val="center"/>
+      </w:pPr>
+      <w:r>
+        <w:rPr>
+          <w:rFonts w:ascii="Times New Roman" w:hAnsi="Times New Roman" w:eastAsia="Times New Roman"/>
+          <w:b w:val="0"/>
+          <w:sz w:val="24"/>
+        </w:rPr>
+        <w:t>2.10-rasm. PC ma’lumotlari qabul qilingandan keyingi QR va solishtirish kodi</w:t>
+      </w:r>
+    </w:p>
+    <w:p>
+      <w:pPr>
+        <w:spacing w:line="360" w:lineRule="auto" w:after="0" w:before="0"/>
+        <w:ind w:firstLine="709" w:right="0" w:left="0"/>
+        <w:jc w:val="both"/>
+      </w:pPr>
+      <w:r>
+        <w:rPr>
+          <w:rFonts w:ascii="Times New Roman" w:hAnsi="Times New Roman" w:eastAsia="Times New Roman"/>
+          <w:b w:val="0"/>
+          <w:sz w:val="28"/>
+        </w:rPr>
+        <w:t>To‘rtinchi bosqichda tegishli kompaniya administratori o‘z boshqaruv sessiyasi bilan QR havolani ochadi. Tasdiqlash sahifasida tashkilot nomi, hostname, platforma, identifikatorlar va solishtirish kodi ko‘rsatiladi. Administrator PC ekranidagi kod bilan o‘z ekranidagi kod bir xil ekanini tekshiradi. Tashkilot noto‘g‘ri tanlangan bo‘lsa, kompyuterni tasdiqlash davom ettirilmaydi. Bir nechta tarmoq yoki xonadagi o‘xshash nomli PC’lar bilan ishlaganda aynan shu solishtirish noto‘g‘ri qurilmani biriktirish xavfini kamaytiradi.</w:t>
+      </w:r>
+    </w:p>
+    <w:p>
+      <w:pPr>
+        <w:keepNext/>
+        <w:ind w:firstLine="0" w:right="0" w:left="0"/>
+        <w:jc w:val="center"/>
+      </w:pPr>
+      <w:r>
+        <w:drawing>
+          <wp:inline xmlns:a="http://schemas.openxmlformats.org/drawingml/2006/main" xmlns:pic="http://schemas.openxmlformats.org/drawingml/2006/picture">
+            <wp:extent cx="2827962" cy="6120000"/>
+            <wp:docPr id="11" name="Picture 11"/>
+            <wp:cNvGraphicFramePr>
+              <a:graphicFrameLocks noChangeAspect="1"/>
+            </wp:cNvGraphicFramePr>
+            <a:graphic>
+              <a:graphicData uri="http://schemas.openxmlformats.org/drawingml/2006/picture">
+                <pic:pic>
+                  <pic:nvPicPr>
+                    <pic:cNvPr id="0" name="company_mobile_approval.png"/>
+                    <pic:cNvPicPr/>
+                  </pic:nvPicPr>
+                  <pic:blipFill>
+                    <a:blip r:embed="rId20"/>
+                    <a:stretch>
+                      <a:fillRect/>
+                    </a:stretch>
+                  </pic:blipFill>
+                  <pic:spPr>
+                    <a:xfrm>
+                      <a:off x="0" y="0"/>
+                      <a:ext cx="2827962" cy="6120000"/>
+                    </a:xfrm>
+                    <a:prstGeom prst="rect"/>
+                  </pic:spPr>
+                </pic:pic>
+              </a:graphicData>
+            </a:graphic>
+          </wp:inline>
+        </w:drawing>
+      </w:r>
+    </w:p>
+    <w:p>
+      <w:pPr>
+        <w:spacing w:line="252" w:lineRule="auto" w:after="200" w:before="0"/>
+        <w:ind w:firstLine="0" w:right="0" w:left="0"/>
+        <w:jc w:val="center"/>
+      </w:pPr>
+      <w:r>
+        <w:rPr>
+          <w:rFonts w:ascii="Times New Roman" w:hAnsi="Times New Roman" w:eastAsia="Times New Roman"/>
+          <w:b w:val="0"/>
+          <w:sz w:val="24"/>
+        </w:rPr>
+        <w:t>2.11-rasm. Mobil ekran o‘lchamida kompaniya administratorining PC’ni tasdiqlashi</w:t>
+      </w:r>
+    </w:p>
+    <w:p>
+      <w:pPr>
+        <w:spacing w:line="360" w:lineRule="auto" w:after="0" w:before="0"/>
+        <w:ind w:firstLine="709" w:right="0" w:left="0"/>
+        <w:jc w:val="both"/>
+      </w:pPr>
+      <w:r>
+        <w:rPr>
+          <w:rFonts w:ascii="Times New Roman" w:hAnsi="Times New Roman" w:eastAsia="Times New Roman"/>
+          <w:b w:val="0"/>
+          <w:sz w:val="28"/>
+        </w:rPr>
+        <w:t>Beshinchi bosqichda administrator joylashuvni kiritadi va tasdiqlaydi yoki rad etadi. Namuna ssenariyda Namuna kompaniya, 1-filial tavsifi kiritilgan. Joylashuv amaldagi bazada tavsif maydoni hisoblanadi; u o‘z-o‘zicha alohida filial vakolatini yaratmaydi. Server vakolatli tasdiqdan so‘ng qurilmani shu tashkilotga biriktiradi. Bir xil sessiyani yana tasdiqlash yoki boshqa tashkilotdan qayta egallash ruxsat etilmaydi.</w:t>
+      </w:r>
+    </w:p>
+    <w:p>
+      <w:pPr>
+        <w:keepNext/>
+        <w:ind w:firstLine="0" w:right="0" w:left="0"/>
+        <w:jc w:val="center"/>
+      </w:pPr>
+      <w:r>
+        <w:drawing>
+          <wp:inline xmlns:a="http://schemas.openxmlformats.org/drawingml/2006/main" xmlns:pic="http://schemas.openxmlformats.org/drawingml/2006/picture">
+            <wp:extent cx="2827962" cy="6120000"/>
+            <wp:docPr id="12" name="Picture 12"/>
+            <wp:cNvGraphicFramePr>
+              <a:graphicFrameLocks noChangeAspect="1"/>
+            </wp:cNvGraphicFramePr>
+            <a:graphic>
+              <a:graphicData uri="http://schemas.openxmlformats.org/drawingml/2006/picture">
+                <pic:pic>
+                  <pic:nvPicPr>
+                    <pic:cNvPr id="0" name="company_mobile_approved.png"/>
+                    <pic:cNvPicPr/>
+                  </pic:nvPicPr>
+                  <pic:blipFill>
+                    <a:blip r:embed="rId21"/>
+                    <a:stretch>
+                      <a:fillRect/>
+                    </a:stretch>
+                  </pic:blipFill>
+                  <pic:spPr>
+                    <a:xfrm>
+                      <a:off x="0" y="0"/>
+                      <a:ext cx="2827962" cy="6120000"/>
+                    </a:xfrm>
+                    <a:prstGeom prst="rect"/>
+                  </pic:spPr>
+                </pic:pic>
+              </a:graphicData>
+            </a:graphic>
+          </wp:inline>
+        </w:drawing>
+      </w:r>
+    </w:p>
+    <w:p>
+      <w:pPr>
+        <w:spacing w:line="252" w:lineRule="auto" w:after="200" w:before="0"/>
+        <w:ind w:firstLine="0" w:right="0" w:left="0"/>
+        <w:jc w:val="center"/>
+      </w:pPr>
+      <w:r>
+        <w:rPr>
+          <w:rFonts w:ascii="Times New Roman" w:hAnsi="Times New Roman" w:eastAsia="Times New Roman"/>
+          <w:b w:val="0"/>
+          <w:sz w:val="24"/>
+        </w:rPr>
+        <w:t>2.12-rasm. Administrator tasdig‘idan keyin agent ulanishi kutilayotgan holat</w:t>
+      </w:r>
+    </w:p>
+    <w:p>
+      <w:pPr>
+        <w:spacing w:line="360" w:lineRule="auto" w:after="0" w:before="0"/>
+        <w:ind w:firstLine="709" w:right="0" w:left="0"/>
+        <w:jc w:val="both"/>
+      </w:pPr>
+      <w:r>
+        <w:rPr>
+          <w:rFonts w:ascii="Times New Roman" w:hAnsi="Times New Roman" w:eastAsia="Times New Roman"/>
+          <w:b w:val="0"/>
+          <w:sz w:val="28"/>
+        </w:rPr>
+        <w:t>Oltinchi bosqichda PC brauzerida ham tasdiq natijasi ko‘rinadi. Qurilma browser_approved bo‘lsa-da, ro‘yxatdagi kriptografik kalit bilan aktivatsiya yakunlanmaguncha faol agentga tenglashtirilmaydi. Bu ajratish kompaniyada yangi kompyuterni inventar sifatida qabul qilish va undan server nomidan so‘rov yuborishga ruxsat berish orasidagi chegarani saqlaydi. Tasdiqlangan kompyuterning o‘zi boshqa PC uchun berilgan tokenni ishlatmasligi kerak.</w:t>
+      </w:r>
+    </w:p>
+    <w:p>
+      <w:pPr>
+        <w:keepNext/>
+        <w:ind w:firstLine="0" w:right="0" w:left="0"/>
+        <w:jc w:val="center"/>
+      </w:pPr>
+      <w:r>
+        <w:drawing>
+          <wp:inline xmlns:a="http://schemas.openxmlformats.org/drawingml/2006/main" xmlns:pic="http://schemas.openxmlformats.org/drawingml/2006/picture">
+            <wp:extent cx="5400000" cy="2824615"/>
+            <wp:docPr id="13" name="Picture 13"/>
+            <wp:cNvGraphicFramePr>
+              <a:graphicFrameLocks noChangeAspect="1"/>
+            </wp:cNvGraphicFramePr>
+            <a:graphic>
+              <a:graphicData uri="http://schemas.openxmlformats.org/drawingml/2006/picture">
+                <pic:pic>
+                  <pic:nvPicPr>
+                    <pic:cNvPr id="0" name="company_pc_approved.png"/>
+                    <pic:cNvPicPr/>
+                  </pic:nvPicPr>
+                  <pic:blipFill>
+                    <a:blip r:embed="rId22"/>
+                    <a:stretch>
+                      <a:fillRect/>
+                    </a:stretch>
+                  </pic:blipFill>
+                  <pic:spPr>
+                    <a:xfrm>
+                      <a:off x="0" y="0"/>
+                      <a:ext cx="5400000" cy="2824615"/>
+                    </a:xfrm>
+                    <a:prstGeom prst="rect"/>
+                  </pic:spPr>
+                </pic:pic>
+              </a:graphicData>
+            </a:graphic>
+          </wp:inline>
+        </w:drawing>
+      </w:r>
+    </w:p>
+    <w:p>
+      <w:pPr>
+        <w:spacing w:line="252" w:lineRule="auto" w:after="200" w:before="0"/>
+        <w:ind w:firstLine="0" w:right="0" w:left="0"/>
+        <w:jc w:val="center"/>
+      </w:pPr>
+      <w:r>
+        <w:rPr>
+          <w:rFonts w:ascii="Times New Roman" w:hAnsi="Times New Roman" w:eastAsia="Times New Roman"/>
+          <w:b w:val="0"/>
+          <w:sz w:val="24"/>
+        </w:rPr>
+        <w:t>2.13-rasm. PC tomonida administrator tasdig‘i va agent ulanishini davom ettirish xabari</w:t>
+      </w:r>
+    </w:p>
+    <w:p>
+      <w:pPr>
+        <w:pStyle w:val="Heading3"/>
+        <w:ind w:right="0" w:left="0"/>
+        <w:jc w:val="both"/>
+      </w:pPr>
+      <w:r>
+        <w:rPr>
+          <w:rFonts w:ascii="Times New Roman" w:hAnsi="Times New Roman" w:eastAsia="Times New Roman"/>
+          <w:b/>
+          <w:sz w:val="28"/>
+        </w:rPr>
+        <w:t>Windows agentini kompaniya PC’siga o‘rnatish</w:t>
+      </w:r>
+    </w:p>
+    <w:p>
+      <w:pPr>
+        <w:spacing w:line="360" w:lineRule="auto" w:after="0" w:before="0"/>
+        <w:ind w:firstLine="709" w:right="0" w:left="0"/>
+        <w:jc w:val="both"/>
+      </w:pPr>
+      <w:r>
+        <w:rPr>
+          <w:rFonts w:ascii="Times New Roman" w:hAnsi="Times New Roman" w:eastAsia="Times New Roman"/>
+          <w:b w:val="0"/>
+          <w:sz w:val="28"/>
+        </w:rPr>
+        <w:t>Ro‘yxatdan o‘tkazishdan keyin administrator yoki vakolatli texnik xodim mos Windows paketini oladi. Kompaniya siyosati yuklangan o‘rnatuvchining manbasi va yaxlitligini tekshirishni nazarda tutishi kerak. Tizim katalogi paketning haqiqiy mavjudligini va SHA-256 qiymatini ko‘rsatadi. Faqat fayl nomining to‘g‘ri ko‘rinishi uning joriy koddan yig‘ilganini isbotlamaydi; paket versiyasi hamda manba kodining holati solishtiriladi.</w:t>
+      </w:r>
+    </w:p>
+    <w:p>
+      <w:pPr>
+        <w:spacing w:line="360" w:lineRule="auto" w:after="0" w:before="0"/>
+        <w:ind w:firstLine="709" w:right="0" w:left="0"/>
+        <w:jc w:val="both"/>
+      </w:pPr>
+      <w:r>
+        <w:rPr>
+          <w:rFonts w:ascii="Times New Roman" w:hAnsi="Times New Roman" w:eastAsia="Times New Roman"/>
+          <w:b w:val="0"/>
+          <w:sz w:val="28"/>
+        </w:rPr>
+        <w:t>Joriy installer kodida aktivatsiya ma’lumotlari agent fayllarini nusxalashdan oldin olinadi. Xodim tashkilot tokenini belgilangan oynaga kiritadi va server tekshiruvini kutadi. Server tashkilot, qurilma va yangi kalitning mosligini tekshiradi. Xato bo‘lsa qayta urinish va bekor qilish imkoniyati saqlanadi. Ko‘plab PC’larni tayyorlashda umumiy bir martalik tokenni cheklanmagan sonli qurilmaga tarqatish nazarda tutilmaydi: tokenning sarflanishi va har bir qurilma uchun alohida aktivatsiya nazorat qilinadi.</w:t>
+      </w:r>
+    </w:p>
+    <w:p>
+      <w:pPr>
+        <w:spacing w:line="360" w:lineRule="auto" w:after="0" w:before="0"/>
+        <w:ind w:firstLine="709" w:right="0" w:left="0"/>
+        <w:jc w:val="both"/>
+      </w:pPr>
+      <w:r>
+        <w:rPr>
+          <w:rFonts w:ascii="Times New Roman" w:hAnsi="Times New Roman" w:eastAsia="Times New Roman"/>
+          <w:b w:val="0"/>
+          <w:sz w:val="28"/>
+        </w:rPr>
+        <w:t>Windows tizim fayllarini o‘rnatish uchun administrator huquqi talab qilinishi mumkin. Biroq foydalanuvchiga bog‘liq kalit va sertifikatni boshqa administrator profiliga yozib yuborish noto‘g‘ri natija beradi. Shu sababli aktivatsiya konteksti, o‘rnatish konteksti va agent ishlaydigan asl foydalanuvchi ajratiladi. O‘rnatish tugagach, agentning shu foydalanuvchi sessiyasida ishga tushishi, serverga imzolangan murojaati va boshqaruv panelida ko‘rinishi tekshiriladi [13].</w:t>
+      </w:r>
+    </w:p>
+    <w:p>
+      <w:pPr>
+        <w:spacing w:line="360" w:lineRule="auto" w:after="0" w:before="0"/>
+        <w:ind w:firstLine="709" w:right="0" w:left="0"/>
+        <w:jc w:val="both"/>
+      </w:pPr>
+      <w:r>
+        <w:rPr>
+          <w:rFonts w:ascii="Times New Roman" w:hAnsi="Times New Roman" w:eastAsia="Times New Roman"/>
+          <w:b w:val="0"/>
+          <w:sz w:val="28"/>
+        </w:rPr>
+        <w:t>Korporativ tarqatish ssenariysida sozlamalar izchilligi muhim. Barcha PC’lar mo‘ljallangan server manziliga murojaat qilishi, TLS tekshiruvini saqlashi va vaqtni to‘g‘ri yuritishi kerak. Tizimning hozirgi interaktiv token oynasi mavjudligi avtomatik ommaviy deploy, Active Directory yoki Group Policy orqali boshqariladigan o‘rnatish amalga oshirilganini anglatmaydi. Bunday tarqatish yo‘li alohida ishlab chiqish va kompaniya infratuzilmasida tekshirishni talab qiladi.</w:t>
+      </w:r>
+    </w:p>
+    <w:p>
+      <w:pPr>
+        <w:pStyle w:val="Heading3"/>
+        <w:ind w:right="0" w:left="0"/>
+        <w:jc w:val="both"/>
+      </w:pPr>
+      <w:r>
+        <w:rPr>
+          <w:rFonts w:ascii="Times New Roman" w:hAnsi="Times New Roman" w:eastAsia="Times New Roman"/>
+          <w:b/>
+          <w:sz w:val="28"/>
+        </w:rPr>
+        <w:t>Telefon interfeysi va foydalanuvchini biometrik ro‘yxatga olish</w:t>
+      </w:r>
+    </w:p>
+    <w:p>
+      <w:pPr>
+        <w:spacing w:line="360" w:lineRule="auto" w:after="0" w:before="0"/>
+        <w:ind w:firstLine="709" w:right="0" w:left="0"/>
+        <w:jc w:val="both"/>
+      </w:pPr>
+      <w:r>
+        <w:rPr>
+          <w:rFonts w:ascii="Times New Roman" w:hAnsi="Times New Roman" w:eastAsia="Times New Roman"/>
+          <w:b w:val="0"/>
+          <w:sz w:val="28"/>
+        </w:rPr>
+        <w:t>Kompaniya administratori qurilmani tasdiqlash uchun telefondan foydalanishi bilan xodimning shaxsini biometrik tekshirish ikki xil jarayondir. Birinchisida administrator PC’ni kompaniya tarkibiga qabul qiladi. Ikkinchisida esa foydalanuvchiga tegishli yuz namunasi yoki WebAuthn autentifikatori bilan ishlanadi. Foydalanuvchi interfeysida ikkala jarayon ham telefon orqali ochilishi mumkin, ammo sessiyalar va ularning ruxsatlari aralashtirilmaydi.</w:t>
+      </w:r>
+    </w:p>
+    <w:p>
+      <w:pPr>
+        <w:spacing w:line="360" w:lineRule="auto" w:after="0" w:before="0"/>
+        <w:ind w:firstLine="709" w:right="0" w:left="0"/>
+        <w:jc w:val="both"/>
+      </w:pPr>
+      <w:r>
+        <w:rPr>
+          <w:rFonts w:ascii="Times New Roman" w:hAnsi="Times New Roman" w:eastAsia="Times New Roman"/>
+          <w:b w:val="0"/>
+          <w:sz w:val="28"/>
+        </w:rPr>
+        <w:t>Mobil biometrik ro‘yxatga olish sahifasi tekshiruvni ikki bosqichda ko‘rsatadi: avval yuz tekshiriladi, keyin autentifikator bilan tasdiqlash bajariladi. Quyidagi tasvir 390 piksel kenglikdagi mobil brauzer ko‘rinishida haqiqiy server bergan vaqtinchalik sessiya orqali olingan. U boshlang‘ich interfeysni tasvirlaydi; kamera yoki barmoq izi sensori yordamida yakuniy muvaffaqiyatli tekshiruv bajarilganini ko‘rsatmaydi. WebAuthn autentifikatoridagi mahalliy tekshiruv aynan barmoq izi bilan bajarilishi majburiy emas.</w:t>
+      </w:r>
+    </w:p>
+    <w:p>
+      <w:pPr>
+        <w:keepNext/>
+        <w:ind w:firstLine="0" w:right="0" w:left="0"/>
+        <w:jc w:val="center"/>
+      </w:pPr>
+      <w:r>
+        <w:drawing>
+          <wp:inline xmlns:a="http://schemas.openxmlformats.org/drawingml/2006/main" xmlns:pic="http://schemas.openxmlformats.org/drawingml/2006/picture">
+            <wp:extent cx="2827962" cy="6120000"/>
+            <wp:docPr id="14" name="Picture 14"/>
+            <wp:cNvGraphicFramePr>
+              <a:graphicFrameLocks noChangeAspect="1"/>
+            </wp:cNvGraphicFramePr>
+            <a:graphic>
+              <a:graphicData uri="http://schemas.openxmlformats.org/drawingml/2006/picture">
+                <pic:pic>
+                  <pic:nvPicPr>
+                    <pic:cNvPr id="0" name="mobile_biometric_ready.png"/>
+                    <pic:cNvPicPr/>
+                  </pic:nvPicPr>
+                  <pic:blipFill>
+                    <a:blip r:embed="rId23"/>
+                    <a:stretch>
+                      <a:fillRect/>
+                    </a:stretch>
+                  </pic:blipFill>
+                  <pic:spPr>
+                    <a:xfrm>
+                      <a:off x="0" y="0"/>
+                      <a:ext cx="2827962" cy="6120000"/>
+                    </a:xfrm>
+                    <a:prstGeom prst="rect"/>
+                  </pic:spPr>
+                </pic:pic>
+              </a:graphicData>
+            </a:graphic>
+          </wp:inline>
+        </w:drawing>
+      </w:r>
+    </w:p>
+    <w:p>
+      <w:pPr>
+        <w:spacing w:line="252" w:lineRule="auto" w:after="200" w:before="0"/>
+        <w:ind w:firstLine="0" w:right="0" w:left="0"/>
+        <w:jc w:val="center"/>
+      </w:pPr>
+      <w:r>
+        <w:rPr>
+          <w:rFonts w:ascii="Times New Roman" w:hAnsi="Times New Roman" w:eastAsia="Times New Roman"/>
+          <w:b w:val="0"/>
+          <w:sz w:val="24"/>
+        </w:rPr>
+        <w:t>2.14-rasm. Mobil o‘lchamdagi biometrik ro‘yxatga olishning boshlang‘ich oynasi</w:t>
+      </w:r>
+    </w:p>
+    <w:p>
+      <w:pPr>
+        <w:spacing w:line="360" w:lineRule="auto" w:after="0" w:before="0"/>
+        <w:ind w:firstLine="709" w:right="0" w:left="0"/>
+        <w:jc w:val="both"/>
+      </w:pPr>
+      <w:r>
+        <w:rPr>
+          <w:rFonts w:ascii="Times New Roman" w:hAnsi="Times New Roman" w:eastAsia="Times New Roman"/>
+          <w:b w:val="0"/>
+          <w:sz w:val="28"/>
+        </w:rPr>
+        <w:t>Agent sessiyasiga tegishli /agent/mobile/face/ yo‘li boshqa mobil sahifani ochadi. Ushbu sahifa kameradan tasvir olishga ruxsat so‘raydi va joriy sessiya vaqtini ko‘rsatadi. Kamera mavjud bo‘lmagan yoki ruxsat berilmagan holatda tasdiqlashni davom ettirish mumkin emasligi aniq ko‘rinishi kerak. Bunday xato holatini foydalanuvchini tekshirish muvaffaqiyatiga aylantirish noto‘g‘ri bo‘ladi. Telefon brauzeri, kamera ruxsati va server origin mosligi amaliy joriy etishda alohida tekshiriladi.</w:t>
+      </w:r>
+    </w:p>
+    <w:p>
+      <w:pPr>
+        <w:keepNext/>
+        <w:ind w:firstLine="0" w:right="0" w:left="0"/>
+        <w:jc w:val="center"/>
+      </w:pPr>
+      <w:r>
+        <w:drawing>
+          <wp:inline xmlns:a="http://schemas.openxmlformats.org/drawingml/2006/main" xmlns:pic="http://schemas.openxmlformats.org/drawingml/2006/picture">
+            <wp:extent cx="2255954" cy="6119998"/>
+            <wp:docPr id="15" name="Picture 15"/>
+            <wp:cNvGraphicFramePr>
+              <a:graphicFrameLocks noChangeAspect="1"/>
+            </wp:cNvGraphicFramePr>
+            <a:graphic>
+              <a:graphicData uri="http://schemas.openxmlformats.org/drawingml/2006/picture">
+                <pic:pic>
+                  <pic:nvPicPr>
+                    <pic:cNvPr id="0" name="mobile_agent_face.png"/>
+                    <pic:cNvPicPr/>
+                  </pic:nvPicPr>
+                  <pic:blipFill>
+                    <a:blip r:embed="rId24"/>
+                    <a:stretch>
+                      <a:fillRect/>
+                    </a:stretch>
+                  </pic:blipFill>
+                  <pic:spPr>
+                    <a:xfrm>
+                      <a:off x="0" y="0"/>
+                      <a:ext cx="2255954" cy="6119998"/>
+                    </a:xfrm>
+                    <a:prstGeom prst="rect"/>
+                  </pic:spPr>
+                </pic:pic>
+              </a:graphicData>
+            </a:graphic>
+          </wp:inline>
+        </w:drawing>
+      </w:r>
+    </w:p>
+    <w:p>
+      <w:pPr>
+        <w:spacing w:line="252" w:lineRule="auto" w:after="200" w:before="0"/>
+        <w:ind w:firstLine="0" w:right="0" w:left="0"/>
+        <w:jc w:val="center"/>
+      </w:pPr>
+      <w:r>
+        <w:rPr>
+          <w:rFonts w:ascii="Times New Roman" w:hAnsi="Times New Roman" w:eastAsia="Times New Roman"/>
+          <w:b w:val="0"/>
+          <w:sz w:val="24"/>
+        </w:rPr>
+        <w:t>2.15-rasm. Agentning mobil yuz tekshiruvi sahifasida kamera ruxsati berilmagan holat</w:t>
+      </w:r>
+    </w:p>
+    <w:p>
+      <w:pPr>
+        <w:pStyle w:val="Heading3"/>
+        <w:ind w:right="0" w:left="0"/>
+        <w:jc w:val="both"/>
+      </w:pPr>
+      <w:r>
+        <w:rPr>
+          <w:rFonts w:ascii="Times New Roman" w:hAnsi="Times New Roman" w:eastAsia="Times New Roman"/>
+          <w:b/>
+          <w:sz w:val="28"/>
+        </w:rPr>
+        <w:t>Ko‘p PC bilan kundalik ishlash, monitoring va qurilmani bekor qilish</w:t>
+      </w:r>
+    </w:p>
+    <w:p>
+      <w:pPr>
+        <w:spacing w:line="360" w:lineRule="auto" w:after="0" w:before="0"/>
+        <w:ind w:firstLine="709" w:right="0" w:left="0"/>
+        <w:jc w:val="both"/>
+      </w:pPr>
+      <w:r>
+        <w:rPr>
+          <w:rFonts w:ascii="Times New Roman" w:hAnsi="Times New Roman" w:eastAsia="Times New Roman"/>
+          <w:b w:val="0"/>
+          <w:sz w:val="28"/>
+        </w:rPr>
+        <w:t>Kundalik ishda administrator kompaniyaning foydalanuvchi va qurilmalarini markaziy panel orqali kuzatadi. Tekshiruv sessiyasi ma’lum foydalanuvchi va PC bilan bog‘lanadi. Xodimning holati yoki roli o‘zgarsa, kelgusi so‘rovlarda shu o‘zgarish hisobga olinishi kerak. Biroq bu rol o‘zgarishi Windowsdagi barcha fayl ACL yoki domen guruhlarini avtomatik qayta yozishini anglatmaydi. Boshqaruv panelidagi vakolatlar bilan operatsion tizimning mahalliy vakolatlari orasidagi integratsiya darajasi alohida ko‘rsatiladi.</w:t>
+      </w:r>
+    </w:p>
+    <w:p>
+      <w:pPr>
+        <w:spacing w:line="360" w:lineRule="auto" w:after="0" w:before="0"/>
+        <w:ind w:firstLine="709" w:right="0" w:left="0"/>
+        <w:jc w:val="both"/>
+      </w:pPr>
+      <w:r>
+        <w:rPr>
+          <w:rFonts w:ascii="Times New Roman" w:hAnsi="Times New Roman" w:eastAsia="Times New Roman"/>
+          <w:b w:val="0"/>
+          <w:sz w:val="28"/>
+        </w:rPr>
+        <w:t>AgentHealth va AgentEvent kompaniyadagi qurilmalar holatini kuzatishga xizmat qiladi. Server qabul qilgan vaqt bilan agent xabar qilgan vaqt ajratiladi, chunki ishchi kompyuter soati xato bo‘lishi mumkin. Joriy hujjatga ko‘ra, birinchi heartbeatdan keyin 120 soniya aloqa bo‘lmasa connection_lost hodisasi, aloqa tiklanganda connection_restored hodisasi qayd etiladi. Lekin aloqa uzilishi xodim ataylab agentni o‘chirganini isbotlamaydi: elektr, tarmoq yoki jarayon xatosi ham shunday natija berishi mumkin [12].</w:t>
+      </w:r>
+    </w:p>
+    <w:p>
+      <w:pPr>
+        <w:spacing w:line="360" w:lineRule="auto" w:after="0" w:before="0"/>
+        <w:ind w:firstLine="709" w:right="0" w:left="0"/>
+        <w:jc w:val="both"/>
+      </w:pPr>
+      <w:r>
+        <w:rPr>
+          <w:rFonts w:ascii="Times New Roman" w:hAnsi="Times New Roman" w:eastAsia="Times New Roman"/>
+          <w:b w:val="0"/>
+          <w:sz w:val="28"/>
+        </w:rPr>
+        <w:t>Panel yopiq vaqtda ham monitoring talab qilinsa, davriy sog‘liq tekshiruvi alohida ishga tushiriladi. Buning uchun loyihada Celery worker va Beat yoki check_agent_health boshqaruv buyrug‘ini reja bo‘yicha bajarish yo‘li ko‘rsatilgan. Faqat veb-serverni ishga tushirish ushbu davriy xizmatlarning ham ishlayotganini anglatmaydi. Kompaniyada joriy etish tekshiruvida shu xizmatlar, broker aloqasi va uzilish holatidagi kuzatuv ham qabul mezoniga kiritiladi.</w:t>
+      </w:r>
+    </w:p>
+    <w:p>
+      <w:pPr>
+        <w:spacing w:line="360" w:lineRule="auto" w:after="0" w:before="0"/>
+        <w:ind w:firstLine="709" w:right="0" w:left="0"/>
+        <w:jc w:val="both"/>
+      </w:pPr>
+      <w:r>
+        <w:rPr>
+          <w:rFonts w:ascii="Times New Roman" w:hAnsi="Times New Roman" w:eastAsia="Times New Roman"/>
+          <w:b w:val="0"/>
+          <w:sz w:val="28"/>
+        </w:rPr>
+        <w:t>Vakolatli administrator vaqtinchalik ishlamaslikka ruxsat bersa, uning kimligi, sababi va muddati qayd etiladi. Bunday ruxsat ogohlantirish siyosatiga ta’sir qilishi mumkin, lekin u agent oynasini har qanday sharoitda masofadan yopish degani emas. Server bergan yangi siyosat agentga yetib borishi uchun aloqa kerak bo‘ladi. Shu bois boshqa filialdagi tarmoq uzilishida administrator oynasidagi qaror bilan PC’dagi oxirgi ma’lum holat orasidagi farq hisobga olinadi.</w:t>
+      </w:r>
+    </w:p>
+    <w:p>
+      <w:pPr>
+        <w:spacing w:line="360" w:lineRule="auto" w:after="0" w:before="0"/>
+        <w:ind w:firstLine="709" w:right="0" w:left="0"/>
+        <w:jc w:val="both"/>
+      </w:pPr>
+      <w:r>
+        <w:rPr>
+          <w:rFonts w:ascii="Times New Roman" w:hAnsi="Times New Roman" w:eastAsia="Times New Roman"/>
+          <w:b w:val="0"/>
+          <w:sz w:val="28"/>
+        </w:rPr>
+        <w:t>PC xizmatdan chiqarilsa, boshqa tashkilotga berilsa yoki agent olib tashlansa, oddiy qurilma autentifikatsiyasi bekor qilinadi. Olib tashlash kodi muayyan qurilma va sertifikat avlodiga bog‘lanadi. Jarayon boshlanganidan so‘ng eski kalitdan oddiy autentifikatsiyada foydalanish davom etmasligi kerak. Audit yozuvlari esa hodisalar tarixini saqlash uchun qoladi. Bitta PC’ni bekor qilish boshqa faol kompaniya qurilmalarini avtomatik bloklash uchun asos bo‘lmasligi lozim.</w:t>
+      </w:r>
+    </w:p>
+    <w:p>
+      <w:pPr>
+        <w:spacing w:line="360" w:lineRule="auto" w:after="0" w:before="0"/>
+        <w:ind w:firstLine="709" w:right="0" w:left="0"/>
+        <w:jc w:val="both"/>
+      </w:pPr>
+      <w:r>
+        <w:rPr>
+          <w:rFonts w:ascii="Times New Roman" w:hAnsi="Times New Roman" w:eastAsia="Times New Roman"/>
+          <w:b w:val="0"/>
+          <w:sz w:val="28"/>
+        </w:rPr>
+        <w:t>Kompaniya miqyosidagi yakuniy qabul sinovlari kamida turli PC’larda parallel ro‘yxatga olish, noto‘g‘ri tashkilot administratori bilan tasdiqlash, bir foydalanuvchining turli PC’dagi sessiyalari, tarmoq uzilishi, sertifikat bekor qilinishi va agentni qayta o‘rnatish holatlarini qamrab oladi. Ko‘p foydalanuvchi yuklamasi bo‘yicha esa bir vaqtning o‘zidagi sessiyalar, javob vaqti, bazadagi yozuvlar to‘qnashuvi va navbatlar holati o‘lchanadi. Bu mezonlar tajriba rejasi sifatida beriladi; joriy ishda o‘lchanmagan throughput yoki maksimal PC soni uydirib kiritilmaydi.</w:t>
+      </w:r>
+    </w:p>
+    <w:p>
+      <w:pPr>
+        <w:pStyle w:val="Heading2"/>
+        <w:ind w:right="0" w:left="0"/>
+        <w:jc w:val="both"/>
+      </w:pPr>
+      <w:r>
+        <w:rPr>
+          <w:rFonts w:ascii="Times New Roman" w:hAnsi="Times New Roman" w:eastAsia="Times New Roman"/>
+          <w:b/>
+          <w:sz w:val="28"/>
+        </w:rPr>
+        <w:t>2.3-§. Ko‘p faktorli autentifikatsiya tizimini baholash</w:t>
+      </w:r>
+    </w:p>
+    <w:p>
+      <w:pPr>
+        <w:spacing w:line="360" w:lineRule="auto" w:after="0" w:before="0"/>
+        <w:ind w:firstLine="709" w:right="0" w:left="0"/>
+        <w:jc w:val="both"/>
+      </w:pPr>
+      <w:r>
+        <w:rPr>
+          <w:rFonts w:ascii="Times New Roman" w:hAnsi="Times New Roman" w:eastAsia="Times New Roman"/>
+          <w:b w:val="0"/>
+          <w:sz w:val="28"/>
+        </w:rPr>
+        <w:t>Tizimni baholashdan maqsad amalga oshirilgan autentifikatsiya va boshqaruv jarayonlarining belgilangan talablarga qanchalik mosligini aniqlashdir. Baholash funksional natija bilan birga autentifikator dalilining to‘g‘riligi, sessiyaga bog‘lanishi va ko‘p faktorli siyosatning bajarilishini qamrab oladi. Foydalanuvchi usullardan birini tanlay olishi barcha kirishlarda ikki mustaqil omil majburiy tekshirilganini tasdiqlamaydi. Shu bois dasturiy testlar natijasi, amaldagi arxitektura imkoniyati va hali real qurilmada tekshirilishi kerak bo‘lgan talablar alohida izohlanadi [2, 12, 13].</w:t>
       </w:r>
     </w:p>
     <w:p>
@@ -8774,7 +10543,7 @@
           <w:b w:val="0"/>
           <w:sz w:val="24"/>
         </w:rPr>
-        <w:t>2.4-jadval. Bajarilgan dasturiy sinovlar natijalari</w:t>
+        <w:t>2.5-jadval. Bajarilgan dasturiy sinovlar natijalari</w:t>
       </w:r>
     </w:p>
     <w:tbl>
@@ -9478,644 +11247,6 @@
     </w:p>
     <w:p>
       <w:pPr>
-        <w:keepNext/>
-        <w:ind w:firstLine="0" w:right="0" w:left="0"/>
-        <w:jc w:val="center"/>
-      </w:pPr>
-      <w:r>
-        <w:drawing>
-          <wp:inline xmlns:a="http://schemas.openxmlformats.org/drawingml/2006/main" xmlns:pic="http://schemas.openxmlformats.org/drawingml/2006/picture">
-            <wp:extent cx="5400000" cy="3557833"/>
-            <wp:docPr id="5" name="Picture 5"/>
-            <wp:cNvGraphicFramePr>
-              <a:graphicFrameLocks noChangeAspect="1"/>
-            </wp:cNvGraphicFramePr>
-            <a:graphic>
-              <a:graphicData uri="http://schemas.openxmlformats.org/drawingml/2006/picture">
-                <pic:pic>
-                  <pic:nvPicPr>
-                    <pic:cNvPr id="0" name="login.png"/>
-                    <pic:cNvPicPr/>
-                  </pic:nvPicPr>
-                  <pic:blipFill>
-                    <a:blip r:embed="rId14"/>
-                    <a:stretch>
-                      <a:fillRect/>
-                    </a:stretch>
-                  </pic:blipFill>
-                  <pic:spPr>
-                    <a:xfrm>
-                      <a:off x="0" y="0"/>
-                      <a:ext cx="5400000" cy="3557833"/>
-                    </a:xfrm>
-                    <a:prstGeom prst="rect"/>
-                  </pic:spPr>
-                </pic:pic>
-              </a:graphicData>
-            </a:graphic>
-          </wp:inline>
-        </w:drawing>
-      </w:r>
-    </w:p>
-    <w:p>
-      <w:pPr>
-        <w:spacing w:line="252" w:lineRule="auto" w:after="200" w:before="0"/>
-        <w:ind w:firstLine="0" w:right="0" w:left="0"/>
-        <w:jc w:val="center"/>
-      </w:pPr>
-      <w:r>
-        <w:rPr>
-          <w:rFonts w:ascii="Times New Roman" w:hAnsi="Times New Roman" w:eastAsia="Times New Roman"/>
-          <w:b w:val="0"/>
-          <w:sz w:val="24"/>
-        </w:rPr>
-        <w:t>2.5-rasm. Mahalliy serverdagi administrator kirish oynasi</w:t>
-      </w:r>
-    </w:p>
-    <w:p>
-      <w:pPr>
-        <w:spacing w:line="360" w:lineRule="auto" w:after="0" w:before="0"/>
-        <w:ind w:firstLine="709" w:right="0" w:left="0"/>
-        <w:jc w:val="both"/>
-      </w:pPr>
-      <w:r>
-        <w:rPr>
-          <w:rFonts w:ascii="Times New Roman" w:hAnsi="Times New Roman" w:eastAsia="Times New Roman"/>
-          <w:b w:val="0"/>
-          <w:sz w:val="28"/>
-        </w:rPr>
-        <w:t>Foydalanishni boshlash uchun administrator avval server va veb-interfeysni tayyorlaydi. Python bog‘liqliklari req.text bo‘yicha o‘rnatiladi, manage.py migrate orqali baza holati yangilanadi. Frontendda npm ci va npm run build bajariladi. PUBLIC_SITE_URL foydalanuvchi ochadigan manzil bilan mos bo‘lishi kerak. Telefon bilan ishlashda telefon o‘zi ulana oladigan HTTPS manzil talab etiladi; uning localhost manzili ishchi kompyuterni ko‘rsatmaydi.</w:t>
-      </w:r>
-    </w:p>
-    <w:p>
-      <w:pPr>
-        <w:spacing w:line="360" w:lineRule="auto" w:after="0" w:before="0"/>
-        <w:ind w:firstLine="709" w:right="0" w:left="0"/>
-        <w:jc w:val="both"/>
-      </w:pPr>
-      <w:r>
-        <w:rPr>
-          <w:rFonts w:ascii="Times New Roman" w:hAnsi="Times New Roman" w:eastAsia="Times New Roman"/>
-          <w:b w:val="0"/>
-          <w:sz w:val="28"/>
-        </w:rPr>
-        <w:t>Tashkilot administratori kirgach, tegishli ish maydonini tanlaydi va foydalanuvchi hamda rollarni boshqaradi. Qurilmani ro‘yxatdan o‘tkazishda foydalanuvchi Scan this PC amalini boshlaydi, mos yordamchini oladi va uni ongli ravishda ishga tushiradi. Administrator ko‘rsatilgan hostname, platforma va identifikatorlarni haqiqiy kompyuter bilan solishtiradi. Tasdiqlashdan oldin qurilma kimga va qaysi joylashuvga tegishli ekani tekshiriladi.</w:t>
-      </w:r>
-    </w:p>
-    <w:p>
-      <w:pPr>
-        <w:spacing w:line="360" w:lineRule="auto" w:after="0" w:before="0"/>
-        <w:ind w:firstLine="709" w:right="0" w:left="0"/>
-        <w:jc w:val="both"/>
-      </w:pPr>
-      <w:r>
-        <w:rPr>
-          <w:rFonts w:ascii="Times New Roman" w:hAnsi="Times New Roman" w:eastAsia="Times New Roman"/>
-          <w:b w:val="0"/>
-          <w:sz w:val="28"/>
-        </w:rPr>
-        <w:t>Keyingi bosqichda mos Windows agenti olinadi va aktivatsiya boshlanadi. Tashkilot tokeni chat, ochiq hujjat yoki buyruq argumentiga yozilmaydi; o‘rnatishning tegishli kiritish oynasi ishlatiladi. Muvaffaqiyatsiz aktivatsiyada foydalanuvchi xato sababini ko‘rib, qayta urinadi yoki bekor qiladi. Kriptografik aktivatsiya muvaffaqiyatli tugagach, foydalanuvchi uchun biometrik namuna yoki telefon autentifikatori vakolatli oqim orqali ro‘yxatdan o‘tkaziladi.</w:t>
-      </w:r>
-    </w:p>
-    <w:p>
-      <w:pPr>
-        <w:keepNext/>
-        <w:ind w:firstLine="0" w:right="0" w:left="0"/>
-        <w:jc w:val="center"/>
-      </w:pPr>
-      <w:r>
-        <w:drawing>
-          <wp:inline xmlns:a="http://schemas.openxmlformats.org/drawingml/2006/main" xmlns:pic="http://schemas.openxmlformats.org/drawingml/2006/picture">
-            <wp:extent cx="5400000" cy="3557833"/>
-            <wp:docPr id="6" name="Picture 6"/>
-            <wp:cNvGraphicFramePr>
-              <a:graphicFrameLocks noChangeAspect="1"/>
-            </wp:cNvGraphicFramePr>
-            <a:graphic>
-              <a:graphicData uri="http://schemas.openxmlformats.org/drawingml/2006/picture">
-                <pic:pic>
-                  <pic:nvPicPr>
-                    <pic:cNvPr id="0" name="downloads.png"/>
-                    <pic:cNvPicPr/>
-                  </pic:nvPicPr>
-                  <pic:blipFill>
-                    <a:blip r:embed="rId15"/>
-                    <a:stretch>
-                      <a:fillRect/>
-                    </a:stretch>
-                  </pic:blipFill>
-                  <pic:spPr>
-                    <a:xfrm>
-                      <a:off x="0" y="0"/>
-                      <a:ext cx="5400000" cy="3557833"/>
-                    </a:xfrm>
-                    <a:prstGeom prst="rect"/>
-                  </pic:spPr>
-                </pic:pic>
-              </a:graphicData>
-            </a:graphic>
-          </wp:inline>
-        </w:drawing>
-      </w:r>
-    </w:p>
-    <w:p>
-      <w:pPr>
-        <w:spacing w:line="252" w:lineRule="auto" w:after="200" w:before="0"/>
-        <w:ind w:firstLine="0" w:right="0" w:left="0"/>
-        <w:jc w:val="center"/>
-      </w:pPr>
-      <w:r>
-        <w:rPr>
-          <w:rFonts w:ascii="Times New Roman" w:hAnsi="Times New Roman" w:eastAsia="Times New Roman"/>
-          <w:b w:val="0"/>
-          <w:sz w:val="24"/>
-        </w:rPr>
-        <w:t>2.6-rasm. Agent paketlari va platformalar holatini ko‘rsatuvchi yuklab olish sahifasi</w:t>
-      </w:r>
-    </w:p>
-    <w:p>
-      <w:pPr>
-        <w:spacing w:line="360" w:lineRule="auto" w:after="0" w:before="0"/>
-        <w:ind w:firstLine="709" w:right="0" w:left="0"/>
-        <w:jc w:val="both"/>
-      </w:pPr>
-      <w:r>
-        <w:rPr>
-          <w:rFonts w:ascii="Times New Roman" w:hAnsi="Times New Roman" w:eastAsia="Times New Roman"/>
-          <w:b w:val="0"/>
-          <w:sz w:val="28"/>
-        </w:rPr>
-        <w:t>Kirish tekshiruvida foydalanuvchi agentdagi tegishli usulni tanlaydi. Yuz usulida kamera ruxsati va yoritish tekshiriladi. Telefon usulida QR havola aynan shu kompyuter sessiyasiga tegishli ekaniga e’tibor beriladi va telefon autentifikatori bilan tasdiqlanadi. Tasdiqlash tugagach, natija server hamda auditda qayd etiladi. Xatoda yuz namunasi yoki telefon ro‘yxati darhol qayta yaratilib yuborilmasdan, avval sessiya, tarmoq va vakolat holati aniqlanadi.</w:t>
-      </w:r>
-    </w:p>
-    <w:p>
-      <w:pPr>
-        <w:spacing w:line="360" w:lineRule="auto" w:after="0" w:before="0"/>
-        <w:ind w:firstLine="709" w:right="0" w:left="0"/>
-        <w:jc w:val="both"/>
-      </w:pPr>
-      <w:r>
-        <w:rPr>
-          <w:rFonts w:ascii="Times New Roman" w:hAnsi="Times New Roman" w:eastAsia="Times New Roman"/>
-          <w:b w:val="0"/>
-          <w:sz w:val="28"/>
-        </w:rPr>
-        <w:t>Agentni olib tashlash ham nazorat qilinadigan jarayondir. Kompaniya administratori yoki shaxsiy hisob egasi muayyan qurilmaga bog‘langan qisqa muddatli kod chiqaradi. Joriy oqimda kod sertifikat avlodiga bog‘lanadi; boshlash amali uni atomik sarflaydi va oddiy qurilma autentifikatsiyasini bekor qiladi. Keyin fayllar va foydalanuvchi hisobidagi kalitlar tozalanadi, server esa yakunlangan holatni tasdiqlaydi. Uzilish yuz bersa tayyorlangan tiklash oqimi ishlatiladi. Bu jarayonning barcha UAC, qayta yuklash va bloklangan fayl holatlari Windows virtual mashinasida qo‘shimcha tekshirilishi kerak [13].</w:t>
-      </w:r>
-    </w:p>
-    <w:p>
-      <w:pPr>
-        <w:keepNext/>
-        <w:spacing w:line="252" w:lineRule="auto" w:after="80" w:before="160"/>
-        <w:ind w:firstLine="0" w:right="0" w:left="0"/>
-        <w:jc w:val="right"/>
-      </w:pPr>
-      <w:r>
-        <w:rPr>
-          <w:rFonts w:ascii="Times New Roman" w:hAnsi="Times New Roman" w:eastAsia="Times New Roman"/>
-          <w:b w:val="0"/>
-          <w:sz w:val="24"/>
-        </w:rPr>
-        <w:t>2.5-jadval. Foydalanishda yuz beradigan muammolar</w:t>
-      </w:r>
-    </w:p>
-    <w:tbl>
-      <w:tblPr>
-        <w:tblStyle w:val="TableGrid"/>
-        <w:tblW w:type="auto" w:w="0"/>
-        <w:tblLayout w:type="fixed"/>
-        <w:tblLook w:firstColumn="1" w:firstRow="1" w:lastColumn="0" w:lastRow="0" w:noHBand="0" w:noVBand="1" w:val="04A0"/>
-      </w:tblPr>
-      <w:tblGrid>
-        <w:gridCol w:w="3118"/>
-        <w:gridCol w:w="3118"/>
-        <w:gridCol w:w="3118"/>
-      </w:tblGrid>
-      <w:tr>
-        <w:trPr>
-          <w:tblHeader/>
-        </w:trPr>
-        <w:tc>
-          <w:tcPr>
-            <w:tcW w:type="dxa" w:w="3118"/>
-            <w:vAlign w:val="center"/>
-          </w:tcPr>
-          <w:p>
-            <w:pPr>
-              <w:spacing w:line="252" w:lineRule="auto" w:after="80" w:before="80"/>
-              <w:ind w:firstLine="0"/>
-            </w:pPr>
-            <w:r/>
-            <w:r>
-              <w:rPr>
-                <w:rFonts w:ascii="Times New Roman" w:hAnsi="Times New Roman" w:eastAsia="Times New Roman"/>
-                <w:b/>
-                <w:sz w:val="22"/>
-              </w:rPr>
-              <w:t>Kuzatilgan muammo</w:t>
-            </w:r>
-          </w:p>
-        </w:tc>
-        <w:tc>
-          <w:tcPr>
-            <w:tcW w:type="dxa" w:w="3118"/>
-            <w:vAlign w:val="center"/>
-          </w:tcPr>
-          <w:p>
-            <w:pPr>
-              <w:spacing w:line="252" w:lineRule="auto" w:after="80" w:before="80"/>
-              <w:ind w:firstLine="0"/>
-            </w:pPr>
-            <w:r/>
-            <w:r>
-              <w:rPr>
-                <w:rFonts w:ascii="Times New Roman" w:hAnsi="Times New Roman" w:eastAsia="Times New Roman"/>
-                <w:b/>
-                <w:sz w:val="22"/>
-              </w:rPr>
-              <w:t>Tekshiriladigan holat</w:t>
-            </w:r>
-          </w:p>
-        </w:tc>
-        <w:tc>
-          <w:tcPr>
-            <w:tcW w:type="dxa" w:w="3118"/>
-            <w:vAlign w:val="center"/>
-          </w:tcPr>
-          <w:p>
-            <w:pPr>
-              <w:spacing w:line="252" w:lineRule="auto" w:after="80" w:before="80"/>
-              <w:ind w:firstLine="0"/>
-            </w:pPr>
-            <w:r/>
-            <w:r>
-              <w:rPr>
-                <w:rFonts w:ascii="Times New Roman" w:hAnsi="Times New Roman" w:eastAsia="Times New Roman"/>
-                <w:b/>
-                <w:sz w:val="22"/>
-              </w:rPr>
-              <w:t>Amaliy harakat</w:t>
-            </w:r>
-          </w:p>
-        </w:tc>
-      </w:tr>
-      <w:tr>
-        <w:trPr>
-          <w:cantSplit/>
-        </w:trPr>
-        <w:tc>
-          <w:tcPr>
-            <w:tcW w:type="dxa" w:w="3118"/>
-            <w:vAlign w:val="center"/>
-          </w:tcPr>
-          <w:p>
-            <w:pPr>
-              <w:spacing w:line="252" w:lineRule="auto" w:after="80" w:before="80"/>
-              <w:ind w:firstLine="0"/>
-            </w:pPr>
-            <w:r/>
-            <w:r>
-              <w:rPr>
-                <w:rFonts w:ascii="Times New Roman" w:hAnsi="Times New Roman" w:eastAsia="Times New Roman"/>
-                <w:b w:val="0"/>
-                <w:sz w:val="22"/>
-              </w:rPr>
-              <w:t>QR telefon orqali ochilmaydi</w:t>
-            </w:r>
-          </w:p>
-        </w:tc>
-        <w:tc>
-          <w:tcPr>
-            <w:tcW w:type="dxa" w:w="3118"/>
-            <w:vAlign w:val="center"/>
-          </w:tcPr>
-          <w:p>
-            <w:pPr>
-              <w:spacing w:line="252" w:lineRule="auto" w:after="80" w:before="80"/>
-              <w:ind w:firstLine="0"/>
-            </w:pPr>
-            <w:r/>
-            <w:r>
-              <w:rPr>
-                <w:rFonts w:ascii="Times New Roman" w:hAnsi="Times New Roman" w:eastAsia="Times New Roman"/>
-                <w:b w:val="0"/>
-                <w:sz w:val="22"/>
-              </w:rPr>
-              <w:t>PUBLIC_SITE_URL va telefon tarmoq kirishi</w:t>
-            </w:r>
-          </w:p>
-        </w:tc>
-        <w:tc>
-          <w:tcPr>
-            <w:tcW w:type="dxa" w:w="3118"/>
-            <w:vAlign w:val="center"/>
-          </w:tcPr>
-          <w:p>
-            <w:pPr>
-              <w:spacing w:line="252" w:lineRule="auto" w:after="80" w:before="80"/>
-              <w:ind w:firstLine="0"/>
-            </w:pPr>
-            <w:r/>
-            <w:r>
-              <w:rPr>
-                <w:rFonts w:ascii="Times New Roman" w:hAnsi="Times New Roman" w:eastAsia="Times New Roman"/>
-                <w:b w:val="0"/>
-                <w:sz w:val="22"/>
-              </w:rPr>
-              <w:t>Telefon erisha oladigan HTTPS origin tanlash</w:t>
-            </w:r>
-          </w:p>
-        </w:tc>
-      </w:tr>
-      <w:tr>
-        <w:trPr>
-          <w:cantSplit/>
-        </w:trPr>
-        <w:tc>
-          <w:tcPr>
-            <w:tcW w:type="dxa" w:w="3118"/>
-            <w:vAlign w:val="center"/>
-          </w:tcPr>
-          <w:p>
-            <w:pPr>
-              <w:spacing w:line="252" w:lineRule="auto" w:after="80" w:before="80"/>
-              <w:ind w:firstLine="0"/>
-            </w:pPr>
-            <w:r/>
-            <w:r>
-              <w:rPr>
-                <w:rFonts w:ascii="Times New Roman" w:hAnsi="Times New Roman" w:eastAsia="Times New Roman"/>
-                <w:b w:val="0"/>
-                <w:sz w:val="22"/>
-              </w:rPr>
-              <w:t>Agent so‘rovi rad etiladi</w:t>
-            </w:r>
-          </w:p>
-        </w:tc>
-        <w:tc>
-          <w:tcPr>
-            <w:tcW w:type="dxa" w:w="3118"/>
-            <w:vAlign w:val="center"/>
-          </w:tcPr>
-          <w:p>
-            <w:pPr>
-              <w:spacing w:line="252" w:lineRule="auto" w:after="80" w:before="80"/>
-              <w:ind w:firstLine="0"/>
-            </w:pPr>
-            <w:r/>
-            <w:r>
-              <w:rPr>
-                <w:rFonts w:ascii="Times New Roman" w:hAnsi="Times New Roman" w:eastAsia="Times New Roman"/>
-                <w:b w:val="0"/>
-                <w:sz w:val="22"/>
-              </w:rPr>
-              <w:t>Sertifikat, faol qurilma, vaqt va nonce</w:t>
-            </w:r>
-          </w:p>
-        </w:tc>
-        <w:tc>
-          <w:tcPr>
-            <w:tcW w:type="dxa" w:w="3118"/>
-            <w:vAlign w:val="center"/>
-          </w:tcPr>
-          <w:p>
-            <w:pPr>
-              <w:spacing w:line="252" w:lineRule="auto" w:after="80" w:before="80"/>
-              <w:ind w:firstLine="0"/>
-            </w:pPr>
-            <w:r/>
-            <w:r>
-              <w:rPr>
-                <w:rFonts w:ascii="Times New Roman" w:hAnsi="Times New Roman" w:eastAsia="Times New Roman"/>
-                <w:b w:val="0"/>
-                <w:sz w:val="22"/>
-              </w:rPr>
-              <w:t>Sababni auditdan aniqlash; TLS yoki imzoni o‘chirmaslik</w:t>
-            </w:r>
-          </w:p>
-        </w:tc>
-      </w:tr>
-      <w:tr>
-        <w:trPr>
-          <w:cantSplit/>
-        </w:trPr>
-        <w:tc>
-          <w:tcPr>
-            <w:tcW w:type="dxa" w:w="3118"/>
-            <w:vAlign w:val="center"/>
-          </w:tcPr>
-          <w:p>
-            <w:pPr>
-              <w:spacing w:line="252" w:lineRule="auto" w:after="80" w:before="80"/>
-              <w:ind w:firstLine="0"/>
-            </w:pPr>
-            <w:r/>
-            <w:r>
-              <w:rPr>
-                <w:rFonts w:ascii="Times New Roman" w:hAnsi="Times New Roman" w:eastAsia="Times New Roman"/>
-                <w:b w:val="0"/>
-                <w:sz w:val="22"/>
-              </w:rPr>
-              <w:t>Yuz topilmadi yoki mos emas</w:t>
-            </w:r>
-          </w:p>
-        </w:tc>
-        <w:tc>
-          <w:tcPr>
-            <w:tcW w:type="dxa" w:w="3118"/>
-            <w:vAlign w:val="center"/>
-          </w:tcPr>
-          <w:p>
-            <w:pPr>
-              <w:spacing w:line="252" w:lineRule="auto" w:after="80" w:before="80"/>
-              <w:ind w:firstLine="0"/>
-            </w:pPr>
-            <w:r/>
-            <w:r>
-              <w:rPr>
-                <w:rFonts w:ascii="Times New Roman" w:hAnsi="Times New Roman" w:eastAsia="Times New Roman"/>
-                <w:b w:val="0"/>
-                <w:sz w:val="22"/>
-              </w:rPr>
-              <w:t>Kamera, yoritish, namuna va sessiya</w:t>
-            </w:r>
-          </w:p>
-        </w:tc>
-        <w:tc>
-          <w:tcPr>
-            <w:tcW w:type="dxa" w:w="3118"/>
-            <w:vAlign w:val="center"/>
-          </w:tcPr>
-          <w:p>
-            <w:pPr>
-              <w:spacing w:line="252" w:lineRule="auto" w:after="80" w:before="80"/>
-              <w:ind w:firstLine="0"/>
-            </w:pPr>
-            <w:r/>
-            <w:r>
-              <w:rPr>
-                <w:rFonts w:ascii="Times New Roman" w:hAnsi="Times New Roman" w:eastAsia="Times New Roman"/>
-                <w:b w:val="0"/>
-                <w:sz w:val="22"/>
-              </w:rPr>
-              <w:t>Sifatni tekshirish; chegarani asossiz yumshatmaslik</w:t>
-            </w:r>
-          </w:p>
-        </w:tc>
-      </w:tr>
-      <w:tr>
-        <w:trPr>
-          <w:cantSplit/>
-        </w:trPr>
-        <w:tc>
-          <w:tcPr>
-            <w:tcW w:type="dxa" w:w="3118"/>
-            <w:vAlign w:val="center"/>
-          </w:tcPr>
-          <w:p>
-            <w:pPr>
-              <w:spacing w:line="252" w:lineRule="auto" w:after="80" w:before="80"/>
-              <w:ind w:firstLine="0"/>
-            </w:pPr>
-            <w:r/>
-            <w:r>
-              <w:rPr>
-                <w:rFonts w:ascii="Times New Roman" w:hAnsi="Times New Roman" w:eastAsia="Times New Roman"/>
-                <w:b w:val="0"/>
-                <w:sz w:val="22"/>
-              </w:rPr>
-              <w:t>WebAuthn javobi rad etildi</w:t>
-            </w:r>
-          </w:p>
-        </w:tc>
-        <w:tc>
-          <w:tcPr>
-            <w:tcW w:type="dxa" w:w="3118"/>
-            <w:vAlign w:val="center"/>
-          </w:tcPr>
-          <w:p>
-            <w:pPr>
-              <w:spacing w:line="252" w:lineRule="auto" w:after="80" w:before="80"/>
-              <w:ind w:firstLine="0"/>
-            </w:pPr>
-            <w:r/>
-            <w:r>
-              <w:rPr>
-                <w:rFonts w:ascii="Times New Roman" w:hAnsi="Times New Roman" w:eastAsia="Times New Roman"/>
-                <w:b w:val="0"/>
-                <w:sz w:val="22"/>
-              </w:rPr>
-              <w:t>Origin, RP ID, challenge va ro‘yxatdagi credential</w:t>
-            </w:r>
-          </w:p>
-        </w:tc>
-        <w:tc>
-          <w:tcPr>
-            <w:tcW w:type="dxa" w:w="3118"/>
-            <w:vAlign w:val="center"/>
-          </w:tcPr>
-          <w:p>
-            <w:pPr>
-              <w:spacing w:line="252" w:lineRule="auto" w:after="80" w:before="80"/>
-              <w:ind w:firstLine="0"/>
-            </w:pPr>
-            <w:r/>
-            <w:r>
-              <w:rPr>
-                <w:rFonts w:ascii="Times New Roman" w:hAnsi="Times New Roman" w:eastAsia="Times New Roman"/>
-                <w:b w:val="0"/>
-                <w:sz w:val="22"/>
-              </w:rPr>
-              <w:t>Ro‘yxatdan o‘tish hamda joriy sessiya mosligini tekshirish</w:t>
-            </w:r>
-          </w:p>
-        </w:tc>
-      </w:tr>
-      <w:tr>
-        <w:trPr>
-          <w:cantSplit/>
-        </w:trPr>
-        <w:tc>
-          <w:tcPr>
-            <w:tcW w:type="dxa" w:w="3118"/>
-            <w:vAlign w:val="center"/>
-          </w:tcPr>
-          <w:p>
-            <w:pPr>
-              <w:spacing w:line="252" w:lineRule="auto" w:after="80" w:before="80"/>
-              <w:ind w:firstLine="0"/>
-            </w:pPr>
-            <w:r/>
-            <w:r>
-              <w:rPr>
-                <w:rFonts w:ascii="Times New Roman" w:hAnsi="Times New Roman" w:eastAsia="Times New Roman"/>
-                <w:b w:val="0"/>
-                <w:sz w:val="22"/>
-              </w:rPr>
-              <w:t>Olib tashlash uzildi</w:t>
-            </w:r>
-          </w:p>
-        </w:tc>
-        <w:tc>
-          <w:tcPr>
-            <w:tcW w:type="dxa" w:w="3118"/>
-            <w:vAlign w:val="center"/>
-          </w:tcPr>
-          <w:p>
-            <w:pPr>
-              <w:spacing w:line="252" w:lineRule="auto" w:after="80" w:before="80"/>
-              <w:ind w:firstLine="0"/>
-            </w:pPr>
-            <w:r/>
-            <w:r>
-              <w:rPr>
-                <w:rFonts w:ascii="Times New Roman" w:hAnsi="Times New Roman" w:eastAsia="Times New Roman"/>
-                <w:b w:val="0"/>
-                <w:sz w:val="22"/>
-              </w:rPr>
-              <w:t>Server removal holati va asl foydalanuvchi konteksti</w:t>
-            </w:r>
-          </w:p>
-        </w:tc>
-        <w:tc>
-          <w:tcPr>
-            <w:tcW w:type="dxa" w:w="3118"/>
-            <w:vAlign w:val="center"/>
-          </w:tcPr>
-          <w:p>
-            <w:pPr>
-              <w:spacing w:line="252" w:lineRule="auto" w:after="80" w:before="80"/>
-              <w:ind w:firstLine="0"/>
-            </w:pPr>
-            <w:r/>
-            <w:r>
-              <w:rPr>
-                <w:rFonts w:ascii="Times New Roman" w:hAnsi="Times New Roman" w:eastAsia="Times New Roman"/>
-                <w:b w:val="0"/>
-                <w:sz w:val="22"/>
-              </w:rPr>
-              <w:t>Hujjatlangan resume/retry oqimidan foydalanish</w:t>
-            </w:r>
-          </w:p>
-        </w:tc>
-      </w:tr>
-    </w:tbl>
-    <w:p>
-      <w:pPr>
-        <w:spacing w:line="240" w:lineRule="auto" w:after="0" w:before="0"/>
-        <w:ind w:firstLine="0" w:right="0" w:left="0"/>
-        <w:jc w:val="both"/>
-      </w:pPr>
-      <w:r>
-        <w:rPr>
-          <w:rFonts w:ascii="Times New Roman" w:hAnsi="Times New Roman" w:eastAsia="Times New Roman"/>
-          <w:b w:val="0"/>
-          <w:sz w:val="8"/>
-        </w:rPr>
-      </w:r>
-    </w:p>
-    <w:p>
-      <w:pPr>
         <w:spacing w:line="360" w:lineRule="auto" w:after="0" w:before="0"/>
         <w:ind w:firstLine="709" w:right="0" w:left="0"/>
         <w:jc w:val="both"/>
@@ -10142,960 +11273,6 @@
           <w:sz w:val="28"/>
         </w:rPr>
         <w:t>Offline parol oqimi mavjud kodda moslik uchun saqlangan. Unda PBKDF2-HMAC-SHA256 ishlatilsa ham, mahalliy fayldagi siyosatning imzolanganligi, amal qilish muddati va server bekor qilishiga mosligi to‘liq hal qilingan deb bo‘lmaydi. Shu sababli tarmoq uzilganda cheklanmagan xavfsiz ishlash da’vosi berilmaydi. Kelgusida server imzolagan, muddatli offline siyosat va qayta ulanganida auditni sinxronlash mexanizmi talab etiladi.</w:t>
-      </w:r>
-    </w:p>
-    <w:p>
-      <w:pPr>
-        <w:pStyle w:val="Heading3"/>
-        <w:ind w:right="0" w:left="0"/>
-        <w:jc w:val="both"/>
-      </w:pPr>
-      <w:r>
-        <w:rPr>
-          <w:rFonts w:ascii="Times New Roman" w:hAnsi="Times New Roman" w:eastAsia="Times New Roman"/>
-          <w:b/>
-          <w:sz w:val="28"/>
-        </w:rPr>
-        <w:t>Kompaniyaning ko‘p kompyuterli muhitida ishlash modeli</w:t>
-      </w:r>
-    </w:p>
-    <w:p>
-      <w:pPr>
-        <w:spacing w:line="360" w:lineRule="auto" w:after="0" w:before="0"/>
-        <w:ind w:firstLine="709" w:right="0" w:left="0"/>
-        <w:jc w:val="both"/>
-      </w:pPr>
-      <w:r>
-        <w:rPr>
-          <w:rFonts w:ascii="Times New Roman" w:hAnsi="Times New Roman" w:eastAsia="Times New Roman"/>
-          <w:b w:val="0"/>
-          <w:sz w:val="28"/>
-        </w:rPr>
-        <w:t>Tizimning asosiy qo‘llanish sohasi bir kompaniyaga tegishli ko‘plab ishchi kompyuterlarni yagona markazdan hisobga olish va ulardagi autentifikatsiya jarayonlarini boshqarishdir. Bitta PC uchun dastur o‘rnatish bu vazifaning faqat boshlang‘ich qismidir. Kompaniya miqyosida qaysi qurilma qaysi tashkilotga tegishli ekani, uni kim ro‘yxatga olgani, qaysi foydalanuvchi sessiyasi tekshirilgani va oxirgi aloqa qachon bo‘lgani aniqlanishi kerak. Shaxsiy hisob oqimi mavjud bo‘lsa-da, mazkur ishning asosiy amaliy ssenariysi kompaniya kompyuterlari parkidir.</w:t>
-      </w:r>
-    </w:p>
-    <w:p>
-      <w:pPr>
-        <w:spacing w:line="360" w:lineRule="auto" w:after="0" w:before="0"/>
-        <w:ind w:firstLine="709" w:right="0" w:left="0"/>
-        <w:jc w:val="both"/>
-      </w:pPr>
-      <w:r>
-        <w:rPr>
-          <w:rFonts w:ascii="Times New Roman" w:hAnsi="Times New Roman" w:eastAsia="Times New Roman"/>
-          <w:b w:val="0"/>
-          <w:sz w:val="28"/>
-        </w:rPr>
-        <w:t>Kompaniyaning ishchi kompyuterlari turli bo‘lim, filial yoki lokal tarmoqlarda joylashishi mumkin. Bunda agent va markaziy server o‘rtasidagi aloqa uchun kompyuterlarning bitta lokal broadcast domenida bo‘lishi shart emas. Har bir agent sozlangan server manziliga murojaat qiladi. Lekin bu imkoniyat serverga yo‘l mavjudligini avtomatik ta’minlamaydi: DNS, HTTPS chiqish ruxsati, reverse proxy, sertifikat zanjiri va vaqt sinxronligi korporativ infratuzilmada alohida tayyorlanadi. Quyidagi sxema loyihaviy joylashuvni ko‘rsatadi; bir nechta haqiqiy filial tarmog‘idagi yuklama tajribasi bajarilgan deb talqin qilinmaydi.</w:t>
-      </w:r>
-    </w:p>
-    <w:p>
-      <w:pPr>
-        <w:keepNext/>
-        <w:ind w:firstLine="0" w:right="0" w:left="0"/>
-        <w:jc w:val="center"/>
-      </w:pPr>
-      <w:r>
-        <w:drawing>
-          <wp:inline xmlns:a="http://schemas.openxmlformats.org/drawingml/2006/main" xmlns:pic="http://schemas.openxmlformats.org/drawingml/2006/picture">
-            <wp:extent cx="5400000" cy="2469561"/>
-            <wp:docPr id="7" name="Picture 7"/>
-            <wp:cNvGraphicFramePr>
-              <a:graphicFrameLocks noChangeAspect="1"/>
-            </wp:cNvGraphicFramePr>
-            <a:graphic>
-              <a:graphicData uri="http://schemas.openxmlformats.org/drawingml/2006/picture">
-                <pic:pic>
-                  <pic:nvPicPr>
-                    <pic:cNvPr id="0" name="company_network.png"/>
-                    <pic:cNvPicPr/>
-                  </pic:nvPicPr>
-                  <pic:blipFill>
-                    <a:blip r:embed="rId16"/>
-                    <a:stretch>
-                      <a:fillRect/>
-                    </a:stretch>
-                  </pic:blipFill>
-                  <pic:spPr>
-                    <a:xfrm>
-                      <a:off x="0" y="0"/>
-                      <a:ext cx="5400000" cy="2469561"/>
-                    </a:xfrm>
-                    <a:prstGeom prst="rect"/>
-                  </pic:spPr>
-                </pic:pic>
-              </a:graphicData>
-            </a:graphic>
-          </wp:inline>
-        </w:drawing>
-      </w:r>
-    </w:p>
-    <w:p>
-      <w:pPr>
-        <w:spacing w:line="252" w:lineRule="auto" w:after="200" w:before="0"/>
-        <w:ind w:firstLine="0" w:right="0" w:left="0"/>
-        <w:jc w:val="center"/>
-      </w:pPr>
-      <w:r>
-        <w:rPr>
-          <w:rFonts w:ascii="Times New Roman" w:hAnsi="Times New Roman" w:eastAsia="Times New Roman"/>
-          <w:b w:val="0"/>
-          <w:sz w:val="24"/>
-        </w:rPr>
-        <w:t>2.7-rasm. Turli tarmoqlardagi kompaniya PC’larining markaziy serverga ulanish modeli</w:t>
-      </w:r>
-    </w:p>
-    <w:p>
-      <w:pPr>
-        <w:spacing w:line="360" w:lineRule="auto" w:after="0" w:before="0"/>
-        <w:ind w:firstLine="709" w:right="0" w:left="0"/>
-        <w:jc w:val="both"/>
-      </w:pPr>
-      <w:r>
-        <w:rPr>
-          <w:rFonts w:ascii="Times New Roman" w:hAnsi="Times New Roman" w:eastAsia="Times New Roman"/>
-          <w:b w:val="0"/>
-          <w:sz w:val="28"/>
-        </w:rPr>
-        <w:t>Serverning tashkilot bo‘yicha ajratishi tarmoqni VLAN yoki firewall bilan segmentlashning o‘rnini bosmaydi. Bir tarmoqdagi begona qurilma boshqa tashkilot nomidan autentifikatsiyalana olmasligi uchun har bir server so‘rovida tashkilot va qurilma holati tekshiriladi. Aksincha, bir kompaniyaning boshqa filialidagi vakolatli agent faqat uning IP-manzili boshqacha bo‘lgani uchun yangi shaxs deb olinmaydi: identifikatsiyada ro‘yxatdagi kriptografik kalit va server yozuvi ustuvor bo‘ladi. IP-manzil audit konteksti bo‘lib xizmat qiladi.</w:t>
-      </w:r>
-    </w:p>
-    <w:p>
-      <w:pPr>
-        <w:spacing w:line="360" w:lineRule="auto" w:after="0" w:before="0"/>
-        <w:ind w:firstLine="709" w:right="0" w:left="0"/>
-        <w:jc w:val="both"/>
-      </w:pPr>
-      <w:r>
-        <w:rPr>
-          <w:rFonts w:ascii="Times New Roman" w:hAnsi="Times New Roman" w:eastAsia="Times New Roman"/>
-          <w:b w:val="0"/>
-          <w:sz w:val="28"/>
-        </w:rPr>
-        <w:t>Joriy modelda alohida Filial yoki TarmoqSegmenti obyekti mavjud emas. Qurilma joylashuvi Device.location maydoni orqali tavsiflanadi. Shuning uchun hujjatda to‘liq filiallar iyerarxiyasi yoki avtomatik tarmoq topologiyasi boshqaruvi amalga oshirilgan deb ko‘rsatilmaydi. Bunday imkoniyat kerak bo‘lsa, filial modeli, unga tayinlangan administratorlar va obyektlararo ruxsatlar alohida ishlab chiqiladi. Hozirgi versiyada tashkilot chegarasi va qurilma joylashuvi asosiy hisobga olish vositalaridir.</w:t>
-      </w:r>
-    </w:p>
-    <w:p>
-      <w:pPr>
-        <w:spacing w:line="360" w:lineRule="auto" w:after="0" w:before="0"/>
-        <w:ind w:firstLine="709" w:right="0" w:left="0"/>
-        <w:jc w:val="both"/>
-      </w:pPr>
-      <w:r>
-        <w:rPr>
-          <w:rFonts w:ascii="Times New Roman" w:hAnsi="Times New Roman" w:eastAsia="Times New Roman"/>
-          <w:b w:val="0"/>
-          <w:sz w:val="28"/>
-        </w:rPr>
-        <w:t>Xodim va PC o‘rtasidagi bog‘lanish ham aniq talqin qilinadi. Users tashkilotga hamda rolga, Device esa tashkilotga bog‘langan; AgentSession esa muayyan tekshiruvda foydalanuvchi va qurilmani birlashtiradi. Device modelida har bir PC uchun doimiy yagona xodim egasi maydoni yo‘q. Shu sababli tizim bir xodim bir PC bilan abadiy bog‘langan degan taxminga tayangan holda tavsiflanmaydi. Umumiy foydalaniladigan kompyuterlarda aynan joriy sessiyadagi foydalanuvchi muhimdir.</w:t>
-      </w:r>
-    </w:p>
-    <w:p>
-      <w:pPr>
-        <w:pStyle w:val="Heading3"/>
-        <w:ind w:right="0" w:left="0"/>
-        <w:jc w:val="both"/>
-      </w:pPr>
-      <w:r>
-        <w:rPr>
-          <w:rFonts w:ascii="Times New Roman" w:hAnsi="Times New Roman" w:eastAsia="Times New Roman"/>
-          <w:b/>
-          <w:sz w:val="28"/>
-        </w:rPr>
-        <w:t>Kompaniya PC’sini dastlabki ro‘yxatdan o‘tkazish</w:t>
-      </w:r>
-    </w:p>
-    <w:p>
-      <w:pPr>
-        <w:spacing w:line="360" w:lineRule="auto" w:after="0" w:before="0"/>
-        <w:ind w:firstLine="709" w:right="0" w:left="0"/>
-        <w:jc w:val="both"/>
-      </w:pPr>
-      <w:r>
-        <w:rPr>
-          <w:rFonts w:ascii="Times New Roman" w:hAnsi="Times New Roman" w:eastAsia="Times New Roman"/>
-          <w:b w:val="0"/>
-          <w:sz w:val="28"/>
-        </w:rPr>
-        <w:t>Quyidagi ekranlar ishlayotgan mahalliy serverdan olingan. Ko‘rsatish uchun vaqtinchalik Namuna kompaniya (diplom), NAMUNA-OFFICE-PC01 va DEMO-PC-001 yozuvlari ishlatilgan. Apparat identifikatorlari namuna sifatida kiritilgan; ushbu suratlar Go yordamchisi haqiqiy Windows qurilmasida ishga tushirilganining dalili emas. Administrator tasdig‘i esa haqiqiy server endpointlari orqali bajarilgan. Tasvirga olish tugagach, namunaviy yozuvlar va sessiyalar o‘chirilib, rasmdagi QR hamda tasdiqlash kodi amaldan chiqarilgan.</w:t>
-      </w:r>
-    </w:p>
-    <w:p>
-      <w:pPr>
-        <w:spacing w:line="360" w:lineRule="auto" w:after="0" w:before="0"/>
-        <w:ind w:firstLine="709" w:right="0" w:left="0"/>
-        <w:jc w:val="both"/>
-      </w:pPr>
-      <w:r>
-        <w:rPr>
-          <w:rFonts w:ascii="Times New Roman" w:hAnsi="Times New Roman" w:eastAsia="Times New Roman"/>
-          <w:b w:val="0"/>
-          <w:sz w:val="28"/>
-        </w:rPr>
-        <w:t>Birinchi bosqichda xodim ulanadigan PC brauzerida /device/scan sahifasini ochadi. Sahifa bu amal qaysi kompyuterda bajarilishi kerakligini tushuntiradi. Yangi ulanishni boshlash tugmasi serverda qisqa muddatli sessiya yaratadi. Kompaniyada bir nechta PC bir vaqtning o‘zida tayyorlanayotgan bo‘lsa, har bir kompyuter o‘z sessiyasini boshlaydi; bir PC uchun yaratilgan paket yoki havola boshqasiga ko‘chirib ishlatilmaydi.</w:t>
-      </w:r>
-    </w:p>
-    <w:p>
-      <w:pPr>
-        <w:keepNext/>
-        <w:ind w:firstLine="0" w:right="0" w:left="0"/>
-        <w:jc w:val="center"/>
-      </w:pPr>
-      <w:r>
-        <w:drawing>
-          <wp:inline xmlns:a="http://schemas.openxmlformats.org/drawingml/2006/main" xmlns:pic="http://schemas.openxmlformats.org/drawingml/2006/picture">
-            <wp:extent cx="5400000" cy="2824615"/>
-            <wp:docPr id="8" name="Picture 8"/>
-            <wp:cNvGraphicFramePr>
-              <a:graphicFrameLocks noChangeAspect="1"/>
-            </wp:cNvGraphicFramePr>
-            <a:graphic>
-              <a:graphicData uri="http://schemas.openxmlformats.org/drawingml/2006/picture">
-                <pic:pic>
-                  <pic:nvPicPr>
-                    <pic:cNvPr id="0" name="company_pc_start.png"/>
-                    <pic:cNvPicPr/>
-                  </pic:nvPicPr>
-                  <pic:blipFill>
-                    <a:blip r:embed="rId17"/>
-                    <a:stretch>
-                      <a:fillRect/>
-                    </a:stretch>
-                  </pic:blipFill>
-                  <pic:spPr>
-                    <a:xfrm>
-                      <a:off x="0" y="0"/>
-                      <a:ext cx="5400000" cy="2824615"/>
-                    </a:xfrm>
-                    <a:prstGeom prst="rect"/>
-                  </pic:spPr>
-                </pic:pic>
-              </a:graphicData>
-            </a:graphic>
-          </wp:inline>
-        </w:drawing>
-      </w:r>
-    </w:p>
-    <w:p>
-      <w:pPr>
-        <w:spacing w:line="252" w:lineRule="auto" w:after="200" w:before="0"/>
-        <w:ind w:firstLine="0" w:right="0" w:left="0"/>
-        <w:jc w:val="center"/>
-      </w:pPr>
-      <w:r>
-        <w:rPr>
-          <w:rFonts w:ascii="Times New Roman" w:hAnsi="Times New Roman" w:eastAsia="Times New Roman"/>
-          <w:b w:val="0"/>
-          <w:sz w:val="24"/>
-        </w:rPr>
-        <w:t>2.8-rasm. Kompaniya PC’sida yangi ulanishni boshlash sahifasi</w:t>
-      </w:r>
-    </w:p>
-    <w:p>
-      <w:pPr>
-        <w:spacing w:line="360" w:lineRule="auto" w:after="0" w:before="0"/>
-        <w:ind w:firstLine="709" w:right="0" w:left="0"/>
-        <w:jc w:val="both"/>
-      </w:pPr>
-      <w:r>
-        <w:rPr>
-          <w:rFonts w:ascii="Times New Roman" w:hAnsi="Times New Roman" w:eastAsia="Times New Roman"/>
-          <w:b w:val="0"/>
-          <w:sz w:val="28"/>
-        </w:rPr>
-        <w:t>Ikkinchi bosqichda operatsion tizim va arxitektura tanlanadi. Masalan, Windows hamda Intel / AMD (x64) tanlovlari shu platforma uchun yordamchi paketni olishga xizmat qiladi. Ushbu paket asosiy agent o‘rnatuvchisi emas. Yordamchining vazifasi joriy PC identifikatorlarini ro‘yxat sessiyasiga yuborishdir. Asosiy agent esa keyinchalik kalit va sertifikat bilan doimiy ishlaydigan komponent sifatida alohida o‘rnatiladi.</w:t>
-      </w:r>
-    </w:p>
-    <w:p>
-      <w:pPr>
-        <w:keepNext/>
-        <w:ind w:firstLine="0" w:right="0" w:left="0"/>
-        <w:jc w:val="center"/>
-      </w:pPr>
-      <w:r>
-        <w:drawing>
-          <wp:inline xmlns:a="http://schemas.openxmlformats.org/drawingml/2006/main" xmlns:pic="http://schemas.openxmlformats.org/drawingml/2006/picture">
-            <wp:extent cx="5400000" cy="4037538"/>
-            <wp:docPr id="9" name="Picture 9"/>
-            <wp:cNvGraphicFramePr>
-              <a:graphicFrameLocks noChangeAspect="1"/>
-            </wp:cNvGraphicFramePr>
-            <a:graphic>
-              <a:graphicData uri="http://schemas.openxmlformats.org/drawingml/2006/picture">
-                <pic:pic>
-                  <pic:nvPicPr>
-                    <pic:cNvPr id="0" name="company_pc_helper.png"/>
-                    <pic:cNvPicPr/>
-                  </pic:nvPicPr>
-                  <pic:blipFill>
-                    <a:blip r:embed="rId18"/>
-                    <a:stretch>
-                      <a:fillRect/>
-                    </a:stretch>
-                  </pic:blipFill>
-                  <pic:spPr>
-                    <a:xfrm>
-                      <a:off x="0" y="0"/>
-                      <a:ext cx="5400000" cy="4037538"/>
-                    </a:xfrm>
-                    <a:prstGeom prst="rect"/>
-                  </pic:spPr>
-                </pic:pic>
-              </a:graphicData>
-            </a:graphic>
-          </wp:inline>
-        </w:drawing>
-      </w:r>
-    </w:p>
-    <w:p>
-      <w:pPr>
-        <w:spacing w:line="252" w:lineRule="auto" w:after="200" w:before="0"/>
-        <w:ind w:firstLine="0" w:right="0" w:left="0"/>
-        <w:jc w:val="center"/>
-      </w:pPr>
-      <w:r>
-        <w:rPr>
-          <w:rFonts w:ascii="Times New Roman" w:hAnsi="Times New Roman" w:eastAsia="Times New Roman"/>
-          <w:b w:val="0"/>
-          <w:sz w:val="24"/>
-        </w:rPr>
-        <w:t>2.9-rasm. PC uchun platforma va yordamchi paketni tanlash</w:t>
-      </w:r>
-    </w:p>
-    <w:p>
-      <w:pPr>
-        <w:spacing w:line="360" w:lineRule="auto" w:after="0" w:before="0"/>
-        <w:ind w:firstLine="709" w:right="0" w:left="0"/>
-        <w:jc w:val="both"/>
-      </w:pPr>
-      <w:r>
-        <w:rPr>
-          <w:rFonts w:ascii="Times New Roman" w:hAnsi="Times New Roman" w:eastAsia="Times New Roman"/>
-          <w:b w:val="0"/>
-          <w:sz w:val="28"/>
-        </w:rPr>
-        <w:t>Uchinchi bosqichda yordamchi yuborgan identifikatorlar sessiyaga bir martalik scan token orqali qabul qilinadi. Server asosiy identifikator va device_id qiymatining mosligini tekshiradi. Shundan keyin PC ekranida QR-kod hamda solishtirish kodi ko‘rinadi. Qurilma hali faol agent sifatida ishlamaydi. Bu holat faqat administrator tekshirishi uchun ma’lumotlar tayyor bo‘lganini anglatadi.</w:t>
-      </w:r>
-    </w:p>
-    <w:p>
-      <w:pPr>
-        <w:keepNext/>
-        <w:ind w:firstLine="0" w:right="0" w:left="0"/>
-        <w:jc w:val="center"/>
-      </w:pPr>
-      <w:r>
-        <w:drawing>
-          <wp:inline xmlns:a="http://schemas.openxmlformats.org/drawingml/2006/main" xmlns:pic="http://schemas.openxmlformats.org/drawingml/2006/picture">
-            <wp:extent cx="3460750" cy="4679999"/>
-            <wp:docPr id="10" name="Picture 10"/>
-            <wp:cNvGraphicFramePr>
-              <a:graphicFrameLocks noChangeAspect="1"/>
-            </wp:cNvGraphicFramePr>
-            <a:graphic>
-              <a:graphicData uri="http://schemas.openxmlformats.org/drawingml/2006/picture">
-                <pic:pic>
-                  <pic:nvPicPr>
-                    <pic:cNvPr id="0" name="company_pc_qr.png"/>
-                    <pic:cNvPicPr/>
-                  </pic:nvPicPr>
-                  <pic:blipFill>
-                    <a:blip r:embed="rId19"/>
-                    <a:stretch>
-                      <a:fillRect/>
-                    </a:stretch>
-                  </pic:blipFill>
-                  <pic:spPr>
-                    <a:xfrm>
-                      <a:off x="0" y="0"/>
-                      <a:ext cx="3460750" cy="4679999"/>
-                    </a:xfrm>
-                    <a:prstGeom prst="rect"/>
-                  </pic:spPr>
-                </pic:pic>
-              </a:graphicData>
-            </a:graphic>
-          </wp:inline>
-        </w:drawing>
-      </w:r>
-    </w:p>
-    <w:p>
-      <w:pPr>
-        <w:spacing w:line="252" w:lineRule="auto" w:after="200" w:before="0"/>
-        <w:ind w:firstLine="0" w:right="0" w:left="0"/>
-        <w:jc w:val="center"/>
-      </w:pPr>
-      <w:r>
-        <w:rPr>
-          <w:rFonts w:ascii="Times New Roman" w:hAnsi="Times New Roman" w:eastAsia="Times New Roman"/>
-          <w:b w:val="0"/>
-          <w:sz w:val="24"/>
-        </w:rPr>
-        <w:t>2.10-rasm. PC ma’lumotlari qabul qilingandan keyingi QR va solishtirish kodi</w:t>
-      </w:r>
-    </w:p>
-    <w:p>
-      <w:pPr>
-        <w:spacing w:line="360" w:lineRule="auto" w:after="0" w:before="0"/>
-        <w:ind w:firstLine="709" w:right="0" w:left="0"/>
-        <w:jc w:val="both"/>
-      </w:pPr>
-      <w:r>
-        <w:rPr>
-          <w:rFonts w:ascii="Times New Roman" w:hAnsi="Times New Roman" w:eastAsia="Times New Roman"/>
-          <w:b w:val="0"/>
-          <w:sz w:val="28"/>
-        </w:rPr>
-        <w:t>To‘rtinchi bosqichda tegishli kompaniya administratori o‘z boshqaruv sessiyasi bilan QR havolani ochadi. Tasdiqlash sahifasida tashkilot nomi, hostname, platforma, identifikatorlar va solishtirish kodi ko‘rsatiladi. Administrator PC ekranidagi kod bilan o‘z ekranidagi kod bir xil ekanini tekshiradi. Tashkilot noto‘g‘ri tanlangan bo‘lsa, kompyuterni tasdiqlash davom ettirilmaydi. Bir nechta tarmoq yoki xonadagi o‘xshash nomli PC’lar bilan ishlaganda aynan shu solishtirish noto‘g‘ri qurilmani biriktirish xavfini kamaytiradi.</w:t>
-      </w:r>
-    </w:p>
-    <w:p>
-      <w:pPr>
-        <w:keepNext/>
-        <w:ind w:firstLine="0" w:right="0" w:left="0"/>
-        <w:jc w:val="center"/>
-      </w:pPr>
-      <w:r>
-        <w:drawing>
-          <wp:inline xmlns:a="http://schemas.openxmlformats.org/drawingml/2006/main" xmlns:pic="http://schemas.openxmlformats.org/drawingml/2006/picture">
-            <wp:extent cx="2827962" cy="6120000"/>
-            <wp:docPr id="11" name="Picture 11"/>
-            <wp:cNvGraphicFramePr>
-              <a:graphicFrameLocks noChangeAspect="1"/>
-            </wp:cNvGraphicFramePr>
-            <a:graphic>
-              <a:graphicData uri="http://schemas.openxmlformats.org/drawingml/2006/picture">
-                <pic:pic>
-                  <pic:nvPicPr>
-                    <pic:cNvPr id="0" name="company_mobile_approval.png"/>
-                    <pic:cNvPicPr/>
-                  </pic:nvPicPr>
-                  <pic:blipFill>
-                    <a:blip r:embed="rId20"/>
-                    <a:stretch>
-                      <a:fillRect/>
-                    </a:stretch>
-                  </pic:blipFill>
-                  <pic:spPr>
-                    <a:xfrm>
-                      <a:off x="0" y="0"/>
-                      <a:ext cx="2827962" cy="6120000"/>
-                    </a:xfrm>
-                    <a:prstGeom prst="rect"/>
-                  </pic:spPr>
-                </pic:pic>
-              </a:graphicData>
-            </a:graphic>
-          </wp:inline>
-        </w:drawing>
-      </w:r>
-    </w:p>
-    <w:p>
-      <w:pPr>
-        <w:spacing w:line="252" w:lineRule="auto" w:after="200" w:before="0"/>
-        <w:ind w:firstLine="0" w:right="0" w:left="0"/>
-        <w:jc w:val="center"/>
-      </w:pPr>
-      <w:r>
-        <w:rPr>
-          <w:rFonts w:ascii="Times New Roman" w:hAnsi="Times New Roman" w:eastAsia="Times New Roman"/>
-          <w:b w:val="0"/>
-          <w:sz w:val="24"/>
-        </w:rPr>
-        <w:t>2.11-rasm. Mobil ekran o‘lchamida kompaniya administratorining PC’ni tasdiqlashi</w:t>
-      </w:r>
-    </w:p>
-    <w:p>
-      <w:pPr>
-        <w:spacing w:line="360" w:lineRule="auto" w:after="0" w:before="0"/>
-        <w:ind w:firstLine="709" w:right="0" w:left="0"/>
-        <w:jc w:val="both"/>
-      </w:pPr>
-      <w:r>
-        <w:rPr>
-          <w:rFonts w:ascii="Times New Roman" w:hAnsi="Times New Roman" w:eastAsia="Times New Roman"/>
-          <w:b w:val="0"/>
-          <w:sz w:val="28"/>
-        </w:rPr>
-        <w:t>Beshinchi bosqichda administrator joylashuvni kiritadi va tasdiqlaydi yoki rad etadi. Namuna ssenariyda Namuna kompaniya, 1-filial tavsifi kiritilgan. Joylashuv amaldagi bazada tavsif maydoni hisoblanadi; u o‘z-o‘zicha alohida filial vakolatini yaratmaydi. Server vakolatli tasdiqdan so‘ng qurilmani shu tashkilotga biriktiradi. Bir xil sessiyani yana tasdiqlash yoki boshqa tashkilotdan qayta egallash ruxsat etilmaydi.</w:t>
-      </w:r>
-    </w:p>
-    <w:p>
-      <w:pPr>
-        <w:keepNext/>
-        <w:ind w:firstLine="0" w:right="0" w:left="0"/>
-        <w:jc w:val="center"/>
-      </w:pPr>
-      <w:r>
-        <w:drawing>
-          <wp:inline xmlns:a="http://schemas.openxmlformats.org/drawingml/2006/main" xmlns:pic="http://schemas.openxmlformats.org/drawingml/2006/picture">
-            <wp:extent cx="2827962" cy="6120000"/>
-            <wp:docPr id="12" name="Picture 12"/>
-            <wp:cNvGraphicFramePr>
-              <a:graphicFrameLocks noChangeAspect="1"/>
-            </wp:cNvGraphicFramePr>
-            <a:graphic>
-              <a:graphicData uri="http://schemas.openxmlformats.org/drawingml/2006/picture">
-                <pic:pic>
-                  <pic:nvPicPr>
-                    <pic:cNvPr id="0" name="company_mobile_approved.png"/>
-                    <pic:cNvPicPr/>
-                  </pic:nvPicPr>
-                  <pic:blipFill>
-                    <a:blip r:embed="rId21"/>
-                    <a:stretch>
-                      <a:fillRect/>
-                    </a:stretch>
-                  </pic:blipFill>
-                  <pic:spPr>
-                    <a:xfrm>
-                      <a:off x="0" y="0"/>
-                      <a:ext cx="2827962" cy="6120000"/>
-                    </a:xfrm>
-                    <a:prstGeom prst="rect"/>
-                  </pic:spPr>
-                </pic:pic>
-              </a:graphicData>
-            </a:graphic>
-          </wp:inline>
-        </w:drawing>
-      </w:r>
-    </w:p>
-    <w:p>
-      <w:pPr>
-        <w:spacing w:line="252" w:lineRule="auto" w:after="200" w:before="0"/>
-        <w:ind w:firstLine="0" w:right="0" w:left="0"/>
-        <w:jc w:val="center"/>
-      </w:pPr>
-      <w:r>
-        <w:rPr>
-          <w:rFonts w:ascii="Times New Roman" w:hAnsi="Times New Roman" w:eastAsia="Times New Roman"/>
-          <w:b w:val="0"/>
-          <w:sz w:val="24"/>
-        </w:rPr>
-        <w:t>2.12-rasm. Administrator tasdig‘idan keyin agent ulanishi kutilayotgan holat</w:t>
-      </w:r>
-    </w:p>
-    <w:p>
-      <w:pPr>
-        <w:spacing w:line="360" w:lineRule="auto" w:after="0" w:before="0"/>
-        <w:ind w:firstLine="709" w:right="0" w:left="0"/>
-        <w:jc w:val="both"/>
-      </w:pPr>
-      <w:r>
-        <w:rPr>
-          <w:rFonts w:ascii="Times New Roman" w:hAnsi="Times New Roman" w:eastAsia="Times New Roman"/>
-          <w:b w:val="0"/>
-          <w:sz w:val="28"/>
-        </w:rPr>
-        <w:t>Oltinchi bosqichda PC brauzerida ham tasdiq natijasi ko‘rinadi. Qurilma browser_approved bo‘lsa-da, ro‘yxatdagi kriptografik kalit bilan aktivatsiya yakunlanmaguncha faol agentga tenglashtirilmaydi. Bu ajratish kompaniyada yangi kompyuterni inventar sifatida qabul qilish va undan server nomidan so‘rov yuborishga ruxsat berish orasidagi chegarani saqlaydi. Tasdiqlangan kompyuterning o‘zi boshqa PC uchun berilgan tokenni ishlatmasligi kerak.</w:t>
-      </w:r>
-    </w:p>
-    <w:p>
-      <w:pPr>
-        <w:keepNext/>
-        <w:ind w:firstLine="0" w:right="0" w:left="0"/>
-        <w:jc w:val="center"/>
-      </w:pPr>
-      <w:r>
-        <w:drawing>
-          <wp:inline xmlns:a="http://schemas.openxmlformats.org/drawingml/2006/main" xmlns:pic="http://schemas.openxmlformats.org/drawingml/2006/picture">
-            <wp:extent cx="5400000" cy="2824615"/>
-            <wp:docPr id="13" name="Picture 13"/>
-            <wp:cNvGraphicFramePr>
-              <a:graphicFrameLocks noChangeAspect="1"/>
-            </wp:cNvGraphicFramePr>
-            <a:graphic>
-              <a:graphicData uri="http://schemas.openxmlformats.org/drawingml/2006/picture">
-                <pic:pic>
-                  <pic:nvPicPr>
-                    <pic:cNvPr id="0" name="company_pc_approved.png"/>
-                    <pic:cNvPicPr/>
-                  </pic:nvPicPr>
-                  <pic:blipFill>
-                    <a:blip r:embed="rId22"/>
-                    <a:stretch>
-                      <a:fillRect/>
-                    </a:stretch>
-                  </pic:blipFill>
-                  <pic:spPr>
-                    <a:xfrm>
-                      <a:off x="0" y="0"/>
-                      <a:ext cx="5400000" cy="2824615"/>
-                    </a:xfrm>
-                    <a:prstGeom prst="rect"/>
-                  </pic:spPr>
-                </pic:pic>
-              </a:graphicData>
-            </a:graphic>
-          </wp:inline>
-        </w:drawing>
-      </w:r>
-    </w:p>
-    <w:p>
-      <w:pPr>
-        <w:spacing w:line="252" w:lineRule="auto" w:after="200" w:before="0"/>
-        <w:ind w:firstLine="0" w:right="0" w:left="0"/>
-        <w:jc w:val="center"/>
-      </w:pPr>
-      <w:r>
-        <w:rPr>
-          <w:rFonts w:ascii="Times New Roman" w:hAnsi="Times New Roman" w:eastAsia="Times New Roman"/>
-          <w:b w:val="0"/>
-          <w:sz w:val="24"/>
-        </w:rPr>
-        <w:t>2.13-rasm. PC tomonida administrator tasdig‘i va agent ulanishini davom ettirish xabari</w:t>
-      </w:r>
-    </w:p>
-    <w:p>
-      <w:pPr>
-        <w:pStyle w:val="Heading3"/>
-        <w:ind w:right="0" w:left="0"/>
-        <w:jc w:val="both"/>
-      </w:pPr>
-      <w:r>
-        <w:rPr>
-          <w:rFonts w:ascii="Times New Roman" w:hAnsi="Times New Roman" w:eastAsia="Times New Roman"/>
-          <w:b/>
-          <w:sz w:val="28"/>
-        </w:rPr>
-        <w:t>Windows agentini kompaniya PC’siga o‘rnatish</w:t>
-      </w:r>
-    </w:p>
-    <w:p>
-      <w:pPr>
-        <w:spacing w:line="360" w:lineRule="auto" w:after="0" w:before="0"/>
-        <w:ind w:firstLine="709" w:right="0" w:left="0"/>
-        <w:jc w:val="both"/>
-      </w:pPr>
-      <w:r>
-        <w:rPr>
-          <w:rFonts w:ascii="Times New Roman" w:hAnsi="Times New Roman" w:eastAsia="Times New Roman"/>
-          <w:b w:val="0"/>
-          <w:sz w:val="28"/>
-        </w:rPr>
-        <w:t>Ro‘yxatdan o‘tkazishdan keyin administrator yoki vakolatli texnik xodim mos Windows paketini oladi. Kompaniya siyosati yuklangan o‘rnatuvchining manbasi va yaxlitligini tekshirishni nazarda tutishi kerak. Tizim katalogi paketning haqiqiy mavjudligini va SHA-256 qiymatini ko‘rsatadi. Faqat fayl nomining to‘g‘ri ko‘rinishi uning joriy koddan yig‘ilganini isbotlamaydi; paket versiyasi hamda manba kodining holati solishtiriladi.</w:t>
-      </w:r>
-    </w:p>
-    <w:p>
-      <w:pPr>
-        <w:spacing w:line="360" w:lineRule="auto" w:after="0" w:before="0"/>
-        <w:ind w:firstLine="709" w:right="0" w:left="0"/>
-        <w:jc w:val="both"/>
-      </w:pPr>
-      <w:r>
-        <w:rPr>
-          <w:rFonts w:ascii="Times New Roman" w:hAnsi="Times New Roman" w:eastAsia="Times New Roman"/>
-          <w:b w:val="0"/>
-          <w:sz w:val="28"/>
-        </w:rPr>
-        <w:t>Joriy installer kodida aktivatsiya ma’lumotlari agent fayllarini nusxalashdan oldin olinadi. Xodim tashkilot tokenini belgilangan oynaga kiritadi va server tekshiruvini kutadi. Server tashkilot, qurilma va yangi kalitning mosligini tekshiradi. Xato bo‘lsa qayta urinish va bekor qilish imkoniyati saqlanadi. Ko‘plab PC’larni tayyorlashda umumiy bir martalik tokenni cheklanmagan sonli qurilmaga tarqatish nazarda tutilmaydi: tokenning sarflanishi va har bir qurilma uchun alohida aktivatsiya nazorat qilinadi.</w:t>
-      </w:r>
-    </w:p>
-    <w:p>
-      <w:pPr>
-        <w:spacing w:line="360" w:lineRule="auto" w:after="0" w:before="0"/>
-        <w:ind w:firstLine="709" w:right="0" w:left="0"/>
-        <w:jc w:val="both"/>
-      </w:pPr>
-      <w:r>
-        <w:rPr>
-          <w:rFonts w:ascii="Times New Roman" w:hAnsi="Times New Roman" w:eastAsia="Times New Roman"/>
-          <w:b w:val="0"/>
-          <w:sz w:val="28"/>
-        </w:rPr>
-        <w:t>Windows tizim fayllarini o‘rnatish uchun administrator huquqi talab qilinishi mumkin. Biroq foydalanuvchiga bog‘liq kalit va sertifikatni boshqa administrator profiliga yozib yuborish noto‘g‘ri natija beradi. Shu sababli aktivatsiya konteksti, o‘rnatish konteksti va agent ishlaydigan asl foydalanuvchi ajratiladi. O‘rnatish tugagach, agentning shu foydalanuvchi sessiyasida ishga tushishi, serverga imzolangan murojaati va boshqaruv panelida ko‘rinishi tekshiriladi [13].</w:t>
-      </w:r>
-    </w:p>
-    <w:p>
-      <w:pPr>
-        <w:spacing w:line="360" w:lineRule="auto" w:after="0" w:before="0"/>
-        <w:ind w:firstLine="709" w:right="0" w:left="0"/>
-        <w:jc w:val="both"/>
-      </w:pPr>
-      <w:r>
-        <w:rPr>
-          <w:rFonts w:ascii="Times New Roman" w:hAnsi="Times New Roman" w:eastAsia="Times New Roman"/>
-          <w:b w:val="0"/>
-          <w:sz w:val="28"/>
-        </w:rPr>
-        <w:t>Korporativ tarqatish ssenariysida sozlamalar izchilligi muhim. Barcha PC’lar mo‘ljallangan server manziliga murojaat qilishi, TLS tekshiruvini saqlashi va vaqtni to‘g‘ri yuritishi kerak. Tizimning hozirgi interaktiv token oynasi mavjudligi avtomatik ommaviy deploy, Active Directory yoki Group Policy orqali boshqariladigan o‘rnatish amalga oshirilganini anglatmaydi. Bunday tarqatish yo‘li alohida ishlab chiqish va kompaniya infratuzilmasida tekshirishni talab qiladi.</w:t>
-      </w:r>
-    </w:p>
-    <w:p>
-      <w:pPr>
-        <w:pStyle w:val="Heading3"/>
-        <w:ind w:right="0" w:left="0"/>
-        <w:jc w:val="both"/>
-      </w:pPr>
-      <w:r>
-        <w:rPr>
-          <w:rFonts w:ascii="Times New Roman" w:hAnsi="Times New Roman" w:eastAsia="Times New Roman"/>
-          <w:b/>
-          <w:sz w:val="28"/>
-        </w:rPr>
-        <w:t>Telefon interfeysi va foydalanuvchini biometrik ro‘yxatga olish</w:t>
-      </w:r>
-    </w:p>
-    <w:p>
-      <w:pPr>
-        <w:spacing w:line="360" w:lineRule="auto" w:after="0" w:before="0"/>
-        <w:ind w:firstLine="709" w:right="0" w:left="0"/>
-        <w:jc w:val="both"/>
-      </w:pPr>
-      <w:r>
-        <w:rPr>
-          <w:rFonts w:ascii="Times New Roman" w:hAnsi="Times New Roman" w:eastAsia="Times New Roman"/>
-          <w:b w:val="0"/>
-          <w:sz w:val="28"/>
-        </w:rPr>
-        <w:t>Kompaniya administratori qurilmani tasdiqlash uchun telefondan foydalanishi bilan xodimning shaxsini biometrik tekshirish ikki xil jarayondir. Birinchisida administrator PC’ni kompaniya tarkibiga qabul qiladi. Ikkinchisida esa foydalanuvchiga tegishli yuz namunasi yoki WebAuthn autentifikatori bilan ishlanadi. Foydalanuvchi interfeysida ikkala jarayon ham telefon orqali ochilishi mumkin, ammo sessiyalar va ularning ruxsatlari aralashtirilmaydi.</w:t>
-      </w:r>
-    </w:p>
-    <w:p>
-      <w:pPr>
-        <w:spacing w:line="360" w:lineRule="auto" w:after="0" w:before="0"/>
-        <w:ind w:firstLine="709" w:right="0" w:left="0"/>
-        <w:jc w:val="both"/>
-      </w:pPr>
-      <w:r>
-        <w:rPr>
-          <w:rFonts w:ascii="Times New Roman" w:hAnsi="Times New Roman" w:eastAsia="Times New Roman"/>
-          <w:b w:val="0"/>
-          <w:sz w:val="28"/>
-        </w:rPr>
-        <w:t>Mobil biometrik ro‘yxatga olish sahifasi tekshiruvni ikki bosqichda ko‘rsatadi: avval yuz tekshiriladi, keyin autentifikator bilan tasdiqlash bajariladi. Quyidagi tasvir 390 piksel kenglikdagi mobil brauzer ko‘rinishida haqiqiy server bergan vaqtinchalik sessiya orqali olingan. U boshlang‘ich interfeysni tasvirlaydi; kamera yoki barmoq izi sensori yordamida yakuniy muvaffaqiyatli tekshiruv bajarilganini ko‘rsatmaydi. WebAuthn autentifikatoridagi mahalliy tekshiruv aynan barmoq izi bilan bajarilishi majburiy emas.</w:t>
-      </w:r>
-    </w:p>
-    <w:p>
-      <w:pPr>
-        <w:keepNext/>
-        <w:ind w:firstLine="0" w:right="0" w:left="0"/>
-        <w:jc w:val="center"/>
-      </w:pPr>
-      <w:r>
-        <w:drawing>
-          <wp:inline xmlns:a="http://schemas.openxmlformats.org/drawingml/2006/main" xmlns:pic="http://schemas.openxmlformats.org/drawingml/2006/picture">
-            <wp:extent cx="2827962" cy="6120000"/>
-            <wp:docPr id="14" name="Picture 14"/>
-            <wp:cNvGraphicFramePr>
-              <a:graphicFrameLocks noChangeAspect="1"/>
-            </wp:cNvGraphicFramePr>
-            <a:graphic>
-              <a:graphicData uri="http://schemas.openxmlformats.org/drawingml/2006/picture">
-                <pic:pic>
-                  <pic:nvPicPr>
-                    <pic:cNvPr id="0" name="mobile_biometric_ready.png"/>
-                    <pic:cNvPicPr/>
-                  </pic:nvPicPr>
-                  <pic:blipFill>
-                    <a:blip r:embed="rId23"/>
-                    <a:stretch>
-                      <a:fillRect/>
-                    </a:stretch>
-                  </pic:blipFill>
-                  <pic:spPr>
-                    <a:xfrm>
-                      <a:off x="0" y="0"/>
-                      <a:ext cx="2827962" cy="6120000"/>
-                    </a:xfrm>
-                    <a:prstGeom prst="rect"/>
-                  </pic:spPr>
-                </pic:pic>
-              </a:graphicData>
-            </a:graphic>
-          </wp:inline>
-        </w:drawing>
-      </w:r>
-    </w:p>
-    <w:p>
-      <w:pPr>
-        <w:spacing w:line="252" w:lineRule="auto" w:after="200" w:before="0"/>
-        <w:ind w:firstLine="0" w:right="0" w:left="0"/>
-        <w:jc w:val="center"/>
-      </w:pPr>
-      <w:r>
-        <w:rPr>
-          <w:rFonts w:ascii="Times New Roman" w:hAnsi="Times New Roman" w:eastAsia="Times New Roman"/>
-          <w:b w:val="0"/>
-          <w:sz w:val="24"/>
-        </w:rPr>
-        <w:t>2.14-rasm. Mobil o‘lchamdagi biometrik ro‘yxatga olishning boshlang‘ich oynasi</w:t>
-      </w:r>
-    </w:p>
-    <w:p>
-      <w:pPr>
-        <w:spacing w:line="360" w:lineRule="auto" w:after="0" w:before="0"/>
-        <w:ind w:firstLine="709" w:right="0" w:left="0"/>
-        <w:jc w:val="both"/>
-      </w:pPr>
-      <w:r>
-        <w:rPr>
-          <w:rFonts w:ascii="Times New Roman" w:hAnsi="Times New Roman" w:eastAsia="Times New Roman"/>
-          <w:b w:val="0"/>
-          <w:sz w:val="28"/>
-        </w:rPr>
-        <w:t>Agent sessiyasiga tegishli /agent/mobile/face/ yo‘li boshqa mobil sahifani ochadi. Ushbu sahifa kameradan tasvir olishga ruxsat so‘raydi va joriy sessiya vaqtini ko‘rsatadi. Kamera mavjud bo‘lmagan yoki ruxsat berilmagan holatda tasdiqlashni davom ettirish mumkin emasligi aniq ko‘rinishi kerak. Bunday xato holatini foydalanuvchini tekshirish muvaffaqiyatiga aylantirish noto‘g‘ri bo‘ladi. Telefon brauzeri, kamera ruxsati va server origin mosligi amaliy joriy etishda alohida tekshiriladi.</w:t>
-      </w:r>
-    </w:p>
-    <w:p>
-      <w:pPr>
-        <w:keepNext/>
-        <w:ind w:firstLine="0" w:right="0" w:left="0"/>
-        <w:jc w:val="center"/>
-      </w:pPr>
-      <w:r>
-        <w:drawing>
-          <wp:inline xmlns:a="http://schemas.openxmlformats.org/drawingml/2006/main" xmlns:pic="http://schemas.openxmlformats.org/drawingml/2006/picture">
-            <wp:extent cx="2255954" cy="6119998"/>
-            <wp:docPr id="15" name="Picture 15"/>
-            <wp:cNvGraphicFramePr>
-              <a:graphicFrameLocks noChangeAspect="1"/>
-            </wp:cNvGraphicFramePr>
-            <a:graphic>
-              <a:graphicData uri="http://schemas.openxmlformats.org/drawingml/2006/picture">
-                <pic:pic>
-                  <pic:nvPicPr>
-                    <pic:cNvPr id="0" name="mobile_agent_face.png"/>
-                    <pic:cNvPicPr/>
-                  </pic:nvPicPr>
-                  <pic:blipFill>
-                    <a:blip r:embed="rId24"/>
-                    <a:stretch>
-                      <a:fillRect/>
-                    </a:stretch>
-                  </pic:blipFill>
-                  <pic:spPr>
-                    <a:xfrm>
-                      <a:off x="0" y="0"/>
-                      <a:ext cx="2255954" cy="6119998"/>
-                    </a:xfrm>
-                    <a:prstGeom prst="rect"/>
-                  </pic:spPr>
-                </pic:pic>
-              </a:graphicData>
-            </a:graphic>
-          </wp:inline>
-        </w:drawing>
-      </w:r>
-    </w:p>
-    <w:p>
-      <w:pPr>
-        <w:spacing w:line="252" w:lineRule="auto" w:after="200" w:before="0"/>
-        <w:ind w:firstLine="0" w:right="0" w:left="0"/>
-        <w:jc w:val="center"/>
-      </w:pPr>
-      <w:r>
-        <w:rPr>
-          <w:rFonts w:ascii="Times New Roman" w:hAnsi="Times New Roman" w:eastAsia="Times New Roman"/>
-          <w:b w:val="0"/>
-          <w:sz w:val="24"/>
-        </w:rPr>
-        <w:t>2.15-rasm. Agentning mobil yuz tekshiruvi sahifasida kamera ruxsati berilmagan holat</w:t>
-      </w:r>
-    </w:p>
-    <w:p>
-      <w:pPr>
-        <w:pStyle w:val="Heading3"/>
-        <w:ind w:right="0" w:left="0"/>
-        <w:jc w:val="both"/>
-      </w:pPr>
-      <w:r>
-        <w:rPr>
-          <w:rFonts w:ascii="Times New Roman" w:hAnsi="Times New Roman" w:eastAsia="Times New Roman"/>
-          <w:b/>
-          <w:sz w:val="28"/>
-        </w:rPr>
-        <w:t>Ko‘p PC bilan kundalik ishlash, monitoring va qurilmani bekor qilish</w:t>
-      </w:r>
-    </w:p>
-    <w:p>
-      <w:pPr>
-        <w:spacing w:line="360" w:lineRule="auto" w:after="0" w:before="0"/>
-        <w:ind w:firstLine="709" w:right="0" w:left="0"/>
-        <w:jc w:val="both"/>
-      </w:pPr>
-      <w:r>
-        <w:rPr>
-          <w:rFonts w:ascii="Times New Roman" w:hAnsi="Times New Roman" w:eastAsia="Times New Roman"/>
-          <w:b w:val="0"/>
-          <w:sz w:val="28"/>
-        </w:rPr>
-        <w:t>Kundalik ishda administrator kompaniyaning foydalanuvchi va qurilmalarini markaziy panel orqali kuzatadi. Tekshiruv sessiyasi ma’lum foydalanuvchi va PC bilan bog‘lanadi. Xodimning holati yoki roli o‘zgarsa, kelgusi so‘rovlarda shu o‘zgarish hisobga olinishi kerak. Biroq bu rol o‘zgarishi Windowsdagi barcha fayl ACL yoki domen guruhlarini avtomatik qayta yozishini anglatmaydi. Boshqaruv panelidagi vakolatlar bilan operatsion tizimning mahalliy vakolatlari orasidagi integratsiya darajasi alohida ko‘rsatiladi.</w:t>
-      </w:r>
-    </w:p>
-    <w:p>
-      <w:pPr>
-        <w:spacing w:line="360" w:lineRule="auto" w:after="0" w:before="0"/>
-        <w:ind w:firstLine="709" w:right="0" w:left="0"/>
-        <w:jc w:val="both"/>
-      </w:pPr>
-      <w:r>
-        <w:rPr>
-          <w:rFonts w:ascii="Times New Roman" w:hAnsi="Times New Roman" w:eastAsia="Times New Roman"/>
-          <w:b w:val="0"/>
-          <w:sz w:val="28"/>
-        </w:rPr>
-        <w:t>AgentHealth va AgentEvent kompaniyadagi qurilmalar holatini kuzatishga xizmat qiladi. Server qabul qilgan vaqt bilan agent xabar qilgan vaqt ajratiladi, chunki ishchi kompyuter soati xato bo‘lishi mumkin. Joriy hujjatga ko‘ra, birinchi heartbeatdan keyin 120 soniya aloqa bo‘lmasa connection_lost hodisasi, aloqa tiklanganda connection_restored hodisasi qayd etiladi. Lekin aloqa uzilishi xodim ataylab agentni o‘chirganini isbotlamaydi: elektr, tarmoq yoki jarayon xatosi ham shunday natija berishi mumkin [12].</w:t>
-      </w:r>
-    </w:p>
-    <w:p>
-      <w:pPr>
-        <w:spacing w:line="360" w:lineRule="auto" w:after="0" w:before="0"/>
-        <w:ind w:firstLine="709" w:right="0" w:left="0"/>
-        <w:jc w:val="both"/>
-      </w:pPr>
-      <w:r>
-        <w:rPr>
-          <w:rFonts w:ascii="Times New Roman" w:hAnsi="Times New Roman" w:eastAsia="Times New Roman"/>
-          <w:b w:val="0"/>
-          <w:sz w:val="28"/>
-        </w:rPr>
-        <w:t>Panel yopiq vaqtda ham monitoring talab qilinsa, davriy sog‘liq tekshiruvi alohida ishga tushiriladi. Buning uchun loyihada Celery worker va Beat yoki check_agent_health boshqaruv buyrug‘ini reja bo‘yicha bajarish yo‘li ko‘rsatilgan. Faqat veb-serverni ishga tushirish ushbu davriy xizmatlarning ham ishlayotganini anglatmaydi. Kompaniyada joriy etish tekshiruvida shu xizmatlar, broker aloqasi va uzilish holatidagi kuzatuv ham qabul mezoniga kiritiladi.</w:t>
-      </w:r>
-    </w:p>
-    <w:p>
-      <w:pPr>
-        <w:spacing w:line="360" w:lineRule="auto" w:after="0" w:before="0"/>
-        <w:ind w:firstLine="709" w:right="0" w:left="0"/>
-        <w:jc w:val="both"/>
-      </w:pPr>
-      <w:r>
-        <w:rPr>
-          <w:rFonts w:ascii="Times New Roman" w:hAnsi="Times New Roman" w:eastAsia="Times New Roman"/>
-          <w:b w:val="0"/>
-          <w:sz w:val="28"/>
-        </w:rPr>
-        <w:t>Vakolatli administrator vaqtinchalik ishlamaslikka ruxsat bersa, uning kimligi, sababi va muddati qayd etiladi. Bunday ruxsat ogohlantirish siyosatiga ta’sir qilishi mumkin, lekin u agent oynasini har qanday sharoitda masofadan yopish degani emas. Server bergan yangi siyosat agentga yetib borishi uchun aloqa kerak bo‘ladi. Shu bois boshqa filialdagi tarmoq uzilishida administrator oynasidagi qaror bilan PC’dagi oxirgi ma’lum holat orasidagi farq hisobga olinadi.</w:t>
-      </w:r>
-    </w:p>
-    <w:p>
-      <w:pPr>
-        <w:spacing w:line="360" w:lineRule="auto" w:after="0" w:before="0"/>
-        <w:ind w:firstLine="709" w:right="0" w:left="0"/>
-        <w:jc w:val="both"/>
-      </w:pPr>
-      <w:r>
-        <w:rPr>
-          <w:rFonts w:ascii="Times New Roman" w:hAnsi="Times New Roman" w:eastAsia="Times New Roman"/>
-          <w:b w:val="0"/>
-          <w:sz w:val="28"/>
-        </w:rPr>
-        <w:t>PC xizmatdan chiqarilsa, boshqa tashkilotga berilsa yoki agent olib tashlansa, oddiy qurilma autentifikatsiyasi bekor qilinadi. Olib tashlash kodi muayyan qurilma va sertifikat avlodiga bog‘lanadi. Jarayon boshlanganidan so‘ng eski kalitdan oddiy autentifikatsiyada foydalanish davom etmasligi kerak. Audit yozuvlari esa hodisalar tarixini saqlash uchun qoladi. Bitta PC’ni bekor qilish boshqa faol kompaniya qurilmalarini avtomatik bloklash uchun asos bo‘lmasligi lozim.</w:t>
-      </w:r>
-    </w:p>
-    <w:p>
-      <w:pPr>
-        <w:spacing w:line="360" w:lineRule="auto" w:after="0" w:before="0"/>
-        <w:ind w:firstLine="709" w:right="0" w:left="0"/>
-        <w:jc w:val="both"/>
-      </w:pPr>
-      <w:r>
-        <w:rPr>
-          <w:rFonts w:ascii="Times New Roman" w:hAnsi="Times New Roman" w:eastAsia="Times New Roman"/>
-          <w:b w:val="0"/>
-          <w:sz w:val="28"/>
-        </w:rPr>
-        <w:t>Kompaniya miqyosidagi yakuniy qabul sinovlari kamida turli PC’larda parallel ro‘yxatga olish, noto‘g‘ri tashkilot administratori bilan tasdiqlash, bir foydalanuvchining turli PC’dagi sessiyalari, tarmoq uzilishi, sertifikat bekor qilinishi va agentni qayta o‘rnatish holatlarini qamrab oladi. Ko‘p foydalanuvchi yuklamasi bo‘yicha esa bir vaqtning o‘zidagi sessiyalar, javob vaqti, bazadagi yozuvlar to‘qnashuvi va navbatlar holati o‘lchanadi. Bu mezonlar tajriba rejasi sifatida beriladi; joriy ishda o‘lchanmagan throughput yoki maksimal PC soni uydirib kiritilmaydi.</w:t>
       </w:r>
     </w:p>
     <w:p>

</xml_diff>